<commit_message>
prompts and template updated to include trial statistician and table outcomes
</commit_message>
<xml_diff>
--- a/Templates/sapai_kcl_template_v0.2_clean.docx
+++ b/Templates/sapai_kcl_template_v0.2_clean.docx
@@ -349,6 +349,7 @@
         </w:rPr>
         <w:t>{{</w:t>
       </w:r>
+      <w:proofErr w:type="spellStart"/>
       <w:proofErr w:type="gramEnd"/>
       <w:r>
         <w:rPr>
@@ -367,8 +368,9 @@
           <w:sz w:val="40"/>
           <w:szCs w:val="40"/>
         </w:rPr>
-        <w:t>acronym}}</w:t>
-      </w:r>
+        <w:t>acronym</w:t>
+      </w:r>
+      <w:proofErr w:type="spellEnd"/>
       <w:r>
         <w:rPr>
           <w:b/>
@@ -376,20 +378,18 @@
           <w:sz w:val="40"/>
           <w:szCs w:val="40"/>
         </w:rPr>
-        <w:t>)</w:t>
-      </w:r>
-      <w:proofErr w:type="gramEnd"/>
-    </w:p>
-    <w:p>
-      <w:pPr>
-        <w:spacing w:line="360" w:lineRule="auto"/>
-        <w:jc w:val="center"/>
-        <w:rPr>
+        <w:t>}}</w:t>
+      </w:r>
+      <w:r>
+        <w:rPr>
+          <w:b/>
           <w:color w:val="000000"/>
           <w:sz w:val="40"/>
           <w:szCs w:val="40"/>
         </w:rPr>
-      </w:pPr>
+        <w:t>)</w:t>
+      </w:r>
+      <w:proofErr w:type="gramEnd"/>
     </w:p>
     <w:p>
       <w:pPr>
@@ -401,40 +401,43 @@
           <w:szCs w:val="40"/>
         </w:rPr>
       </w:pPr>
-      <w:r>
+    </w:p>
+    <w:p>
+      <w:pPr>
+        <w:spacing w:line="360" w:lineRule="auto"/>
+        <w:jc w:val="center"/>
         <w:rPr>
           <w:color w:val="000000"/>
           <w:sz w:val="40"/>
           <w:szCs w:val="40"/>
         </w:rPr>
-        <w:t>Statistical Analysis Plan</w:t>
-      </w:r>
-    </w:p>
-    <w:p>
-      <w:pPr>
-        <w:spacing w:line="360" w:lineRule="auto"/>
-        <w:jc w:val="center"/>
+      </w:pPr>
+      <w:r>
         <w:rPr>
           <w:color w:val="000000"/>
           <w:sz w:val="40"/>
           <w:szCs w:val="40"/>
         </w:rPr>
-      </w:pPr>
-      <w:r>
+        <w:t>Statistical Analysis Plan</w:t>
+      </w:r>
+    </w:p>
+    <w:p>
+      <w:pPr>
+        <w:spacing w:line="360" w:lineRule="auto"/>
+        <w:jc w:val="center"/>
         <w:rPr>
           <w:color w:val="000000"/>
           <w:sz w:val="40"/>
           <w:szCs w:val="40"/>
         </w:rPr>
-        <w:t xml:space="preserve">Version </w:t>
-      </w:r>
+      </w:pPr>
       <w:r>
         <w:rPr>
           <w:color w:val="000000"/>
           <w:sz w:val="40"/>
           <w:szCs w:val="40"/>
         </w:rPr>
-        <w:t>0.1</w:t>
+        <w:t xml:space="preserve">Version </w:t>
       </w:r>
       <w:r>
         <w:rPr>
@@ -442,29 +445,55 @@
           <w:sz w:val="40"/>
           <w:szCs w:val="40"/>
         </w:rPr>
-        <w:t xml:space="preserve"> {{todays_date}}</w:t>
-      </w:r>
-    </w:p>
-    <w:p>
-      <w:pPr>
-        <w:spacing w:line="360" w:lineRule="auto"/>
-        <w:jc w:val="center"/>
+        <w:t>0.1</w:t>
+      </w:r>
+      <w:r>
         <w:rPr>
           <w:color w:val="000000"/>
           <w:sz w:val="40"/>
           <w:szCs w:val="40"/>
         </w:rPr>
-      </w:pPr>
-    </w:p>
-    <w:p>
-      <w:pPr>
-        <w:spacing w:line="360" w:lineRule="auto"/>
-        <w:jc w:val="center"/>
+        <w:t xml:space="preserve"> {{</w:t>
+      </w:r>
+      <w:proofErr w:type="spellStart"/>
+      <w:r>
         <w:rPr>
           <w:color w:val="000000"/>
           <w:sz w:val="40"/>
           <w:szCs w:val="40"/>
         </w:rPr>
+        <w:t>todays_date</w:t>
+      </w:r>
+      <w:proofErr w:type="spellEnd"/>
+      <w:r>
+        <w:rPr>
+          <w:color w:val="000000"/>
+          <w:sz w:val="40"/>
+          <w:szCs w:val="40"/>
+        </w:rPr>
+        <w:t>}}</w:t>
+      </w:r>
+    </w:p>
+    <w:p>
+      <w:pPr>
+        <w:spacing w:line="360" w:lineRule="auto"/>
+        <w:jc w:val="center"/>
+        <w:rPr>
+          <w:color w:val="000000"/>
+          <w:sz w:val="40"/>
+          <w:szCs w:val="40"/>
+        </w:rPr>
+      </w:pPr>
+    </w:p>
+    <w:p>
+      <w:pPr>
+        <w:spacing w:line="360" w:lineRule="auto"/>
+        <w:jc w:val="center"/>
+        <w:rPr>
+          <w:color w:val="000000"/>
+          <w:sz w:val="40"/>
+          <w:szCs w:val="40"/>
+        </w:rPr>
       </w:pPr>
     </w:p>
     <w:p>
@@ -492,13 +521,22 @@
         </w:rPr>
         <w:t>{{</w:t>
       </w:r>
+      <w:proofErr w:type="spellStart"/>
       <w:proofErr w:type="gramEnd"/>
       <w:r>
         <w:rPr>
           <w:sz w:val="28"/>
           <w:szCs w:val="28"/>
         </w:rPr>
-        <w:t>isrctn_number}}</w:t>
+        <w:t>isrctn_number</w:t>
+      </w:r>
+      <w:proofErr w:type="spellEnd"/>
+      <w:r>
+        <w:rPr>
+          <w:sz w:val="28"/>
+          <w:szCs w:val="28"/>
+        </w:rPr>
+        <w:t>}}</w:t>
       </w:r>
     </w:p>
     <w:p>
@@ -533,15 +571,24 @@
           <w:sz w:val="28"/>
           <w:szCs w:val="28"/>
         </w:rPr>
-        <w:t>{{protocol_version</w:t>
-      </w:r>
+        <w:t>{{</w:t>
+      </w:r>
+      <w:proofErr w:type="spellStart"/>
       <w:r>
         <w:rPr>
           <w:sz w:val="28"/>
           <w:szCs w:val="28"/>
         </w:rPr>
+        <w:t>protocol_version</w:t>
+      </w:r>
+      <w:r>
+        <w:rPr>
+          <w:sz w:val="28"/>
+          <w:szCs w:val="28"/>
+        </w:rPr>
         <w:t>_date</w:t>
       </w:r>
+      <w:proofErr w:type="spellEnd"/>
       <w:r>
         <w:rPr>
           <w:sz w:val="28"/>
@@ -946,6 +993,40 @@
     <w:p>
       <w:pPr>
         <w:rPr>
+          <w:ins w:id="1" w:author="Hassan Jafari" w:date="2025-11-28T13:30:00Z" w16du:dateUtc="2025-11-28T13:30:00Z"/>
+          <w:sz w:val="22"/>
+          <w:szCs w:val="22"/>
+        </w:rPr>
+      </w:pPr>
+      <w:ins w:id="2" w:author="Hassan Jafari" w:date="2025-11-28T13:30:00Z" w16du:dateUtc="2025-11-28T13:30:00Z">
+        <w:r>
+          <w:rPr>
+            <w:sz w:val="22"/>
+            <w:szCs w:val="22"/>
+          </w:rPr>
+          <w:t>{{</w:t>
+        </w:r>
+        <w:proofErr w:type="spellStart"/>
+        <w:r>
+          <w:rPr>
+            <w:sz w:val="22"/>
+            <w:szCs w:val="22"/>
+          </w:rPr>
+          <w:t>trial_statisticians</w:t>
+        </w:r>
+        <w:proofErr w:type="spellEnd"/>
+        <w:r>
+          <w:rPr>
+            <w:sz w:val="22"/>
+            <w:szCs w:val="22"/>
+          </w:rPr>
+          <w:t>}}</w:t>
+        </w:r>
+      </w:ins>
+    </w:p>
+    <w:p>
+      <w:pPr>
+        <w:rPr>
           <w:sz w:val="22"/>
           <w:szCs w:val="22"/>
         </w:rPr>
@@ -1059,7 +1140,23 @@
           <w:sz w:val="22"/>
           <w:szCs w:val="22"/>
         </w:rPr>
-        <w:t>{{senior_statistician}}</w:t>
+        <w:t>{{</w:t>
+      </w:r>
+      <w:proofErr w:type="spellStart"/>
+      <w:r>
+        <w:rPr>
+          <w:sz w:val="22"/>
+          <w:szCs w:val="22"/>
+        </w:rPr>
+        <w:t>senior_statistician</w:t>
+      </w:r>
+      <w:proofErr w:type="spellEnd"/>
+      <w:r>
+        <w:rPr>
+          <w:sz w:val="22"/>
+          <w:szCs w:val="22"/>
+        </w:rPr>
+        <w:t>}}</w:t>
       </w:r>
     </w:p>
     <w:p>
@@ -1178,7 +1275,23 @@
           <w:sz w:val="22"/>
           <w:szCs w:val="22"/>
         </w:rPr>
-        <w:t>{{name_of_cheif_investigator}}</w:t>
+        <w:t>{{</w:t>
+      </w:r>
+      <w:proofErr w:type="spellStart"/>
+      <w:r>
+        <w:rPr>
+          <w:sz w:val="22"/>
+          <w:szCs w:val="22"/>
+        </w:rPr>
+        <w:t>name_of_cheif_investigator</w:t>
+      </w:r>
+      <w:proofErr w:type="spellEnd"/>
+      <w:r>
+        <w:rPr>
+          <w:sz w:val="22"/>
+          <w:szCs w:val="22"/>
+        </w:rPr>
+        <w:t>}}</w:t>
       </w:r>
     </w:p>
     <w:p>
@@ -1325,21 +1438,69 @@
           <w:sz w:val="22"/>
           <w:szCs w:val="22"/>
         </w:rPr>
-        <w:t>{{trial_acronym}}</w:t>
-      </w:r>
-      <w:r>
-        <w:rPr>
-          <w:sz w:val="22"/>
-          <w:szCs w:val="22"/>
-        </w:rPr>
-        <w:t xml:space="preserve"> trial. It is intended that the results reported in these papers will follow the strategy set out herein; subsequent papers of a more exploratory nature will not be bound by this strategy but will be expected to follow the broad principles laid down for the principal paper(s). These principles are not intended to curtail exploratory analysis or to prohibit sensible statistical and reporting practices, but they are intended to establish the strategy that will be followed as closely as possible, when analysing and reporting the trial. Reference was made to the trial protocol (version </w:t>
-      </w:r>
-      <w:r>
-        <w:rPr>
-          <w:sz w:val="22"/>
-          <w:szCs w:val="22"/>
-        </w:rPr>
-        <w:t>{{protocol_version}}</w:t>
+        <w:t>{{</w:t>
+      </w:r>
+      <w:proofErr w:type="spellStart"/>
+      <w:r>
+        <w:rPr>
+          <w:sz w:val="22"/>
+          <w:szCs w:val="22"/>
+        </w:rPr>
+        <w:t>trial_acronym</w:t>
+      </w:r>
+      <w:proofErr w:type="spellEnd"/>
+      <w:r>
+        <w:rPr>
+          <w:sz w:val="22"/>
+          <w:szCs w:val="22"/>
+        </w:rPr>
+        <w:t>}}</w:t>
+      </w:r>
+      <w:r>
+        <w:rPr>
+          <w:sz w:val="22"/>
+          <w:szCs w:val="22"/>
+        </w:rPr>
+        <w:t xml:space="preserve"> trial. It is intended that the results reported in these papers will follow the strategy set out herein; subsequent papers of a more exploratory nature will not be bound by this strategy but will be expected to follow the broad principles laid down for the principal paper(s). These principles are not intended to curtail exploratory analysis or to prohibit sensible statistical and reporting practices, but they are intended to establish the strategy that will be followed as closely as possible, when </w:t>
+      </w:r>
+      <w:proofErr w:type="spellStart"/>
+      <w:r>
+        <w:rPr>
+          <w:sz w:val="22"/>
+          <w:szCs w:val="22"/>
+        </w:rPr>
+        <w:t>analysing</w:t>
+      </w:r>
+      <w:proofErr w:type="spellEnd"/>
+      <w:r>
+        <w:rPr>
+          <w:sz w:val="22"/>
+          <w:szCs w:val="22"/>
+        </w:rPr>
+        <w:t xml:space="preserve"> and reporting the trial. Reference was made to the trial protocol (version </w:t>
+      </w:r>
+      <w:r>
+        <w:rPr>
+          <w:sz w:val="22"/>
+          <w:szCs w:val="22"/>
+        </w:rPr>
+        <w:t>{{</w:t>
+      </w:r>
+      <w:proofErr w:type="spellStart"/>
+      <w:r>
+        <w:rPr>
+          <w:sz w:val="22"/>
+          <w:szCs w:val="22"/>
+        </w:rPr>
+        <w:t>protocol_version</w:t>
+      </w:r>
+      <w:proofErr w:type="spellEnd"/>
+      <w:r>
+        <w:rPr>
+          <w:sz w:val="22"/>
+          <w:szCs w:val="22"/>
+        </w:rPr>
+        <w:t>}}</w:t>
       </w:r>
       <w:r>
         <w:rPr>
@@ -6360,18 +6521,18 @@
       <w:pPr>
         <w:pStyle w:val="Heading1"/>
       </w:pPr>
-      <w:bookmarkStart w:id="1" w:name="_Toc185323509"/>
-      <w:bookmarkStart w:id="2" w:name="_Toc185323523"/>
-      <w:bookmarkStart w:id="3" w:name="_Toc185323524"/>
-      <w:bookmarkEnd w:id="1"/>
-      <w:bookmarkEnd w:id="2"/>
+      <w:bookmarkStart w:id="3" w:name="_Toc185323509"/>
+      <w:bookmarkStart w:id="4" w:name="_Toc185323523"/>
+      <w:bookmarkStart w:id="5" w:name="_Toc185323524"/>
       <w:bookmarkEnd w:id="3"/>
-      <w:commentRangeStart w:id="4"/>
+      <w:bookmarkEnd w:id="4"/>
+      <w:bookmarkEnd w:id="5"/>
+      <w:commentRangeStart w:id="6"/>
       <w:r>
         <w:lastRenderedPageBreak/>
         <w:t>Background and rationale of trial</w:t>
       </w:r>
-      <w:commentRangeEnd w:id="4"/>
+      <w:commentRangeEnd w:id="6"/>
       <w:r>
         <w:rPr>
           <w:rStyle w:val="CommentReference"/>
@@ -6380,22 +6541,38 @@
           <w:kern w:val="0"/>
           <w:lang w:val="en-US"/>
         </w:rPr>
-        <w:commentReference w:id="4"/>
-      </w:r>
-    </w:p>
-    <w:p>
-      <w:pPr>
-        <w:rPr>
-          <w:sz w:val="22"/>
-          <w:szCs w:val="22"/>
-        </w:rPr>
-      </w:pPr>
-      <w:r>
-        <w:rPr>
-          <w:sz w:val="22"/>
-          <w:szCs w:val="22"/>
-        </w:rPr>
-        <w:t>{{description_of_trial}}</w:t>
+        <w:commentReference w:id="6"/>
+      </w:r>
+    </w:p>
+    <w:p>
+      <w:pPr>
+        <w:rPr>
+          <w:sz w:val="22"/>
+          <w:szCs w:val="22"/>
+        </w:rPr>
+      </w:pPr>
+      <w:r>
+        <w:rPr>
+          <w:sz w:val="22"/>
+          <w:szCs w:val="22"/>
+        </w:rPr>
+        <w:t>{{</w:t>
+      </w:r>
+      <w:proofErr w:type="spellStart"/>
+      <w:r>
+        <w:rPr>
+          <w:sz w:val="22"/>
+          <w:szCs w:val="22"/>
+        </w:rPr>
+        <w:t>description_of_trial</w:t>
+      </w:r>
+      <w:proofErr w:type="spellEnd"/>
+      <w:r>
+        <w:rPr>
+          <w:sz w:val="22"/>
+          <w:szCs w:val="22"/>
+        </w:rPr>
+        <w:t>}}</w:t>
       </w:r>
     </w:p>
     <w:p/>
@@ -6403,13 +6580,13 @@
       <w:pPr>
         <w:pStyle w:val="Heading2"/>
       </w:pPr>
-      <w:bookmarkStart w:id="5" w:name="_Toc183099234"/>
-      <w:bookmarkStart w:id="6" w:name="_Toc185323526"/>
+      <w:bookmarkStart w:id="7" w:name="_Toc183099234"/>
+      <w:bookmarkStart w:id="8" w:name="_Toc185323526"/>
       <w:r>
         <w:t>Research Team</w:t>
       </w:r>
-      <w:bookmarkEnd w:id="5"/>
-      <w:bookmarkEnd w:id="6"/>
+      <w:bookmarkEnd w:id="7"/>
+      <w:bookmarkEnd w:id="8"/>
     </w:p>
     <w:p/>
     <w:p>
@@ -6448,7 +6625,23 @@
           <w:sz w:val="22"/>
           <w:szCs w:val="22"/>
         </w:rPr>
-        <w:t>{{name_of_cheif_investigator}}</w:t>
+        <w:t>{{</w:t>
+      </w:r>
+      <w:proofErr w:type="spellStart"/>
+      <w:r>
+        <w:rPr>
+          <w:sz w:val="22"/>
+          <w:szCs w:val="22"/>
+        </w:rPr>
+        <w:t>name_of_cheif_investigator</w:t>
+      </w:r>
+      <w:proofErr w:type="spellEnd"/>
+      <w:r>
+        <w:rPr>
+          <w:sz w:val="22"/>
+          <w:szCs w:val="22"/>
+        </w:rPr>
+        <w:t>}}</w:t>
       </w:r>
     </w:p>
     <w:p>
@@ -6569,7 +6762,23 @@
           <w:sz w:val="22"/>
           <w:szCs w:val="22"/>
         </w:rPr>
-        <w:t>{{trial_manager}}</w:t>
+        <w:t>{{</w:t>
+      </w:r>
+      <w:proofErr w:type="spellStart"/>
+      <w:r>
+        <w:rPr>
+          <w:sz w:val="22"/>
+          <w:szCs w:val="22"/>
+        </w:rPr>
+        <w:t>trial_manager</w:t>
+      </w:r>
+      <w:proofErr w:type="spellEnd"/>
+      <w:r>
+        <w:rPr>
+          <w:sz w:val="22"/>
+          <w:szCs w:val="22"/>
+        </w:rPr>
+        <w:t>}}</w:t>
       </w:r>
     </w:p>
     <w:p>
@@ -6598,7 +6807,8 @@
         </w:rPr>
         <w:t>Senior statist</w:t>
       </w:r>
-      <w:commentRangeStart w:id="7"/>
+      <w:commentRangeStart w:id="9"/>
+      <w:commentRangeStart w:id="10"/>
       <w:r>
         <w:rPr>
           <w:b/>
@@ -6608,31 +6818,77 @@
         </w:rPr>
         <w:t>ician:</w:t>
       </w:r>
-      <w:commentRangeEnd w:id="7"/>
+      <w:commentRangeEnd w:id="9"/>
       <w:r>
         <w:rPr>
           <w:rStyle w:val="CommentReference"/>
         </w:rPr>
-        <w:commentReference w:id="7"/>
-      </w:r>
-    </w:p>
-    <w:p>
-      <w:pPr>
+        <w:commentReference w:id="9"/>
+      </w:r>
+      <w:commentRangeEnd w:id="10"/>
+      <w:r>
+        <w:rPr>
+          <w:rStyle w:val="CommentReference"/>
+        </w:rPr>
+        <w:commentReference w:id="10"/>
+      </w:r>
+    </w:p>
+    <w:p>
+      <w:pPr>
+        <w:rPr>
+          <w:sz w:val="22"/>
+          <w:szCs w:val="22"/>
+        </w:rPr>
+      </w:pPr>
+      <w:ins w:id="11" w:author="Hassan Jafari" w:date="2025-11-28T13:32:00Z" w16du:dateUtc="2025-11-28T13:32:00Z">
+        <w:r>
+          <w:rPr>
+            <w:sz w:val="22"/>
+            <w:szCs w:val="22"/>
+          </w:rPr>
+          <w:t>{{</w:t>
+        </w:r>
+        <w:proofErr w:type="spellStart"/>
+        <w:r>
+          <w:rPr>
+            <w:sz w:val="22"/>
+            <w:szCs w:val="22"/>
+          </w:rPr>
+          <w:t>senior_statistician</w:t>
+        </w:r>
+        <w:proofErr w:type="spellEnd"/>
+        <w:r>
+          <w:rPr>
+            <w:sz w:val="22"/>
+            <w:szCs w:val="22"/>
+          </w:rPr>
+          <w:t>}}</w:t>
+        </w:r>
+        <w:r>
+          <w:rPr>
+            <w:sz w:val="22"/>
+            <w:szCs w:val="22"/>
+          </w:rPr>
+          <w:br/>
+        </w:r>
+      </w:ins>
+    </w:p>
+    <w:p>
+      <w:pPr>
+        <w:rPr>
+          <w:sz w:val="22"/>
+          <w:szCs w:val="22"/>
+        </w:rPr>
+      </w:pPr>
+      <w:r>
         <w:rPr>
           <w:b/>
           <w:bCs/>
           <w:sz w:val="22"/>
           <w:szCs w:val="22"/>
         </w:rPr>
-      </w:pPr>
-    </w:p>
-    <w:p>
-      <w:pPr>
-        <w:rPr>
-          <w:sz w:val="22"/>
-          <w:szCs w:val="22"/>
-        </w:rPr>
-      </w:pPr>
+        <w:t>Trial statistician</w:t>
+      </w:r>
       <w:r>
         <w:rPr>
           <w:b/>
@@ -6640,8 +6896,62 @@
           <w:sz w:val="22"/>
           <w:szCs w:val="22"/>
         </w:rPr>
-        <w:t>Trial statistician</w:t>
-      </w:r>
+        <w:t>:</w:t>
+      </w:r>
+      <w:r>
+        <w:rPr>
+          <w:sz w:val="22"/>
+          <w:szCs w:val="22"/>
+        </w:rPr>
+        <w:t xml:space="preserve"> </w:t>
+      </w:r>
+    </w:p>
+    <w:p>
+      <w:pPr>
+        <w:rPr>
+          <w:sz w:val="22"/>
+          <w:szCs w:val="22"/>
+        </w:rPr>
+      </w:pPr>
+      <w:r>
+        <w:rPr>
+          <w:sz w:val="22"/>
+          <w:szCs w:val="22"/>
+        </w:rPr>
+        <w:t>{{</w:t>
+      </w:r>
+      <w:proofErr w:type="spellStart"/>
+      <w:r>
+        <w:rPr>
+          <w:sz w:val="22"/>
+          <w:szCs w:val="22"/>
+        </w:rPr>
+        <w:t>trial_statisticians</w:t>
+      </w:r>
+      <w:proofErr w:type="spellEnd"/>
+      <w:r>
+        <w:rPr>
+          <w:sz w:val="22"/>
+          <w:szCs w:val="22"/>
+        </w:rPr>
+        <w:t>}}</w:t>
+      </w:r>
+    </w:p>
+    <w:p>
+      <w:pPr>
+        <w:rPr>
+          <w:sz w:val="22"/>
+          <w:szCs w:val="22"/>
+        </w:rPr>
+      </w:pPr>
+    </w:p>
+    <w:p>
+      <w:pPr>
+        <w:rPr>
+          <w:sz w:val="22"/>
+          <w:szCs w:val="22"/>
+        </w:rPr>
+      </w:pPr>
       <w:r>
         <w:rPr>
           <w:b/>
@@ -6649,46 +6959,8 @@
           <w:sz w:val="22"/>
           <w:szCs w:val="22"/>
         </w:rPr>
-        <w:t>:</w:t>
-      </w:r>
-      <w:r>
-        <w:rPr>
-          <w:sz w:val="22"/>
-          <w:szCs w:val="22"/>
-        </w:rPr>
-        <w:t xml:space="preserve"> </w:t>
-      </w:r>
-    </w:p>
-    <w:p>
-      <w:pPr>
-        <w:rPr>
-          <w:sz w:val="22"/>
-          <w:szCs w:val="22"/>
-        </w:rPr>
-      </w:pPr>
-      <w:r>
-        <w:rPr>
-          <w:sz w:val="22"/>
-          <w:szCs w:val="22"/>
-        </w:rPr>
-        <w:t>{{trial_statisticians}}</w:t>
-      </w:r>
-    </w:p>
-    <w:p>
-      <w:pPr>
-        <w:rPr>
-          <w:sz w:val="22"/>
-          <w:szCs w:val="22"/>
-        </w:rPr>
-      </w:pPr>
-    </w:p>
-    <w:p>
-      <w:pPr>
-        <w:rPr>
-          <w:sz w:val="22"/>
-          <w:szCs w:val="22"/>
-        </w:rPr>
-      </w:pPr>
+        <w:t>Trial health economist</w:t>
+      </w:r>
       <w:r>
         <w:rPr>
           <w:b/>
@@ -6696,85 +6968,101 @@
           <w:sz w:val="22"/>
           <w:szCs w:val="22"/>
         </w:rPr>
-        <w:t>Trial health economist</w:t>
-      </w:r>
-      <w:r>
+        <w:t>:</w:t>
+      </w:r>
+      <w:r>
+        <w:rPr>
+          <w:sz w:val="22"/>
+          <w:szCs w:val="22"/>
+        </w:rPr>
+        <w:t xml:space="preserve"> </w:t>
+      </w:r>
+    </w:p>
+    <w:p>
+      <w:pPr>
+        <w:rPr>
+          <w:sz w:val="22"/>
+          <w:szCs w:val="22"/>
+        </w:rPr>
+      </w:pPr>
+      <w:r>
+        <w:rPr>
+          <w:sz w:val="22"/>
+          <w:szCs w:val="22"/>
+        </w:rPr>
+        <w:t>{{</w:t>
+      </w:r>
+      <w:proofErr w:type="spellStart"/>
+      <w:r>
+        <w:rPr>
+          <w:sz w:val="22"/>
+          <w:szCs w:val="22"/>
+        </w:rPr>
+        <w:t>health_economist</w:t>
+      </w:r>
+      <w:proofErr w:type="spellEnd"/>
+      <w:r>
+        <w:rPr>
+          <w:sz w:val="22"/>
+          <w:szCs w:val="22"/>
+        </w:rPr>
+        <w:t>}}</w:t>
+      </w:r>
+    </w:p>
+    <w:p/>
+    <w:p/>
+    <w:p>
+      <w:pPr>
+        <w:pStyle w:val="Heading2"/>
+      </w:pPr>
+      <w:bookmarkStart w:id="12" w:name="_Toc183099235"/>
+      <w:bookmarkStart w:id="13" w:name="_Toc185323527"/>
+      <w:r>
+        <w:t>Principal research objectives to be addressed</w:t>
+      </w:r>
+      <w:bookmarkEnd w:id="12"/>
+      <w:bookmarkEnd w:id="13"/>
+      <w:r>
+        <w:fldChar w:fldCharType="begin"/>
+      </w:r>
+      <w:r>
+        <w:instrText xml:space="preserve"> TC "</w:instrText>
+      </w:r>
+      <w:bookmarkStart w:id="14" w:name="_Toc183094406"/>
+      <w:r>
+        <w:instrText>1.1</w:instrText>
+      </w:r>
+      <w:r>
+        <w:tab/>
+        <w:instrText>Principal research objectives to be addressed</w:instrText>
+      </w:r>
+      <w:bookmarkEnd w:id="14"/>
+      <w:r>
+        <w:instrText xml:space="preserve">" \f C \l "1" </w:instrText>
+      </w:r>
+      <w:r>
+        <w:fldChar w:fldCharType="end"/>
+      </w:r>
+    </w:p>
+    <w:p/>
+    <w:p>
+      <w:pPr>
         <w:rPr>
           <w:b/>
           <w:bCs/>
           <w:sz w:val="22"/>
           <w:szCs w:val="22"/>
         </w:rPr>
-        <w:t>:</w:t>
-      </w:r>
-      <w:r>
-        <w:rPr>
-          <w:sz w:val="22"/>
-          <w:szCs w:val="22"/>
-        </w:rPr>
-        <w:t xml:space="preserve"> </w:t>
-      </w:r>
-    </w:p>
-    <w:p>
-      <w:pPr>
-        <w:rPr>
-          <w:sz w:val="22"/>
-          <w:szCs w:val="22"/>
-        </w:rPr>
-      </w:pPr>
-      <w:r>
-        <w:rPr>
-          <w:sz w:val="22"/>
-          <w:szCs w:val="22"/>
-        </w:rPr>
-        <w:t>{{health_economist}}</w:t>
-      </w:r>
-    </w:p>
-    <w:p/>
-    <w:p/>
-    <w:p>
-      <w:pPr>
-        <w:pStyle w:val="Heading2"/>
-      </w:pPr>
-      <w:bookmarkStart w:id="8" w:name="_Toc183099235"/>
-      <w:bookmarkStart w:id="9" w:name="_Toc185323527"/>
-      <w:r>
-        <w:t>Principal research objectives to be addressed</w:t>
-      </w:r>
-      <w:bookmarkEnd w:id="8"/>
-      <w:bookmarkEnd w:id="9"/>
-      <w:r>
-        <w:fldChar w:fldCharType="begin"/>
-      </w:r>
-      <w:r>
-        <w:instrText xml:space="preserve"> TC "</w:instrText>
-      </w:r>
-      <w:bookmarkStart w:id="10" w:name="_Toc183094406"/>
-      <w:r>
-        <w:instrText>1.1</w:instrText>
-      </w:r>
-      <w:r>
-        <w:tab/>
-        <w:instrText>Principal research objectives to be addressed</w:instrText>
-      </w:r>
-      <w:bookmarkEnd w:id="10"/>
-      <w:r>
-        <w:instrText xml:space="preserve">" \f C \l "1" </w:instrText>
-      </w:r>
-      <w:r>
-        <w:fldChar w:fldCharType="end"/>
-      </w:r>
-    </w:p>
-    <w:p/>
-    <w:p>
-      <w:pPr>
+      </w:pPr>
+      <w:r>
         <w:rPr>
           <w:b/>
           <w:bCs/>
           <w:sz w:val="22"/>
           <w:szCs w:val="22"/>
         </w:rPr>
-      </w:pPr>
+        <w:t>Primary objectives</w:t>
+      </w:r>
       <w:r>
         <w:rPr>
           <w:b/>
@@ -6782,7 +7070,7 @@
           <w:sz w:val="22"/>
           <w:szCs w:val="22"/>
         </w:rPr>
-        <w:t>Primary objectives</w:t>
+        <w:t>:</w:t>
       </w:r>
       <w:r>
         <w:rPr>
@@ -6791,7 +7079,7 @@
           <w:sz w:val="22"/>
           <w:szCs w:val="22"/>
         </w:rPr>
-        <w:t>:</w:t>
+        <w:fldChar w:fldCharType="begin"/>
       </w:r>
       <w:r>
         <w:rPr>
@@ -6800,8 +7088,9 @@
           <w:sz w:val="22"/>
           <w:szCs w:val="22"/>
         </w:rPr>
-        <w:fldChar w:fldCharType="begin"/>
-      </w:r>
+        <w:instrText xml:space="preserve"> TC "</w:instrText>
+      </w:r>
+      <w:bookmarkStart w:id="15" w:name="_Toc183094407"/>
       <w:r>
         <w:rPr>
           <w:b/>
@@ -6809,9 +7098,9 @@
           <w:sz w:val="22"/>
           <w:szCs w:val="22"/>
         </w:rPr>
-        <w:instrText xml:space="preserve"> TC "</w:instrText>
-      </w:r>
-      <w:bookmarkStart w:id="11" w:name="_Toc183094407"/>
+        <w:instrText>Primary objectives</w:instrText>
+      </w:r>
+      <w:bookmarkEnd w:id="15"/>
       <w:r>
         <w:rPr>
           <w:b/>
@@ -6819,9 +7108,8 @@
           <w:sz w:val="22"/>
           <w:szCs w:val="22"/>
         </w:rPr>
-        <w:instrText>Primary objectives</w:instrText>
-      </w:r>
-      <w:bookmarkEnd w:id="11"/>
+        <w:instrText xml:space="preserve">" \f C \l "1" </w:instrText>
+      </w:r>
       <w:r>
         <w:rPr>
           <w:b/>
@@ -6829,15 +7117,6 @@
           <w:sz w:val="22"/>
           <w:szCs w:val="22"/>
         </w:rPr>
-        <w:instrText xml:space="preserve">" \f C \l "1" </w:instrText>
-      </w:r>
-      <w:r>
-        <w:rPr>
-          <w:b/>
-          <w:bCs/>
-          <w:sz w:val="22"/>
-          <w:szCs w:val="22"/>
-        </w:rPr>
         <w:fldChar w:fldCharType="end"/>
       </w:r>
     </w:p>
@@ -6853,7 +7132,15 @@
           <w:sz w:val="22"/>
           <w:szCs w:val="22"/>
         </w:rPr>
-        <w:t>{% for line in primary_</w:t>
+        <w:t xml:space="preserve">{% for line in </w:t>
+      </w:r>
+      <w:proofErr w:type="spellStart"/>
+      <w:r>
+        <w:rPr>
+          <w:sz w:val="22"/>
+          <w:szCs w:val="22"/>
+        </w:rPr>
+        <w:t>primary_</w:t>
       </w:r>
       <w:proofErr w:type="gramStart"/>
       <w:r>
@@ -6863,6 +7150,7 @@
         </w:rPr>
         <w:t>objectives.split</w:t>
       </w:r>
+      <w:proofErr w:type="spellEnd"/>
       <w:proofErr w:type="gramEnd"/>
       <w:r>
         <w:rPr>
@@ -6917,13 +7205,22 @@
         </w:rPr>
         <w:t xml:space="preserve">{%- </w:t>
       </w:r>
+      <w:proofErr w:type="spellStart"/>
       <w:proofErr w:type="gramStart"/>
       <w:r>
         <w:rPr>
           <w:sz w:val="22"/>
           <w:szCs w:val="22"/>
         </w:rPr>
-        <w:t>endfor %}</w:t>
+        <w:t>endfor</w:t>
+      </w:r>
+      <w:proofErr w:type="spellEnd"/>
+      <w:r>
+        <w:rPr>
+          <w:sz w:val="22"/>
+          <w:szCs w:val="22"/>
+        </w:rPr>
+        <w:t xml:space="preserve"> %}</w:t>
       </w:r>
       <w:proofErr w:type="gramEnd"/>
     </w:p>
@@ -6974,7 +7271,7 @@
         </w:rPr>
         <w:instrText xml:space="preserve"> TC "</w:instrText>
       </w:r>
-      <w:bookmarkStart w:id="12" w:name="_Toc183094408"/>
+      <w:bookmarkStart w:id="16" w:name="_Toc183094408"/>
       <w:r>
         <w:rPr>
           <w:b/>
@@ -6982,7 +7279,7 @@
         </w:rPr>
         <w:instrText>Secondary objectives</w:instrText>
       </w:r>
-      <w:bookmarkEnd w:id="12"/>
+      <w:bookmarkEnd w:id="16"/>
       <w:r>
         <w:rPr>
           <w:b/>
@@ -7010,7 +7307,15 @@
           <w:sz w:val="22"/>
           <w:szCs w:val="22"/>
         </w:rPr>
-        <w:t>{% for line in secondary_</w:t>
+        <w:t xml:space="preserve">{% for line in </w:t>
+      </w:r>
+      <w:proofErr w:type="spellStart"/>
+      <w:r>
+        <w:rPr>
+          <w:sz w:val="22"/>
+          <w:szCs w:val="22"/>
+        </w:rPr>
+        <w:t>secondary_</w:t>
       </w:r>
       <w:proofErr w:type="gramStart"/>
       <w:r>
@@ -7020,6 +7325,7 @@
         </w:rPr>
         <w:t>objectives.split</w:t>
       </w:r>
+      <w:proofErr w:type="spellEnd"/>
       <w:proofErr w:type="gramEnd"/>
       <w:r>
         <w:rPr>
@@ -7088,37 +7394,46 @@
         </w:rPr>
         <w:t xml:space="preserve"> </w:t>
       </w:r>
+      <w:proofErr w:type="spellStart"/>
       <w:proofErr w:type="gramStart"/>
       <w:r>
         <w:rPr>
           <w:sz w:val="22"/>
           <w:szCs w:val="22"/>
         </w:rPr>
-        <w:t>endfor %}</w:t>
+        <w:t>endfor</w:t>
+      </w:r>
+      <w:proofErr w:type="spellEnd"/>
+      <w:r>
+        <w:rPr>
+          <w:sz w:val="22"/>
+          <w:szCs w:val="22"/>
+        </w:rPr>
+        <w:t xml:space="preserve"> %}</w:t>
       </w:r>
       <w:proofErr w:type="gramEnd"/>
     </w:p>
     <w:p>
-      <w:bookmarkStart w:id="13" w:name="_Toc183095000"/>
-      <w:bookmarkStart w:id="14" w:name="_Toc183095106"/>
-      <w:bookmarkStart w:id="15" w:name="_Toc183095451"/>
-      <w:bookmarkStart w:id="16" w:name="_Toc183099237"/>
-      <w:bookmarkStart w:id="17" w:name="_Toc183100528"/>
-      <w:bookmarkEnd w:id="13"/>
-      <w:bookmarkEnd w:id="14"/>
-      <w:bookmarkEnd w:id="15"/>
-      <w:bookmarkEnd w:id="16"/>
+      <w:bookmarkStart w:id="17" w:name="_Toc183095000"/>
+      <w:bookmarkStart w:id="18" w:name="_Toc183095106"/>
+      <w:bookmarkStart w:id="19" w:name="_Toc183095451"/>
+      <w:bookmarkStart w:id="20" w:name="_Toc183099237"/>
+      <w:bookmarkStart w:id="21" w:name="_Toc183100528"/>
       <w:bookmarkEnd w:id="17"/>
+      <w:bookmarkEnd w:id="18"/>
+      <w:bookmarkEnd w:id="19"/>
+      <w:bookmarkEnd w:id="20"/>
+      <w:bookmarkEnd w:id="21"/>
     </w:p>
     <w:p>
       <w:pPr>
         <w:pStyle w:val="Heading2"/>
       </w:pPr>
-      <w:bookmarkStart w:id="18" w:name="_Toc185323528"/>
+      <w:bookmarkStart w:id="22" w:name="_Toc185323528"/>
       <w:r>
         <w:t>Trial design including blinding</w:t>
       </w:r>
-      <w:bookmarkEnd w:id="18"/>
+      <w:bookmarkEnd w:id="22"/>
     </w:p>
     <w:p>
       <w:pPr>
@@ -7133,37 +7448,55 @@
           <w:szCs w:val="22"/>
           <w:lang w:val="en-GB"/>
         </w:rPr>
-        <w:t>{{trial_design}}</w:t>
+        <w:t>{{</w:t>
+      </w:r>
+      <w:proofErr w:type="spellStart"/>
+      <w:r>
+        <w:rPr>
+          <w:sz w:val="22"/>
+          <w:szCs w:val="22"/>
+          <w:lang w:val="en-GB"/>
+        </w:rPr>
+        <w:t>trial_design</w:t>
+      </w:r>
+      <w:proofErr w:type="spellEnd"/>
+      <w:r>
+        <w:rPr>
+          <w:sz w:val="22"/>
+          <w:szCs w:val="22"/>
+          <w:lang w:val="en-GB"/>
+        </w:rPr>
+        <w:t>}}</w:t>
       </w:r>
     </w:p>
     <w:p>
       <w:pPr>
         <w:pStyle w:val="Heading2"/>
       </w:pPr>
-      <w:bookmarkStart w:id="19" w:name="_Toc183099238"/>
-      <w:bookmarkEnd w:id="19"/>
+      <w:bookmarkStart w:id="23" w:name="_Toc183099238"/>
+      <w:bookmarkEnd w:id="23"/>
       <w:r>
         <w:br w:type="page"/>
       </w:r>
-      <w:bookmarkStart w:id="20" w:name="_Toc183099239"/>
-      <w:bookmarkStart w:id="21" w:name="_Toc185323529"/>
+      <w:bookmarkStart w:id="24" w:name="_Toc183099239"/>
+      <w:bookmarkStart w:id="25" w:name="_Toc185323529"/>
       <w:r>
         <w:lastRenderedPageBreak/>
         <w:t>Figure 1. Trial design flow diagram</w:t>
       </w:r>
-      <w:bookmarkEnd w:id="20"/>
-      <w:bookmarkEnd w:id="21"/>
+      <w:bookmarkEnd w:id="24"/>
+      <w:bookmarkEnd w:id="25"/>
       <w:r>
         <w:fldChar w:fldCharType="begin"/>
       </w:r>
       <w:r>
         <w:instrText xml:space="preserve"> TC "</w:instrText>
       </w:r>
-      <w:bookmarkStart w:id="22" w:name="_Toc183094410"/>
+      <w:bookmarkStart w:id="26" w:name="_Toc183094410"/>
       <w:r>
         <w:instrText>Figure 1. Trial design flow diagram</w:instrText>
       </w:r>
-      <w:bookmarkEnd w:id="22"/>
+      <w:bookmarkEnd w:id="26"/>
       <w:r>
         <w:instrText xml:space="preserve">" \f C \l "1" </w:instrText>
       </w:r>
@@ -7182,14 +7515,14 @@
       <w:r>
         <w:br w:type="page"/>
       </w:r>
-      <w:bookmarkStart w:id="23" w:name="_Toc183099240"/>
-      <w:bookmarkStart w:id="24" w:name="_Toc185323530"/>
+      <w:bookmarkStart w:id="27" w:name="_Toc183099240"/>
+      <w:bookmarkStart w:id="28" w:name="_Toc185323530"/>
       <w:r>
         <w:lastRenderedPageBreak/>
         <w:t>Method of allocation of groups</w:t>
       </w:r>
-      <w:bookmarkEnd w:id="23"/>
-      <w:bookmarkEnd w:id="24"/>
+      <w:bookmarkEnd w:id="27"/>
+      <w:bookmarkEnd w:id="28"/>
     </w:p>
     <w:p>
       <w:pPr>
@@ -7210,7 +7543,15 @@
           <w:sz w:val="22"/>
           <w:szCs w:val="22"/>
         </w:rPr>
-        <w:t>{randomi</w:t>
+        <w:t>{</w:t>
+      </w:r>
+      <w:proofErr w:type="spellStart"/>
+      <w:r>
+        <w:rPr>
+          <w:sz w:val="22"/>
+          <w:szCs w:val="22"/>
+        </w:rPr>
+        <w:t>randomi</w:t>
       </w:r>
       <w:r>
         <w:rPr>
@@ -7233,6 +7574,7 @@
         </w:rPr>
         <w:t>_method</w:t>
       </w:r>
+      <w:proofErr w:type="spellEnd"/>
       <w:r>
         <w:rPr>
           <w:sz w:val="22"/>
@@ -7277,6 +7619,7 @@
         </w:rPr>
         <w:t>{{</w:t>
       </w:r>
+      <w:proofErr w:type="spellStart"/>
       <w:r>
         <w:rPr>
           <w:sz w:val="22"/>
@@ -7284,6 +7627,7 @@
         </w:rPr>
         <w:t>randomisation_implementation</w:t>
       </w:r>
+      <w:proofErr w:type="spellEnd"/>
       <w:r>
         <w:rPr>
           <w:sz w:val="22"/>
@@ -7312,13 +7656,13 @@
       <w:pPr>
         <w:pStyle w:val="Heading2"/>
       </w:pPr>
-      <w:bookmarkStart w:id="25" w:name="_Toc183099241"/>
-      <w:bookmarkStart w:id="26" w:name="_Toc185323531"/>
+      <w:bookmarkStart w:id="29" w:name="_Toc183099241"/>
+      <w:bookmarkStart w:id="30" w:name="_Toc185323531"/>
       <w:r>
         <w:t>Duration of the treatment period</w:t>
       </w:r>
-      <w:bookmarkEnd w:id="25"/>
-      <w:bookmarkEnd w:id="26"/>
+      <w:bookmarkEnd w:id="29"/>
+      <w:bookmarkEnd w:id="30"/>
     </w:p>
     <w:p>
       <w:pPr>
@@ -7333,7 +7677,23 @@
           <w:sz w:val="22"/>
           <w:szCs w:val="22"/>
         </w:rPr>
-        <w:t>{{duration_of_treatment}}</w:t>
+        <w:t>{{</w:t>
+      </w:r>
+      <w:proofErr w:type="spellStart"/>
+      <w:r>
+        <w:rPr>
+          <w:sz w:val="22"/>
+          <w:szCs w:val="22"/>
+        </w:rPr>
+        <w:t>duration_of_treatment</w:t>
+      </w:r>
+      <w:proofErr w:type="spellEnd"/>
+      <w:r>
+        <w:rPr>
+          <w:sz w:val="22"/>
+          <w:szCs w:val="22"/>
+        </w:rPr>
+        <w:t>}}</w:t>
       </w:r>
       <w:r>
         <w:rPr>
@@ -7350,7 +7710,7 @@
         </w:rPr>
         <w:instrText xml:space="preserve"> TC "</w:instrText>
       </w:r>
-      <w:bookmarkStart w:id="27" w:name="_Toc183094412"/>
+      <w:bookmarkStart w:id="31" w:name="_Toc183094412"/>
       <w:r>
         <w:rPr>
           <w:sz w:val="22"/>
@@ -7366,7 +7726,7 @@
         <w:tab/>
         <w:instrText>Duration of the treatment period</w:instrText>
       </w:r>
-      <w:bookmarkEnd w:id="27"/>
+      <w:bookmarkEnd w:id="31"/>
       <w:r>
         <w:rPr>
           <w:sz w:val="22"/>
@@ -7387,13 +7747,13 @@
       <w:pPr>
         <w:pStyle w:val="Heading2"/>
       </w:pPr>
-      <w:bookmarkStart w:id="28" w:name="_Toc183099242"/>
-      <w:bookmarkStart w:id="29" w:name="_Toc185323532"/>
+      <w:bookmarkStart w:id="32" w:name="_Toc183099242"/>
+      <w:bookmarkStart w:id="33" w:name="_Toc185323532"/>
       <w:r>
         <w:t>Frequency and duration of follow-up</w:t>
       </w:r>
-      <w:bookmarkEnd w:id="28"/>
-      <w:bookmarkEnd w:id="29"/>
+      <w:bookmarkEnd w:id="32"/>
+      <w:bookmarkEnd w:id="33"/>
     </w:p>
     <w:p>
       <w:pPr>
@@ -7429,7 +7789,15 @@
           <w:sz w:val="22"/>
           <w:szCs w:val="22"/>
         </w:rPr>
-        <w:t>{% for line in follow_up_</w:t>
+        <w:t xml:space="preserve">{% for line in </w:t>
+      </w:r>
+      <w:proofErr w:type="spellStart"/>
+      <w:r>
+        <w:rPr>
+          <w:sz w:val="22"/>
+          <w:szCs w:val="22"/>
+        </w:rPr>
+        <w:t>follow_up_</w:t>
       </w:r>
       <w:proofErr w:type="gramStart"/>
       <w:r>
@@ -7439,6 +7807,7 @@
         </w:rPr>
         <w:t>timepoints.split</w:t>
       </w:r>
+      <w:proofErr w:type="spellEnd"/>
       <w:proofErr w:type="gramEnd"/>
       <w:r>
         <w:rPr>
@@ -7507,13 +7876,22 @@
         </w:rPr>
         <w:t xml:space="preserve"> </w:t>
       </w:r>
+      <w:proofErr w:type="spellStart"/>
       <w:proofErr w:type="gramStart"/>
       <w:r>
         <w:rPr>
           <w:sz w:val="22"/>
           <w:szCs w:val="22"/>
         </w:rPr>
-        <w:t>endfor %}</w:t>
+        <w:t>endfor</w:t>
+      </w:r>
+      <w:proofErr w:type="spellEnd"/>
+      <w:r>
+        <w:rPr>
+          <w:sz w:val="22"/>
+          <w:szCs w:val="22"/>
+        </w:rPr>
+        <w:t xml:space="preserve"> %}</w:t>
       </w:r>
       <w:proofErr w:type="gramEnd"/>
     </w:p>
@@ -7522,27 +7900,35 @@
       <w:pPr>
         <w:pStyle w:val="Heading2"/>
       </w:pPr>
-      <w:bookmarkStart w:id="30" w:name="_Toc183099243"/>
-      <w:bookmarkStart w:id="31" w:name="_Toc185323533"/>
+      <w:bookmarkStart w:id="34" w:name="_Toc183099243"/>
+      <w:bookmarkStart w:id="35" w:name="_Toc185323533"/>
       <w:r>
         <w:t>Visit windows</w:t>
       </w:r>
-      <w:bookmarkEnd w:id="30"/>
-      <w:bookmarkEnd w:id="31"/>
-    </w:p>
-    <w:p>
-      <w:pPr>
-        <w:rPr>
-          <w:sz w:val="22"/>
-          <w:szCs w:val="22"/>
-        </w:rPr>
-      </w:pPr>
-      <w:r>
-        <w:rPr>
-          <w:sz w:val="22"/>
-          <w:szCs w:val="22"/>
-        </w:rPr>
-        <w:t>{% for line in visit_</w:t>
+      <w:bookmarkEnd w:id="34"/>
+      <w:bookmarkEnd w:id="35"/>
+    </w:p>
+    <w:p>
+      <w:pPr>
+        <w:rPr>
+          <w:sz w:val="22"/>
+          <w:szCs w:val="22"/>
+        </w:rPr>
+      </w:pPr>
+      <w:r>
+        <w:rPr>
+          <w:sz w:val="22"/>
+          <w:szCs w:val="22"/>
+        </w:rPr>
+        <w:t xml:space="preserve">{% for line in </w:t>
+      </w:r>
+      <w:proofErr w:type="spellStart"/>
+      <w:r>
+        <w:rPr>
+          <w:sz w:val="22"/>
+          <w:szCs w:val="22"/>
+        </w:rPr>
+        <w:t>visit_</w:t>
       </w:r>
       <w:proofErr w:type="gramStart"/>
       <w:r>
@@ -7552,6 +7938,7 @@
         </w:rPr>
         <w:t>windows.split</w:t>
       </w:r>
+      <w:proofErr w:type="spellEnd"/>
       <w:proofErr w:type="gramEnd"/>
       <w:r>
         <w:rPr>
@@ -7606,13 +7993,22 @@
         </w:rPr>
         <w:t xml:space="preserve">{%- </w:t>
       </w:r>
+      <w:proofErr w:type="spellStart"/>
       <w:proofErr w:type="gramStart"/>
       <w:r>
         <w:rPr>
           <w:sz w:val="22"/>
           <w:szCs w:val="22"/>
         </w:rPr>
-        <w:t>endfor %}</w:t>
+        <w:t>endfor</w:t>
+      </w:r>
+      <w:proofErr w:type="spellEnd"/>
+      <w:r>
+        <w:rPr>
+          <w:sz w:val="22"/>
+          <w:szCs w:val="22"/>
+        </w:rPr>
+        <w:t xml:space="preserve"> %}</w:t>
       </w:r>
       <w:proofErr w:type="gramEnd"/>
     </w:p>
@@ -7629,7 +8025,7 @@
       <w:r>
         <w:instrText xml:space="preserve"> TC "</w:instrText>
       </w:r>
-      <w:bookmarkStart w:id="32" w:name="_Toc183094414"/>
+      <w:bookmarkStart w:id="36" w:name="_Toc183094414"/>
       <w:r>
         <w:instrText>1.6</w:instrText>
       </w:r>
@@ -7637,7 +8033,7 @@
         <w:tab/>
         <w:instrText>Visit windows</w:instrText>
       </w:r>
-      <w:bookmarkEnd w:id="32"/>
+      <w:bookmarkEnd w:id="36"/>
       <w:r>
         <w:instrText xml:space="preserve">" \f C \l "1" </w:instrText>
       </w:r>
@@ -7649,27 +8045,43 @@
       <w:pPr>
         <w:pStyle w:val="Heading2"/>
       </w:pPr>
-      <w:bookmarkStart w:id="33" w:name="_Toc183099244"/>
-      <w:bookmarkStart w:id="34" w:name="_Toc185323534"/>
+      <w:bookmarkStart w:id="37" w:name="_Toc183099244"/>
+      <w:bookmarkStart w:id="38" w:name="_Toc185323534"/>
       <w:r>
         <w:t>Data collection</w:t>
       </w:r>
-      <w:bookmarkEnd w:id="33"/>
-      <w:bookmarkEnd w:id="34"/>
-    </w:p>
-    <w:p>
-      <w:pPr>
-        <w:rPr>
-          <w:sz w:val="22"/>
-          <w:szCs w:val="22"/>
-        </w:rPr>
-      </w:pPr>
-      <w:r>
-        <w:rPr>
-          <w:sz w:val="22"/>
-          <w:szCs w:val="22"/>
-        </w:rPr>
-        <w:t>{{data_collection_procedures}}</w:t>
+      <w:bookmarkEnd w:id="37"/>
+      <w:bookmarkEnd w:id="38"/>
+    </w:p>
+    <w:p>
+      <w:pPr>
+        <w:rPr>
+          <w:sz w:val="22"/>
+          <w:szCs w:val="22"/>
+        </w:rPr>
+      </w:pPr>
+      <w:r>
+        <w:rPr>
+          <w:sz w:val="22"/>
+          <w:szCs w:val="22"/>
+        </w:rPr>
+        <w:t>{{</w:t>
+      </w:r>
+      <w:proofErr w:type="spellStart"/>
+      <w:r>
+        <w:rPr>
+          <w:sz w:val="22"/>
+          <w:szCs w:val="22"/>
+        </w:rPr>
+        <w:t>data_collection_procedures</w:t>
+      </w:r>
+      <w:proofErr w:type="spellEnd"/>
+      <w:r>
+        <w:rPr>
+          <w:sz w:val="22"/>
+          <w:szCs w:val="22"/>
+        </w:rPr>
+        <w:t>}}</w:t>
       </w:r>
     </w:p>
     <w:p>
@@ -7683,18 +8095,18 @@
       <w:pPr>
         <w:pStyle w:val="Heading2"/>
       </w:pPr>
-      <w:bookmarkStart w:id="35" w:name="_Toc185323535"/>
+      <w:bookmarkStart w:id="39" w:name="_Toc185323535"/>
       <w:r>
         <w:t>Eligibility screening</w:t>
       </w:r>
-      <w:bookmarkEnd w:id="35"/>
+      <w:bookmarkEnd w:id="39"/>
       <w:r>
         <w:fldChar w:fldCharType="begin"/>
       </w:r>
       <w:r>
         <w:instrText xml:space="preserve"> TC "</w:instrText>
       </w:r>
-      <w:bookmarkStart w:id="36" w:name="_Toc183094415"/>
+      <w:bookmarkStart w:id="40" w:name="_Toc183094415"/>
       <w:r>
         <w:instrText>1.7</w:instrText>
       </w:r>
@@ -7702,7 +8114,7 @@
         <w:tab/>
         <w:instrText>Data collection</w:instrText>
       </w:r>
-      <w:bookmarkEnd w:id="36"/>
+      <w:bookmarkEnd w:id="40"/>
       <w:r>
         <w:instrText xml:space="preserve">" \f C \l "1" </w:instrText>
       </w:r>
@@ -7742,7 +8154,15 @@
           <w:sz w:val="22"/>
           <w:szCs w:val="22"/>
         </w:rPr>
-        <w:t>{% for line in inclusion_</w:t>
+        <w:t xml:space="preserve">{% for line in </w:t>
+      </w:r>
+      <w:proofErr w:type="spellStart"/>
+      <w:r>
+        <w:rPr>
+          <w:sz w:val="22"/>
+          <w:szCs w:val="22"/>
+        </w:rPr>
+        <w:t>inclusion_</w:t>
       </w:r>
       <w:proofErr w:type="gramStart"/>
       <w:r>
@@ -7752,6 +8172,7 @@
         </w:rPr>
         <w:t>criteria.split</w:t>
       </w:r>
+      <w:proofErr w:type="spellEnd"/>
       <w:proofErr w:type="gramEnd"/>
       <w:r>
         <w:rPr>
@@ -7834,13 +8255,22 @@
         </w:rPr>
         <w:t xml:space="preserve"> </w:t>
       </w:r>
+      <w:proofErr w:type="spellStart"/>
       <w:proofErr w:type="gramStart"/>
       <w:r>
         <w:rPr>
           <w:sz w:val="22"/>
           <w:szCs w:val="22"/>
         </w:rPr>
-        <w:t>endfor %}</w:t>
+        <w:t>endfor</w:t>
+      </w:r>
+      <w:proofErr w:type="spellEnd"/>
+      <w:r>
+        <w:rPr>
+          <w:sz w:val="22"/>
+          <w:szCs w:val="22"/>
+        </w:rPr>
+        <w:t xml:space="preserve"> %}</w:t>
       </w:r>
       <w:proofErr w:type="gramEnd"/>
     </w:p>
@@ -7883,7 +8313,15 @@
           <w:sz w:val="22"/>
           <w:szCs w:val="22"/>
         </w:rPr>
-        <w:t>{% for line in exclusion_</w:t>
+        <w:t xml:space="preserve">{% for line in </w:t>
+      </w:r>
+      <w:proofErr w:type="spellStart"/>
+      <w:r>
+        <w:rPr>
+          <w:sz w:val="22"/>
+          <w:szCs w:val="22"/>
+        </w:rPr>
+        <w:t>exclusion_</w:t>
       </w:r>
       <w:proofErr w:type="gramStart"/>
       <w:r>
@@ -7893,6 +8331,7 @@
         </w:rPr>
         <w:t>criteria.split</w:t>
       </w:r>
+      <w:proofErr w:type="spellEnd"/>
       <w:proofErr w:type="gramEnd"/>
       <w:r>
         <w:rPr>
@@ -7961,13 +8400,22 @@
         </w:rPr>
         <w:t xml:space="preserve"> </w:t>
       </w:r>
+      <w:proofErr w:type="spellStart"/>
       <w:proofErr w:type="gramStart"/>
       <w:r>
         <w:rPr>
           <w:sz w:val="22"/>
           <w:szCs w:val="22"/>
         </w:rPr>
-        <w:t>endfor %}</w:t>
+        <w:t>endfor</w:t>
+      </w:r>
+      <w:proofErr w:type="spellEnd"/>
+      <w:r>
+        <w:rPr>
+          <w:sz w:val="22"/>
+          <w:szCs w:val="22"/>
+        </w:rPr>
+        <w:t xml:space="preserve"> %}</w:t>
       </w:r>
       <w:proofErr w:type="gramEnd"/>
     </w:p>
@@ -7977,16 +8425,16 @@
       <w:pPr>
         <w:pStyle w:val="Heading2"/>
       </w:pPr>
-      <w:bookmarkStart w:id="37" w:name="_Toc183099246"/>
-      <w:bookmarkStart w:id="38" w:name="_Toc185323536"/>
-      <w:commentRangeStart w:id="39"/>
-      <w:commentRangeStart w:id="40"/>
+      <w:bookmarkStart w:id="41" w:name="_Toc183099246"/>
+      <w:bookmarkStart w:id="42" w:name="_Toc185323536"/>
+      <w:commentRangeStart w:id="43"/>
+      <w:commentRangeStart w:id="44"/>
       <w:r>
         <w:t>Measures</w:t>
       </w:r>
-      <w:bookmarkEnd w:id="37"/>
-      <w:bookmarkEnd w:id="38"/>
-      <w:commentRangeEnd w:id="39"/>
+      <w:bookmarkEnd w:id="41"/>
+      <w:bookmarkEnd w:id="42"/>
+      <w:commentRangeEnd w:id="43"/>
       <w:r>
         <w:rPr>
           <w:rStyle w:val="CommentReference"/>
@@ -7995,9 +8443,9 @@
           <w:u w:val="none"/>
           <w:lang w:val="en-US"/>
         </w:rPr>
-        <w:commentReference w:id="39"/>
-      </w:r>
-      <w:commentRangeEnd w:id="40"/>
+        <w:commentReference w:id="43"/>
+      </w:r>
+      <w:commentRangeEnd w:id="44"/>
       <w:r>
         <w:rPr>
           <w:rStyle w:val="CommentReference"/>
@@ -8006,7 +8454,7 @@
           <w:u w:val="none"/>
           <w:lang w:val="en-US"/>
         </w:rPr>
-        <w:commentReference w:id="40"/>
+        <w:commentReference w:id="44"/>
       </w:r>
       <w:r>
         <w:fldChar w:fldCharType="begin"/>
@@ -8014,11 +8462,11 @@
       <w:r>
         <w:instrText xml:space="preserve"> TC "</w:instrText>
       </w:r>
-      <w:bookmarkStart w:id="41" w:name="_Toc183094419"/>
+      <w:bookmarkStart w:id="45" w:name="_Toc183094419"/>
       <w:r>
         <w:instrText>Measures</w:instrText>
       </w:r>
-      <w:bookmarkEnd w:id="41"/>
+      <w:bookmarkEnd w:id="45"/>
       <w:r>
         <w:instrText xml:space="preserve">" \f C \l "1" </w:instrText>
       </w:r>
@@ -8065,7 +8513,23 @@
           <w:sz w:val="22"/>
           <w:szCs w:val="22"/>
         </w:rPr>
-        <w:t>{{primary_outcome_measures}}</w:t>
+        <w:t>{{</w:t>
+      </w:r>
+      <w:proofErr w:type="spellStart"/>
+      <w:r>
+        <w:rPr>
+          <w:sz w:val="22"/>
+          <w:szCs w:val="22"/>
+        </w:rPr>
+        <w:t>primary_outcome_measures</w:t>
+      </w:r>
+      <w:proofErr w:type="spellEnd"/>
+      <w:r>
+        <w:rPr>
+          <w:sz w:val="22"/>
+          <w:szCs w:val="22"/>
+        </w:rPr>
+        <w:t>}}</w:t>
       </w:r>
       <w:r>
         <w:rPr>
@@ -8081,7 +8545,7 @@
         </w:rPr>
         <w:instrText xml:space="preserve"> TC "</w:instrText>
       </w:r>
-      <w:bookmarkStart w:id="42" w:name="_Toc183094421"/>
+      <w:bookmarkStart w:id="46" w:name="_Toc183094421"/>
       <w:r>
         <w:rPr>
           <w:sz w:val="22"/>
@@ -8089,7 +8553,7 @@
         </w:rPr>
         <w:instrText>Primary outcome measures</w:instrText>
       </w:r>
-      <w:bookmarkEnd w:id="42"/>
+      <w:bookmarkEnd w:id="46"/>
       <w:r>
         <w:rPr>
           <w:sz w:val="22"/>
@@ -8148,7 +8612,23 @@
           <w:sz w:val="22"/>
           <w:szCs w:val="22"/>
         </w:rPr>
-        <w:t>{{secondary_outcome_measures}}</w:t>
+        <w:t>{{</w:t>
+      </w:r>
+      <w:proofErr w:type="spellStart"/>
+      <w:r>
+        <w:rPr>
+          <w:sz w:val="22"/>
+          <w:szCs w:val="22"/>
+        </w:rPr>
+        <w:t>secondary_outcome_measures</w:t>
+      </w:r>
+      <w:proofErr w:type="spellEnd"/>
+      <w:r>
+        <w:rPr>
+          <w:sz w:val="22"/>
+          <w:szCs w:val="22"/>
+        </w:rPr>
+        <w:t>}}</w:t>
       </w:r>
       <w:r>
         <w:rPr>
@@ -8164,7 +8644,7 @@
         </w:rPr>
         <w:instrText xml:space="preserve"> TC "</w:instrText>
       </w:r>
-      <w:bookmarkStart w:id="43" w:name="_Toc183094422"/>
+      <w:bookmarkStart w:id="47" w:name="_Toc183094422"/>
       <w:r>
         <w:rPr>
           <w:sz w:val="22"/>
@@ -8172,7 +8652,7 @@
         </w:rPr>
         <w:instrText>Secondary outcome measures</w:instrText>
       </w:r>
-      <w:bookmarkEnd w:id="43"/>
+      <w:bookmarkEnd w:id="47"/>
       <w:r>
         <w:rPr>
           <w:sz w:val="22"/>
@@ -8233,12 +8713,21 @@
         </w:rPr>
         <w:t>{{</w:t>
       </w:r>
-      <w:r>
-        <w:rPr>
-          <w:sz w:val="22"/>
-          <w:szCs w:val="22"/>
-        </w:rPr>
-        <w:t>mediator_of_treatment}}</w:t>
+      <w:proofErr w:type="spellStart"/>
+      <w:r>
+        <w:rPr>
+          <w:sz w:val="22"/>
+          <w:szCs w:val="22"/>
+        </w:rPr>
+        <w:t>mediator_of_treatment</w:t>
+      </w:r>
+      <w:proofErr w:type="spellEnd"/>
+      <w:r>
+        <w:rPr>
+          <w:sz w:val="22"/>
+          <w:szCs w:val="22"/>
+        </w:rPr>
+        <w:t>}}</w:t>
       </w:r>
       <w:r>
         <w:rPr>
@@ -8254,7 +8743,7 @@
         </w:rPr>
         <w:instrText xml:space="preserve"> TC "</w:instrText>
       </w:r>
-      <w:bookmarkStart w:id="44" w:name="_Toc183094423"/>
+      <w:bookmarkStart w:id="48" w:name="_Toc183094423"/>
       <w:r>
         <w:rPr>
           <w:sz w:val="22"/>
@@ -8262,7 +8751,7 @@
         </w:rPr>
         <w:instrText>Mediators of treatment</w:instrText>
       </w:r>
-      <w:bookmarkEnd w:id="44"/>
+      <w:bookmarkEnd w:id="48"/>
       <w:r>
         <w:rPr>
           <w:sz w:val="22"/>
@@ -8330,7 +8819,23 @@
           <w:sz w:val="22"/>
           <w:szCs w:val="22"/>
         </w:rPr>
-        <w:t>{{moderator_of_treatment}}</w:t>
+        <w:t>{{</w:t>
+      </w:r>
+      <w:proofErr w:type="spellStart"/>
+      <w:r>
+        <w:rPr>
+          <w:sz w:val="22"/>
+          <w:szCs w:val="22"/>
+        </w:rPr>
+        <w:t>moderator_of_treatment</w:t>
+      </w:r>
+      <w:proofErr w:type="spellEnd"/>
+      <w:r>
+        <w:rPr>
+          <w:sz w:val="22"/>
+          <w:szCs w:val="22"/>
+        </w:rPr>
+        <w:t>}}</w:t>
       </w:r>
       <w:r>
         <w:rPr>
@@ -8346,7 +8851,7 @@
         </w:rPr>
         <w:instrText xml:space="preserve"> TC "</w:instrText>
       </w:r>
-      <w:bookmarkStart w:id="45" w:name="_Toc183094424"/>
+      <w:bookmarkStart w:id="49" w:name="_Toc183094424"/>
       <w:r>
         <w:rPr>
           <w:sz w:val="22"/>
@@ -8354,7 +8859,7 @@
         </w:rPr>
         <w:instrText>Moderators of treatment</w:instrText>
       </w:r>
-      <w:bookmarkEnd w:id="45"/>
+      <w:bookmarkEnd w:id="49"/>
       <w:r>
         <w:rPr>
           <w:sz w:val="22"/>
@@ -8422,7 +8927,23 @@
           <w:sz w:val="22"/>
           <w:szCs w:val="22"/>
         </w:rPr>
-        <w:t xml:space="preserve">{{process_indicators}} </w:t>
+        <w:t>{{</w:t>
+      </w:r>
+      <w:proofErr w:type="spellStart"/>
+      <w:r>
+        <w:rPr>
+          <w:sz w:val="22"/>
+          <w:szCs w:val="22"/>
+        </w:rPr>
+        <w:t>process_indicators</w:t>
+      </w:r>
+      <w:proofErr w:type="spellEnd"/>
+      <w:r>
+        <w:rPr>
+          <w:sz w:val="22"/>
+          <w:szCs w:val="22"/>
+        </w:rPr>
+        <w:t xml:space="preserve">}} </w:t>
       </w:r>
       <w:r>
         <w:rPr>
@@ -8438,7 +8959,7 @@
         </w:rPr>
         <w:instrText xml:space="preserve"> TC "</w:instrText>
       </w:r>
-      <w:bookmarkStart w:id="46" w:name="_Toc183094425"/>
+      <w:bookmarkStart w:id="50" w:name="_Toc183094425"/>
       <w:r>
         <w:rPr>
           <w:sz w:val="22"/>
@@ -8446,7 +8967,7 @@
         </w:rPr>
         <w:instrText>Process indicators</w:instrText>
       </w:r>
-      <w:bookmarkEnd w:id="46"/>
+      <w:bookmarkEnd w:id="50"/>
       <w:r>
         <w:rPr>
           <w:sz w:val="22"/>
@@ -8514,7 +9035,23 @@
           <w:sz w:val="22"/>
           <w:szCs w:val="22"/>
         </w:rPr>
-        <w:t xml:space="preserve">{{adverse_events}} </w:t>
+        <w:t>{{</w:t>
+      </w:r>
+      <w:proofErr w:type="spellStart"/>
+      <w:r>
+        <w:rPr>
+          <w:sz w:val="22"/>
+          <w:szCs w:val="22"/>
+        </w:rPr>
+        <w:t>adverse_events</w:t>
+      </w:r>
+      <w:proofErr w:type="spellEnd"/>
+      <w:r>
+        <w:rPr>
+          <w:sz w:val="22"/>
+          <w:szCs w:val="22"/>
+        </w:rPr>
+        <w:t xml:space="preserve">}} </w:t>
       </w:r>
       <w:r>
         <w:rPr>
@@ -8530,7 +9067,7 @@
         </w:rPr>
         <w:instrText xml:space="preserve"> TC "</w:instrText>
       </w:r>
-      <w:bookmarkStart w:id="47" w:name="_Toc183094426"/>
+      <w:bookmarkStart w:id="51" w:name="_Toc183094426"/>
       <w:r>
         <w:rPr>
           <w:sz w:val="22"/>
@@ -8538,7 +9075,7 @@
         </w:rPr>
         <w:instrText>Adverse events</w:instrText>
       </w:r>
-      <w:bookmarkEnd w:id="47"/>
+      <w:bookmarkEnd w:id="51"/>
       <w:r>
         <w:rPr>
           <w:sz w:val="22"/>
@@ -8575,23 +9112,23 @@
       <w:pPr>
         <w:pStyle w:val="Heading2"/>
       </w:pPr>
-      <w:bookmarkStart w:id="48" w:name="_Toc185323537"/>
-      <w:bookmarkStart w:id="49" w:name="_Toc183099247"/>
-      <w:bookmarkStart w:id="50" w:name="_Toc185323538"/>
-      <w:bookmarkEnd w:id="48"/>
-      <w:commentRangeStart w:id="51"/>
+      <w:bookmarkStart w:id="52" w:name="_Toc185323537"/>
+      <w:bookmarkStart w:id="53" w:name="_Toc183099247"/>
+      <w:bookmarkStart w:id="54" w:name="_Toc185323538"/>
+      <w:bookmarkEnd w:id="52"/>
+      <w:commentRangeStart w:id="55"/>
       <w:r>
         <w:t>Sample size estimation (including clinical significance)</w:t>
       </w:r>
-      <w:bookmarkEnd w:id="49"/>
-      <w:bookmarkEnd w:id="50"/>
+      <w:bookmarkEnd w:id="53"/>
+      <w:bookmarkEnd w:id="54"/>
       <w:r>
         <w:fldChar w:fldCharType="begin"/>
       </w:r>
       <w:r>
         <w:instrText xml:space="preserve"> TC "</w:instrText>
       </w:r>
-      <w:bookmarkStart w:id="52" w:name="_Toc183094429"/>
+      <w:bookmarkStart w:id="56" w:name="_Toc183094429"/>
       <w:r>
         <w:instrText>1.8</w:instrText>
       </w:r>
@@ -8599,14 +9136,14 @@
         <w:tab/>
         <w:instrText>Sample size estimation (including clinical significance)</w:instrText>
       </w:r>
-      <w:bookmarkEnd w:id="52"/>
+      <w:bookmarkEnd w:id="56"/>
       <w:r>
         <w:instrText xml:space="preserve">" \f C \l "1" </w:instrText>
       </w:r>
       <w:r>
         <w:fldChar w:fldCharType="end"/>
       </w:r>
-      <w:commentRangeEnd w:id="51"/>
+      <w:commentRangeEnd w:id="55"/>
       <w:r>
         <w:rPr>
           <w:rStyle w:val="CommentReference"/>
@@ -8615,22 +9152,38 @@
           <w:u w:val="none"/>
           <w:lang w:val="en-US"/>
         </w:rPr>
-        <w:commentReference w:id="51"/>
-      </w:r>
-    </w:p>
-    <w:p>
-      <w:pPr>
-        <w:rPr>
-          <w:i/>
-          <w:iCs/>
-        </w:rPr>
-      </w:pPr>
-      <w:r>
-        <w:rPr>
-          <w:i/>
-          <w:iCs/>
-        </w:rPr>
-        <w:t>{{sample_size}}</w:t>
+        <w:commentReference w:id="55"/>
+      </w:r>
+    </w:p>
+    <w:p>
+      <w:pPr>
+        <w:rPr>
+          <w:i/>
+          <w:iCs/>
+        </w:rPr>
+      </w:pPr>
+      <w:r>
+        <w:rPr>
+          <w:i/>
+          <w:iCs/>
+        </w:rPr>
+        <w:t>{{</w:t>
+      </w:r>
+      <w:proofErr w:type="spellStart"/>
+      <w:r>
+        <w:rPr>
+          <w:i/>
+          <w:iCs/>
+        </w:rPr>
+        <w:t>sample_size</w:t>
+      </w:r>
+      <w:proofErr w:type="spellEnd"/>
+      <w:r>
+        <w:rPr>
+          <w:i/>
+          <w:iCs/>
+        </w:rPr>
+        <w:t>}}</w:t>
       </w:r>
     </w:p>
     <w:p>
@@ -8645,8 +9198,8 @@
       <w:pPr>
         <w:pStyle w:val="Heading2"/>
       </w:pPr>
-      <w:bookmarkStart w:id="53" w:name="_Toc185323539"/>
-      <w:bookmarkStart w:id="54" w:name="_Toc183099248"/>
+      <w:bookmarkStart w:id="57" w:name="_Toc185323539"/>
+      <w:bookmarkStart w:id="58" w:name="_Toc183099248"/>
       <w:r>
         <w:t>Brief description</w:t>
       </w:r>
@@ -8656,11 +9209,11 @@
       <w:r>
         <w:t xml:space="preserve"> of proposed analyses</w:t>
       </w:r>
-      <w:bookmarkEnd w:id="53"/>
+      <w:bookmarkEnd w:id="57"/>
       <w:r>
         <w:t xml:space="preserve"> </w:t>
       </w:r>
-      <w:bookmarkEnd w:id="54"/>
+      <w:bookmarkEnd w:id="58"/>
     </w:p>
     <w:p>
       <w:pPr>
@@ -8865,7 +9418,21 @@
         <w:rPr>
           <w:lang w:val="en-GB"/>
         </w:rPr>
-        <w:t>{{timing_of_analysis}}</w:t>
+        <w:t>{{</w:t>
+      </w:r>
+      <w:proofErr w:type="spellStart"/>
+      <w:r>
+        <w:rPr>
+          <w:lang w:val="en-GB"/>
+        </w:rPr>
+        <w:t>timing_of_analysis</w:t>
+      </w:r>
+      <w:proofErr w:type="spellEnd"/>
+      <w:r>
+        <w:rPr>
+          <w:lang w:val="en-GB"/>
+        </w:rPr>
+        <w:t>}}</w:t>
       </w:r>
     </w:p>
     <w:p/>
@@ -8932,49 +9499,45 @@
       <w:pPr>
         <w:pStyle w:val="Heading1"/>
       </w:pPr>
-      <w:bookmarkStart w:id="55" w:name="_Toc185323540"/>
-      <w:bookmarkStart w:id="56" w:name="_Toc185323541"/>
-      <w:bookmarkStart w:id="57" w:name="_Toc183095012"/>
-      <w:bookmarkStart w:id="58" w:name="_Toc183095118"/>
-      <w:bookmarkStart w:id="59" w:name="_Toc183095463"/>
-      <w:bookmarkStart w:id="60" w:name="_Toc183099249"/>
-      <w:bookmarkStart w:id="61" w:name="_Toc183100540"/>
-      <w:bookmarkStart w:id="62" w:name="_Toc183095013"/>
-      <w:bookmarkStart w:id="63" w:name="_Toc183095119"/>
-      <w:bookmarkStart w:id="64" w:name="_Toc183095464"/>
-      <w:bookmarkStart w:id="65" w:name="_Toc183099250"/>
-      <w:bookmarkStart w:id="66" w:name="_Toc183100541"/>
-      <w:bookmarkStart w:id="67" w:name="_Toc183095014"/>
-      <w:bookmarkStart w:id="68" w:name="_Toc183095120"/>
-      <w:bookmarkStart w:id="69" w:name="_Toc183095465"/>
-      <w:bookmarkStart w:id="70" w:name="_Toc183099251"/>
-      <w:bookmarkStart w:id="71" w:name="_Toc183100542"/>
-      <w:bookmarkStart w:id="72" w:name="_Toc183095015"/>
-      <w:bookmarkStart w:id="73" w:name="_Toc183095121"/>
-      <w:bookmarkStart w:id="74" w:name="_Toc183095466"/>
-      <w:bookmarkStart w:id="75" w:name="_Toc183099252"/>
-      <w:bookmarkStart w:id="76" w:name="_Toc183100543"/>
-      <w:bookmarkStart w:id="77" w:name="_Toc183095016"/>
-      <w:bookmarkStart w:id="78" w:name="_Toc183095122"/>
-      <w:bookmarkStart w:id="79" w:name="_Toc183095467"/>
-      <w:bookmarkStart w:id="80" w:name="_Toc183099253"/>
-      <w:bookmarkStart w:id="81" w:name="_Toc183100544"/>
-      <w:bookmarkStart w:id="82" w:name="_Toc183095017"/>
-      <w:bookmarkStart w:id="83" w:name="_Toc183095123"/>
-      <w:bookmarkStart w:id="84" w:name="_Toc183095468"/>
-      <w:bookmarkStart w:id="85" w:name="_Toc183099254"/>
-      <w:bookmarkStart w:id="86" w:name="_Toc183100545"/>
-      <w:bookmarkStart w:id="87" w:name="_Toc183095018"/>
-      <w:bookmarkStart w:id="88" w:name="_Toc183095124"/>
-      <w:bookmarkStart w:id="89" w:name="_Toc183095469"/>
-      <w:bookmarkStart w:id="90" w:name="_Toc183099255"/>
-      <w:bookmarkStart w:id="91" w:name="_Toc183100546"/>
-      <w:bookmarkStart w:id="92" w:name="_Toc183099256"/>
-      <w:bookmarkStart w:id="93" w:name="_Toc185323542"/>
-      <w:bookmarkEnd w:id="55"/>
-      <w:bookmarkEnd w:id="56"/>
-      <w:bookmarkEnd w:id="57"/>
-      <w:bookmarkEnd w:id="58"/>
+      <w:bookmarkStart w:id="59" w:name="_Toc185323540"/>
+      <w:bookmarkStart w:id="60" w:name="_Toc185323541"/>
+      <w:bookmarkStart w:id="61" w:name="_Toc183095012"/>
+      <w:bookmarkStart w:id="62" w:name="_Toc183095118"/>
+      <w:bookmarkStart w:id="63" w:name="_Toc183095463"/>
+      <w:bookmarkStart w:id="64" w:name="_Toc183099249"/>
+      <w:bookmarkStart w:id="65" w:name="_Toc183100540"/>
+      <w:bookmarkStart w:id="66" w:name="_Toc183095013"/>
+      <w:bookmarkStart w:id="67" w:name="_Toc183095119"/>
+      <w:bookmarkStart w:id="68" w:name="_Toc183095464"/>
+      <w:bookmarkStart w:id="69" w:name="_Toc183099250"/>
+      <w:bookmarkStart w:id="70" w:name="_Toc183100541"/>
+      <w:bookmarkStart w:id="71" w:name="_Toc183095014"/>
+      <w:bookmarkStart w:id="72" w:name="_Toc183095120"/>
+      <w:bookmarkStart w:id="73" w:name="_Toc183095465"/>
+      <w:bookmarkStart w:id="74" w:name="_Toc183099251"/>
+      <w:bookmarkStart w:id="75" w:name="_Toc183100542"/>
+      <w:bookmarkStart w:id="76" w:name="_Toc183095015"/>
+      <w:bookmarkStart w:id="77" w:name="_Toc183095121"/>
+      <w:bookmarkStart w:id="78" w:name="_Toc183095466"/>
+      <w:bookmarkStart w:id="79" w:name="_Toc183099252"/>
+      <w:bookmarkStart w:id="80" w:name="_Toc183100543"/>
+      <w:bookmarkStart w:id="81" w:name="_Toc183095016"/>
+      <w:bookmarkStart w:id="82" w:name="_Toc183095122"/>
+      <w:bookmarkStart w:id="83" w:name="_Toc183095467"/>
+      <w:bookmarkStart w:id="84" w:name="_Toc183099253"/>
+      <w:bookmarkStart w:id="85" w:name="_Toc183100544"/>
+      <w:bookmarkStart w:id="86" w:name="_Toc183095017"/>
+      <w:bookmarkStart w:id="87" w:name="_Toc183095123"/>
+      <w:bookmarkStart w:id="88" w:name="_Toc183095468"/>
+      <w:bookmarkStart w:id="89" w:name="_Toc183099254"/>
+      <w:bookmarkStart w:id="90" w:name="_Toc183100545"/>
+      <w:bookmarkStart w:id="91" w:name="_Toc183095018"/>
+      <w:bookmarkStart w:id="92" w:name="_Toc183095124"/>
+      <w:bookmarkStart w:id="93" w:name="_Toc183095469"/>
+      <w:bookmarkStart w:id="94" w:name="_Toc183099255"/>
+      <w:bookmarkStart w:id="95" w:name="_Toc183100546"/>
+      <w:bookmarkStart w:id="96" w:name="_Toc183099256"/>
+      <w:bookmarkStart w:id="97" w:name="_Toc185323542"/>
       <w:bookmarkEnd w:id="59"/>
       <w:bookmarkEnd w:id="60"/>
       <w:bookmarkEnd w:id="61"/>
@@ -9008,18 +9571,23 @@
       <w:bookmarkEnd w:id="89"/>
       <w:bookmarkEnd w:id="90"/>
       <w:bookmarkEnd w:id="91"/>
-      <w:r>
-        <w:t>Data analysis plan – Data description</w:t>
-      </w:r>
       <w:bookmarkEnd w:id="92"/>
       <w:bookmarkEnd w:id="93"/>
+      <w:bookmarkEnd w:id="94"/>
+      <w:bookmarkEnd w:id="95"/>
+      <w:r>
+        <w:lastRenderedPageBreak/>
+        <w:t>Data analysis plan – Data description</w:t>
+      </w:r>
+      <w:bookmarkEnd w:id="96"/>
+      <w:bookmarkEnd w:id="97"/>
       <w:r>
         <w:fldChar w:fldCharType="begin"/>
       </w:r>
       <w:r>
         <w:instrText xml:space="preserve"> TC "</w:instrText>
       </w:r>
-      <w:bookmarkStart w:id="94" w:name="_Toc183094431"/>
+      <w:bookmarkStart w:id="98" w:name="_Toc183094431"/>
       <w:r>
         <w:instrText>2.</w:instrText>
       </w:r>
@@ -9027,7 +9595,7 @@
         <w:tab/>
         <w:instrText>Data analysis plan – Data description</w:instrText>
       </w:r>
-      <w:bookmarkEnd w:id="94"/>
+      <w:bookmarkEnd w:id="98"/>
       <w:r>
         <w:instrText xml:space="preserve">" \f C \l "1" </w:instrText>
       </w:r>
@@ -9039,20 +9607,20 @@
       <w:pPr>
         <w:pStyle w:val="Heading2"/>
       </w:pPr>
-      <w:bookmarkStart w:id="95" w:name="_Toc183099257"/>
-      <w:bookmarkStart w:id="96" w:name="_Toc185323543"/>
+      <w:bookmarkStart w:id="99" w:name="_Toc183099257"/>
+      <w:bookmarkStart w:id="100" w:name="_Toc185323543"/>
       <w:r>
         <w:t>Recruitment and representativeness of recruited patients</w:t>
       </w:r>
-      <w:bookmarkEnd w:id="95"/>
-      <w:bookmarkEnd w:id="96"/>
+      <w:bookmarkEnd w:id="99"/>
+      <w:bookmarkEnd w:id="100"/>
       <w:r>
         <w:fldChar w:fldCharType="begin"/>
       </w:r>
       <w:r>
         <w:instrText xml:space="preserve"> TC "</w:instrText>
       </w:r>
-      <w:bookmarkStart w:id="97" w:name="_Toc183094432"/>
+      <w:bookmarkStart w:id="101" w:name="_Toc183094432"/>
       <w:r>
         <w:instrText>2.1</w:instrText>
       </w:r>
@@ -9060,7 +9628,7 @@
         <w:tab/>
         <w:instrText>Recruitment and representativeness of recruited patients</w:instrText>
       </w:r>
-      <w:bookmarkEnd w:id="97"/>
+      <w:bookmarkEnd w:id="101"/>
       <w:r>
         <w:instrText xml:space="preserve">" \f C \l "1" </w:instrText>
       </w:r>
@@ -9102,7 +9670,23 @@
           <w:sz w:val="22"/>
           <w:szCs w:val="22"/>
         </w:rPr>
-        <w:t xml:space="preserve"> – see Figure 2.  This will include the number of eligible patients, number of patients agreeing to enter the trial, number of patients refusing, then by treatment arm: the number of patients not/inadequately/adequately treated OR compliant/non-compliant, the number continuing through the trial, the number withdrawing, the number lost to follow-up and the numbers excluded/analysed.</w:t>
+        <w:t xml:space="preserve"> – see Figure 2.  This will include the number of eligible patients, number of patients agreeing to enter the trial, number of patients refusing, then by treatment arm: the number of patients not/inadequately/adequately treated OR compliant/non-compliant, the number continuing through the trial, the number withdrawing, the number lost to follow-up and the numbers excluded/</w:t>
+      </w:r>
+      <w:proofErr w:type="spellStart"/>
+      <w:r>
+        <w:rPr>
+          <w:sz w:val="22"/>
+          <w:szCs w:val="22"/>
+        </w:rPr>
+        <w:t>analysed</w:t>
+      </w:r>
+      <w:proofErr w:type="spellEnd"/>
+      <w:r>
+        <w:rPr>
+          <w:sz w:val="22"/>
+          <w:szCs w:val="22"/>
+        </w:rPr>
+        <w:t>.</w:t>
       </w:r>
     </w:p>
     <w:p>
@@ -9185,11 +9769,11 @@
       <w:r>
         <w:instrText xml:space="preserve"> TC "</w:instrText>
       </w:r>
-      <w:bookmarkStart w:id="98" w:name="_Toc183094433"/>
+      <w:bookmarkStart w:id="102" w:name="_Toc183094433"/>
       <w:r>
         <w:instrText>Figure 2.  Template CONSORT diagram for ACRONYM trial</w:instrText>
       </w:r>
-      <w:bookmarkEnd w:id="98"/>
+      <w:bookmarkEnd w:id="102"/>
       <w:r>
         <w:instrText xml:space="preserve">" \f C \l "1" </w:instrText>
       </w:r>
@@ -9208,21 +9792,21 @@
       <w:r>
         <w:br w:type="page"/>
       </w:r>
-      <w:bookmarkStart w:id="99" w:name="_Toc183099258"/>
-      <w:bookmarkStart w:id="100" w:name="_Toc185323544"/>
+      <w:bookmarkStart w:id="103" w:name="_Toc183099258"/>
+      <w:bookmarkStart w:id="104" w:name="_Toc185323544"/>
       <w:r>
         <w:lastRenderedPageBreak/>
         <w:t>Baseline comparability of randomised groups</w:t>
       </w:r>
-      <w:bookmarkEnd w:id="99"/>
-      <w:bookmarkEnd w:id="100"/>
+      <w:bookmarkEnd w:id="103"/>
+      <w:bookmarkEnd w:id="104"/>
       <w:r>
         <w:fldChar w:fldCharType="begin"/>
       </w:r>
       <w:r>
         <w:instrText xml:space="preserve"> TC "</w:instrText>
       </w:r>
-      <w:bookmarkStart w:id="101" w:name="_Toc183094434"/>
+      <w:bookmarkStart w:id="105" w:name="_Toc183094434"/>
       <w:r>
         <w:instrText>2.2</w:instrText>
       </w:r>
@@ -9230,7 +9814,7 @@
         <w:tab/>
         <w:instrText>Baseline comparability of randomised groups</w:instrText>
       </w:r>
-      <w:bookmarkEnd w:id="101"/>
+      <w:bookmarkEnd w:id="105"/>
       <w:r>
         <w:instrText xml:space="preserve">" \f C \l "1" </w:instrText>
       </w:r>
@@ -9260,15 +9844,15 @@
       <w:pPr>
         <w:pStyle w:val="Heading2"/>
       </w:pPr>
-      <w:bookmarkStart w:id="102" w:name="_Toc185323545"/>
-      <w:bookmarkStart w:id="103" w:name="_Toc183099259"/>
-      <w:bookmarkStart w:id="104" w:name="_Toc185323546"/>
-      <w:bookmarkEnd w:id="102"/>
+      <w:bookmarkStart w:id="106" w:name="_Toc185323545"/>
+      <w:bookmarkStart w:id="107" w:name="_Toc183099259"/>
+      <w:bookmarkStart w:id="108" w:name="_Toc185323546"/>
+      <w:bookmarkEnd w:id="106"/>
       <w:r>
         <w:t>Adherence to allocated treatment and treatment fidelity</w:t>
       </w:r>
-      <w:bookmarkEnd w:id="103"/>
-      <w:bookmarkEnd w:id="104"/>
+      <w:bookmarkEnd w:id="107"/>
+      <w:bookmarkEnd w:id="108"/>
     </w:p>
     <w:p>
       <w:pPr>
@@ -9308,19 +9892,19 @@
       <w:pPr>
         <w:pStyle w:val="Heading2"/>
       </w:pPr>
-      <w:bookmarkStart w:id="105" w:name="_Toc183099260"/>
-      <w:bookmarkStart w:id="106" w:name="_Toc185323547"/>
+      <w:bookmarkStart w:id="109" w:name="_Toc183099260"/>
+      <w:bookmarkStart w:id="110" w:name="_Toc185323547"/>
       <w:r>
         <w:t xml:space="preserve">Loss to follow-up and other missing </w:t>
       </w:r>
-      <w:commentRangeStart w:id="107"/>
-      <w:commentRangeStart w:id="108"/>
+      <w:commentRangeStart w:id="111"/>
+      <w:commentRangeStart w:id="112"/>
       <w:r>
         <w:t>data</w:t>
       </w:r>
-      <w:bookmarkEnd w:id="105"/>
-      <w:bookmarkEnd w:id="106"/>
-      <w:commentRangeEnd w:id="107"/>
+      <w:bookmarkEnd w:id="109"/>
+      <w:bookmarkEnd w:id="110"/>
+      <w:commentRangeEnd w:id="111"/>
       <w:r>
         <w:rPr>
           <w:rStyle w:val="CommentReference"/>
@@ -9329,9 +9913,9 @@
           <w:u w:val="none"/>
           <w:lang w:val="en-US"/>
         </w:rPr>
-        <w:commentReference w:id="107"/>
-      </w:r>
-      <w:commentRangeEnd w:id="108"/>
+        <w:commentReference w:id="111"/>
+      </w:r>
+      <w:commentRangeEnd w:id="112"/>
       <w:r>
         <w:rPr>
           <w:rStyle w:val="CommentReference"/>
@@ -9340,7 +9924,7 @@
           <w:u w:val="none"/>
           <w:lang w:val="en-US"/>
         </w:rPr>
-        <w:commentReference w:id="108"/>
+        <w:commentReference w:id="112"/>
       </w:r>
       <w:r>
         <w:fldChar w:fldCharType="begin"/>
@@ -9348,7 +9932,7 @@
       <w:r>
         <w:instrText xml:space="preserve"> TC "</w:instrText>
       </w:r>
-      <w:bookmarkStart w:id="109" w:name="_Toc183094436"/>
+      <w:bookmarkStart w:id="113" w:name="_Toc183094436"/>
       <w:r>
         <w:instrText>2.4</w:instrText>
       </w:r>
@@ -9356,7 +9940,7 @@
         <w:tab/>
         <w:instrText>Loss to follow-up and other missing data</w:instrText>
       </w:r>
-      <w:bookmarkEnd w:id="109"/>
+      <w:bookmarkEnd w:id="113"/>
       <w:r>
         <w:instrText xml:space="preserve">" \f C \l "1" </w:instrText>
       </w:r>
@@ -9366,7 +9950,15 @@
     </w:p>
     <w:p>
       <w:r>
-        <w:t xml:space="preserve">The proportions of participants missing each variable will be summarised in each arm and at each time point.  </w:t>
+        <w:t xml:space="preserve">The proportions of participants missing each variable will be </w:t>
+      </w:r>
+      <w:proofErr w:type="spellStart"/>
+      <w:r>
+        <w:t>summarised</w:t>
+      </w:r>
+      <w:proofErr w:type="spellEnd"/>
+      <w:r>
+        <w:t xml:space="preserve"> in each arm and at each time point.  </w:t>
       </w:r>
     </w:p>
     <w:p/>
@@ -9384,7 +9976,15 @@
         <w:t>data collection</w:t>
       </w:r>
       <w:r>
-        <w:t xml:space="preserve"> will be summarised.</w:t>
+        <w:t xml:space="preserve"> will be </w:t>
+      </w:r>
+      <w:proofErr w:type="spellStart"/>
+      <w:r>
+        <w:t>summarised</w:t>
+      </w:r>
+      <w:proofErr w:type="spellEnd"/>
+      <w:r>
+        <w:t>.</w:t>
       </w:r>
     </w:p>
     <w:p/>
@@ -9392,11 +9992,11 @@
       <w:pPr>
         <w:pStyle w:val="Heading2"/>
       </w:pPr>
-      <w:bookmarkStart w:id="110" w:name="_Toc185323548"/>
+      <w:bookmarkStart w:id="114" w:name="_Toc185323548"/>
       <w:r>
         <w:t>Harms</w:t>
       </w:r>
-      <w:bookmarkEnd w:id="110"/>
+      <w:bookmarkEnd w:id="114"/>
     </w:p>
     <w:p>
       <w:pPr>
@@ -9573,7 +10173,15 @@
     </w:p>
     <w:p>
       <w:r>
-        <w:t>Adverse events and serious adverse events will be summarised by arm and overall. If body system categories have been defined, the number of events and the number of unique reporters for each body system category will be reported. Consideration will be given to visual summaries of event categories (i.e. dot plots).</w:t>
+        <w:t xml:space="preserve">Adverse events and serious adverse events will be </w:t>
+      </w:r>
+      <w:proofErr w:type="spellStart"/>
+      <w:r>
+        <w:t>summarised</w:t>
+      </w:r>
+      <w:proofErr w:type="spellEnd"/>
+      <w:r>
+        <w:t xml:space="preserve"> by arm and overall. If body system categories have been defined, the number of events and the number of unique reporters for each body system category will be reported. Consideration will be given to visual summaries of event categories (i.e. dot plots).</w:t>
       </w:r>
     </w:p>
     <w:p/>
@@ -9581,22 +10189,22 @@
       <w:pPr>
         <w:pStyle w:val="Heading2"/>
       </w:pPr>
-      <w:bookmarkStart w:id="111" w:name="_Toc185323549"/>
-      <w:bookmarkStart w:id="112" w:name="_Toc185323550"/>
-      <w:bookmarkStart w:id="113" w:name="_Toc185323551"/>
-      <w:bookmarkStart w:id="114" w:name="_Toc183099262"/>
-      <w:bookmarkStart w:id="115" w:name="_Toc185323552"/>
-      <w:bookmarkEnd w:id="111"/>
-      <w:bookmarkEnd w:id="112"/>
-      <w:bookmarkEnd w:id="113"/>
+      <w:bookmarkStart w:id="115" w:name="_Toc185323549"/>
+      <w:bookmarkStart w:id="116" w:name="_Toc185323550"/>
+      <w:bookmarkStart w:id="117" w:name="_Toc185323551"/>
+      <w:bookmarkStart w:id="118" w:name="_Toc183099262"/>
+      <w:bookmarkStart w:id="119" w:name="_Toc185323552"/>
+      <w:bookmarkEnd w:id="115"/>
+      <w:bookmarkEnd w:id="116"/>
+      <w:bookmarkEnd w:id="117"/>
       <w:r>
         <w:t>Assessment of outcome measures (</w:t>
       </w:r>
-      <w:commentRangeStart w:id="116"/>
+      <w:commentRangeStart w:id="120"/>
       <w:r>
         <w:t>unblinding</w:t>
       </w:r>
-      <w:commentRangeEnd w:id="116"/>
+      <w:commentRangeEnd w:id="120"/>
       <w:r>
         <w:rPr>
           <w:rStyle w:val="CommentReference"/>
@@ -9605,20 +10213,20 @@
           <w:u w:val="none"/>
           <w:lang w:val="en-US"/>
         </w:rPr>
-        <w:commentReference w:id="116"/>
+        <w:commentReference w:id="120"/>
       </w:r>
       <w:r>
         <w:t>)</w:t>
       </w:r>
-      <w:bookmarkEnd w:id="114"/>
-      <w:bookmarkEnd w:id="115"/>
+      <w:bookmarkEnd w:id="118"/>
+      <w:bookmarkEnd w:id="119"/>
       <w:r>
         <w:fldChar w:fldCharType="begin"/>
       </w:r>
       <w:r>
         <w:instrText xml:space="preserve"> TC "</w:instrText>
       </w:r>
-      <w:bookmarkStart w:id="117" w:name="_Toc183094438"/>
+      <w:bookmarkStart w:id="121" w:name="_Toc183094438"/>
       <w:r>
         <w:instrText>2.6</w:instrText>
       </w:r>
@@ -9626,7 +10234,7 @@
         <w:tab/>
         <w:instrText>Assessment of outcome measures (unblinding)</w:instrText>
       </w:r>
-      <w:bookmarkEnd w:id="117"/>
+      <w:bookmarkEnd w:id="121"/>
       <w:r>
         <w:instrText xml:space="preserve">" \f C \l "1" </w:instrText>
       </w:r>
@@ -9655,21 +10263,20 @@
       <w:pPr>
         <w:pStyle w:val="Heading2"/>
       </w:pPr>
-      <w:bookmarkStart w:id="118" w:name="_Toc183099263"/>
-      <w:bookmarkStart w:id="119" w:name="_Toc185323553"/>
-      <w:r>
-        <w:lastRenderedPageBreak/>
+      <w:bookmarkStart w:id="122" w:name="_Toc183099263"/>
+      <w:bookmarkStart w:id="123" w:name="_Toc185323553"/>
+      <w:r>
         <w:t>Descriptive statistics for outcome measures</w:t>
       </w:r>
-      <w:bookmarkEnd w:id="118"/>
-      <w:bookmarkEnd w:id="119"/>
+      <w:bookmarkEnd w:id="122"/>
+      <w:bookmarkEnd w:id="123"/>
       <w:r>
         <w:fldChar w:fldCharType="begin"/>
       </w:r>
       <w:r>
         <w:instrText xml:space="preserve"> TC "</w:instrText>
       </w:r>
-      <w:bookmarkStart w:id="120" w:name="_Toc183094439"/>
+      <w:bookmarkStart w:id="124" w:name="_Toc183094439"/>
       <w:r>
         <w:instrText>2.7</w:instrText>
       </w:r>
@@ -9677,7 +10284,7 @@
         <w:tab/>
         <w:instrText>Descriptive statistics for outcome measures</w:instrText>
       </w:r>
-      <w:bookmarkEnd w:id="120"/>
+      <w:bookmarkEnd w:id="124"/>
       <w:r>
         <w:instrText xml:space="preserve">" \f C \l "1" </w:instrText>
       </w:r>
@@ -9703,7 +10310,15 @@
     </w:p>
     <w:p>
       <w:r>
-        <w:t xml:space="preserve">Questionnaire outcome measures will be summarised descriptively by arm and </w:t>
+        <w:t xml:space="preserve">Questionnaire outcome measures will be </w:t>
+      </w:r>
+      <w:proofErr w:type="spellStart"/>
+      <w:r>
+        <w:t>summarised</w:t>
+      </w:r>
+      <w:proofErr w:type="spellEnd"/>
+      <w:r>
+        <w:t xml:space="preserve"> descriptively by arm and </w:t>
       </w:r>
       <w:proofErr w:type="gramStart"/>
       <w:r>
@@ -9711,7 +10326,27 @@
       </w:r>
       <w:proofErr w:type="gramEnd"/>
       <w:r>
-        <w:t xml:space="preserve"> at each timepoint. The number of participants with missing outcomes at each timepoint will be noted. Continuous outcomes will be summarised using means and standard deviations (or medians and interquartile ranges if skewed). Categorical outcomes will be summarised using frequencies and proportions.</w:t>
+        <w:t xml:space="preserve"> at each timepoint. The number of participants with missing outcomes at each timepoint will be noted. Continuous outcomes will be </w:t>
+      </w:r>
+      <w:proofErr w:type="spellStart"/>
+      <w:r>
+        <w:t>summarised</w:t>
+      </w:r>
+      <w:proofErr w:type="spellEnd"/>
+      <w:r>
+        <w:t xml:space="preserve"> using means and standard deviations (or medians and </w:t>
+      </w:r>
+      <w:r>
+        <w:lastRenderedPageBreak/>
+        <w:t xml:space="preserve">interquartile ranges if skewed). Categorical outcomes will be </w:t>
+      </w:r>
+      <w:proofErr w:type="spellStart"/>
+      <w:r>
+        <w:t>summarised</w:t>
+      </w:r>
+      <w:proofErr w:type="spellEnd"/>
+      <w:r>
+        <w:t xml:space="preserve"> using frequencies and proportions.</w:t>
       </w:r>
     </w:p>
     <w:p>
@@ -9734,25 +10369,41 @@
           <w:i/>
           <w:iCs/>
         </w:rPr>
-        <w:t>: Time to event outcomes will be summarised using median survival and 95% Cis, survival plots will be produced.</w:t>
+        <w:t xml:space="preserve">: Time to event outcomes will be </w:t>
+      </w:r>
+      <w:proofErr w:type="spellStart"/>
+      <w:r>
+        <w:rPr>
+          <w:i/>
+          <w:iCs/>
+        </w:rPr>
+        <w:t>summarised</w:t>
+      </w:r>
+      <w:proofErr w:type="spellEnd"/>
+      <w:r>
+        <w:rPr>
+          <w:i/>
+          <w:iCs/>
+        </w:rPr>
+        <w:t xml:space="preserve"> using median survival and 95% Cis, survival plots will be produced.</w:t>
       </w:r>
     </w:p>
     <w:p>
       <w:pPr>
         <w:pStyle w:val="Heading2"/>
       </w:pPr>
-      <w:bookmarkStart w:id="121" w:name="_Toc185323554"/>
-      <w:bookmarkStart w:id="122" w:name="_Toc183099264"/>
-      <w:bookmarkStart w:id="123" w:name="_Toc185323555"/>
-      <w:bookmarkEnd w:id="121"/>
+      <w:bookmarkStart w:id="125" w:name="_Toc185323554"/>
+      <w:bookmarkStart w:id="126" w:name="_Toc183099264"/>
+      <w:bookmarkStart w:id="127" w:name="_Toc185323555"/>
+      <w:bookmarkEnd w:id="125"/>
       <w:r>
         <w:t>Descripti</w:t>
       </w:r>
       <w:r>
         <w:t>ves</w:t>
       </w:r>
-      <w:bookmarkEnd w:id="122"/>
-      <w:bookmarkEnd w:id="123"/>
+      <w:bookmarkEnd w:id="126"/>
+      <w:bookmarkEnd w:id="127"/>
       <w:r>
         <w:t xml:space="preserve"> of </w:t>
       </w:r>
@@ -9883,7 +10534,15 @@
     <w:p/>
     <w:p>
       <w:r>
-        <w:t>{{descriptive_of_intervention}}</w:t>
+        <w:t>{{</w:t>
+      </w:r>
+      <w:proofErr w:type="spellStart"/>
+      <w:r>
+        <w:t>descriptive_of_intervention</w:t>
+      </w:r>
+      <w:proofErr w:type="spellEnd"/>
+      <w:r>
+        <w:t>}}</w:t>
       </w:r>
     </w:p>
     <w:p/>
@@ -9938,7 +10597,15 @@
     </w:p>
     <w:p>
       <w:r>
-        <w:t>{{descriptive_concomitant_medications}}</w:t>
+        <w:t>{{</w:t>
+      </w:r>
+      <w:proofErr w:type="spellStart"/>
+      <w:r>
+        <w:t>descriptive_concomitant_medications</w:t>
+      </w:r>
+      <w:proofErr w:type="spellEnd"/>
+      <w:r>
+        <w:t>}}</w:t>
       </w:r>
     </w:p>
     <w:p>
@@ -9952,13 +10619,13 @@
       <w:pPr>
         <w:pStyle w:val="Heading2"/>
       </w:pPr>
-      <w:bookmarkStart w:id="124" w:name="_Toc183099265"/>
-      <w:bookmarkStart w:id="125" w:name="_Toc185323556"/>
+      <w:bookmarkStart w:id="128" w:name="_Toc183099265"/>
+      <w:bookmarkStart w:id="129" w:name="_Toc185323556"/>
       <w:r>
         <w:t>Protocol deviations/violations</w:t>
       </w:r>
-      <w:bookmarkEnd w:id="124"/>
-      <w:bookmarkEnd w:id="125"/>
+      <w:bookmarkEnd w:id="128"/>
+      <w:bookmarkEnd w:id="129"/>
     </w:p>
     <w:p>
       <w:pPr>
@@ -9977,6 +10644,7 @@
         </w:rPr>
         <w:t xml:space="preserve">A protocol deviation/violation is defined as any excursion from the protocol. Examples of possible protocol deviations/violations include participants who do not meet the eligibility criteria and are </w:t>
       </w:r>
+      <w:proofErr w:type="spellStart"/>
       <w:proofErr w:type="gramStart"/>
       <w:r>
         <w:rPr>
@@ -9986,6 +10654,7 @@
         </w:rPr>
         <w:t>randomised</w:t>
       </w:r>
+      <w:proofErr w:type="spellEnd"/>
       <w:proofErr w:type="gramEnd"/>
       <w:r>
         <w:rPr>
@@ -10131,13 +10800,18 @@
       <w:r>
         <w:t>{{</w:t>
       </w:r>
+      <w:proofErr w:type="spellStart"/>
       <w:proofErr w:type="gramEnd"/>
       <w:r>
         <w:t>visit_window_</w:t>
       </w:r>
       <w:proofErr w:type="gramStart"/>
       <w:r>
-        <w:t>deviation}}</w:t>
+        <w:t>deviation</w:t>
+      </w:r>
+      <w:proofErr w:type="spellEnd"/>
+      <w:r>
+        <w:t>}}</w:t>
       </w:r>
       <w:r>
         <w:rPr>
@@ -10154,7 +10828,6 @@
     <w:p/>
     <w:p>
       <w:r>
-        <w:lastRenderedPageBreak/>
         <w:t xml:space="preserve">All protocol violations will be reported to the DMEC as well as any excursions for which the trial team are unsure if </w:t>
       </w:r>
       <w:proofErr w:type="gramStart"/>
@@ -10177,47 +10850,43 @@
       <w:pPr>
         <w:pStyle w:val="Heading1"/>
       </w:pPr>
-      <w:bookmarkStart w:id="126" w:name="_Toc183095029"/>
-      <w:bookmarkStart w:id="127" w:name="_Toc183095135"/>
-      <w:bookmarkStart w:id="128" w:name="_Toc183095480"/>
-      <w:bookmarkStart w:id="129" w:name="_Toc183099266"/>
-      <w:bookmarkStart w:id="130" w:name="_Toc183100557"/>
-      <w:bookmarkStart w:id="131" w:name="_Toc183095030"/>
-      <w:bookmarkStart w:id="132" w:name="_Toc183095136"/>
-      <w:bookmarkStart w:id="133" w:name="_Toc183095481"/>
-      <w:bookmarkStart w:id="134" w:name="_Toc183099267"/>
-      <w:bookmarkStart w:id="135" w:name="_Toc183100558"/>
-      <w:bookmarkStart w:id="136" w:name="_Toc183095031"/>
-      <w:bookmarkStart w:id="137" w:name="_Toc183095137"/>
-      <w:bookmarkStart w:id="138" w:name="_Toc183095482"/>
-      <w:bookmarkStart w:id="139" w:name="_Toc183099268"/>
-      <w:bookmarkStart w:id="140" w:name="_Toc183100559"/>
-      <w:bookmarkStart w:id="141" w:name="_Toc183095032"/>
-      <w:bookmarkStart w:id="142" w:name="_Toc183095138"/>
-      <w:bookmarkStart w:id="143" w:name="_Toc183095483"/>
-      <w:bookmarkStart w:id="144" w:name="_Toc183099269"/>
-      <w:bookmarkStart w:id="145" w:name="_Toc183100560"/>
-      <w:bookmarkStart w:id="146" w:name="_Toc183095033"/>
-      <w:bookmarkStart w:id="147" w:name="_Toc183095139"/>
-      <w:bookmarkStart w:id="148" w:name="_Toc183095484"/>
-      <w:bookmarkStart w:id="149" w:name="_Toc183099270"/>
-      <w:bookmarkStart w:id="150" w:name="_Toc183100561"/>
-      <w:bookmarkStart w:id="151" w:name="_Toc183095034"/>
-      <w:bookmarkStart w:id="152" w:name="_Toc183095140"/>
-      <w:bookmarkStart w:id="153" w:name="_Toc183095485"/>
-      <w:bookmarkStart w:id="154" w:name="_Toc183099271"/>
-      <w:bookmarkStart w:id="155" w:name="_Toc183100562"/>
-      <w:bookmarkStart w:id="156" w:name="_Toc183095035"/>
-      <w:bookmarkStart w:id="157" w:name="_Toc183095141"/>
-      <w:bookmarkStart w:id="158" w:name="_Toc183095486"/>
-      <w:bookmarkStart w:id="159" w:name="_Toc183099272"/>
-      <w:bookmarkStart w:id="160" w:name="_Toc183100563"/>
-      <w:bookmarkStart w:id="161" w:name="_Toc183099273"/>
-      <w:bookmarkStart w:id="162" w:name="_Toc185323557"/>
-      <w:bookmarkEnd w:id="126"/>
-      <w:bookmarkEnd w:id="127"/>
-      <w:bookmarkEnd w:id="128"/>
-      <w:bookmarkEnd w:id="129"/>
+      <w:bookmarkStart w:id="130" w:name="_Toc183095029"/>
+      <w:bookmarkStart w:id="131" w:name="_Toc183095135"/>
+      <w:bookmarkStart w:id="132" w:name="_Toc183095480"/>
+      <w:bookmarkStart w:id="133" w:name="_Toc183099266"/>
+      <w:bookmarkStart w:id="134" w:name="_Toc183100557"/>
+      <w:bookmarkStart w:id="135" w:name="_Toc183095030"/>
+      <w:bookmarkStart w:id="136" w:name="_Toc183095136"/>
+      <w:bookmarkStart w:id="137" w:name="_Toc183095481"/>
+      <w:bookmarkStart w:id="138" w:name="_Toc183099267"/>
+      <w:bookmarkStart w:id="139" w:name="_Toc183100558"/>
+      <w:bookmarkStart w:id="140" w:name="_Toc183095031"/>
+      <w:bookmarkStart w:id="141" w:name="_Toc183095137"/>
+      <w:bookmarkStart w:id="142" w:name="_Toc183095482"/>
+      <w:bookmarkStart w:id="143" w:name="_Toc183099268"/>
+      <w:bookmarkStart w:id="144" w:name="_Toc183100559"/>
+      <w:bookmarkStart w:id="145" w:name="_Toc183095032"/>
+      <w:bookmarkStart w:id="146" w:name="_Toc183095138"/>
+      <w:bookmarkStart w:id="147" w:name="_Toc183095483"/>
+      <w:bookmarkStart w:id="148" w:name="_Toc183099269"/>
+      <w:bookmarkStart w:id="149" w:name="_Toc183100560"/>
+      <w:bookmarkStart w:id="150" w:name="_Toc183095033"/>
+      <w:bookmarkStart w:id="151" w:name="_Toc183095139"/>
+      <w:bookmarkStart w:id="152" w:name="_Toc183095484"/>
+      <w:bookmarkStart w:id="153" w:name="_Toc183099270"/>
+      <w:bookmarkStart w:id="154" w:name="_Toc183100561"/>
+      <w:bookmarkStart w:id="155" w:name="_Toc183095034"/>
+      <w:bookmarkStart w:id="156" w:name="_Toc183095140"/>
+      <w:bookmarkStart w:id="157" w:name="_Toc183095485"/>
+      <w:bookmarkStart w:id="158" w:name="_Toc183099271"/>
+      <w:bookmarkStart w:id="159" w:name="_Toc183100562"/>
+      <w:bookmarkStart w:id="160" w:name="_Toc183095035"/>
+      <w:bookmarkStart w:id="161" w:name="_Toc183095141"/>
+      <w:bookmarkStart w:id="162" w:name="_Toc183095486"/>
+      <w:bookmarkStart w:id="163" w:name="_Toc183099272"/>
+      <w:bookmarkStart w:id="164" w:name="_Toc183100563"/>
+      <w:bookmarkStart w:id="165" w:name="_Toc183099273"/>
+      <w:bookmarkStart w:id="166" w:name="_Toc185323557"/>
       <w:bookmarkEnd w:id="130"/>
       <w:bookmarkEnd w:id="131"/>
       <w:bookmarkEnd w:id="132"/>
@@ -10249,19 +10918,23 @@
       <w:bookmarkEnd w:id="158"/>
       <w:bookmarkEnd w:id="159"/>
       <w:bookmarkEnd w:id="160"/>
+      <w:bookmarkEnd w:id="161"/>
+      <w:bookmarkEnd w:id="162"/>
+      <w:bookmarkEnd w:id="163"/>
+      <w:bookmarkEnd w:id="164"/>
       <w:r>
         <w:lastRenderedPageBreak/>
         <w:t>Data analysis plan – Inferential analysis</w:t>
       </w:r>
-      <w:bookmarkEnd w:id="161"/>
-      <w:bookmarkEnd w:id="162"/>
+      <w:bookmarkEnd w:id="165"/>
+      <w:bookmarkEnd w:id="166"/>
       <w:r>
         <w:fldChar w:fldCharType="begin"/>
       </w:r>
       <w:r>
         <w:instrText xml:space="preserve"> TC "</w:instrText>
       </w:r>
-      <w:bookmarkStart w:id="163" w:name="_Toc183094441"/>
+      <w:bookmarkStart w:id="167" w:name="_Toc183094441"/>
       <w:r>
         <w:instrText>3.</w:instrText>
       </w:r>
@@ -10269,7 +10942,7 @@
         <w:tab/>
         <w:instrText>Data analysis plan – Inferential analysis</w:instrText>
       </w:r>
-      <w:bookmarkEnd w:id="163"/>
+      <w:bookmarkEnd w:id="167"/>
       <w:r>
         <w:instrText xml:space="preserve">" \f C \l "1" </w:instrText>
       </w:r>
@@ -10281,13 +10954,13 @@
       <w:pPr>
         <w:pStyle w:val="Heading2"/>
       </w:pPr>
-      <w:bookmarkStart w:id="164" w:name="_Toc183099274"/>
-      <w:bookmarkStart w:id="165" w:name="_Toc185323558"/>
+      <w:bookmarkStart w:id="168" w:name="_Toc183099274"/>
+      <w:bookmarkStart w:id="169" w:name="_Toc185323558"/>
       <w:r>
         <w:t>Description of primary estimand</w:t>
       </w:r>
-      <w:bookmarkEnd w:id="164"/>
-      <w:bookmarkEnd w:id="165"/>
+      <w:bookmarkEnd w:id="168"/>
+      <w:bookmarkEnd w:id="169"/>
     </w:p>
     <w:p>
       <w:pPr>
@@ -10424,18 +11097,36 @@
           <w:szCs w:val="22"/>
           <w:lang w:val="en-GB"/>
         </w:rPr>
-        <w:t>{{primary_estimand}}</w:t>
-      </w:r>
-    </w:p>
-    <w:p>
-      <w:pPr>
-        <w:rPr>
-          <w:i/>
-          <w:iCs/>
+        <w:t>{{</w:t>
+      </w:r>
+      <w:proofErr w:type="spellStart"/>
+      <w:r>
+        <w:rPr>
           <w:sz w:val="22"/>
           <w:szCs w:val="22"/>
           <w:lang w:val="en-GB"/>
         </w:rPr>
+        <w:t>primary_estimand</w:t>
+      </w:r>
+      <w:proofErr w:type="spellEnd"/>
+      <w:r>
+        <w:rPr>
+          <w:sz w:val="22"/>
+          <w:szCs w:val="22"/>
+          <w:lang w:val="en-GB"/>
+        </w:rPr>
+        <w:t>}}</w:t>
+      </w:r>
+    </w:p>
+    <w:p>
+      <w:pPr>
+        <w:rPr>
+          <w:i/>
+          <w:iCs/>
+          <w:sz w:val="22"/>
+          <w:szCs w:val="22"/>
+          <w:lang w:val="en-GB"/>
+        </w:rPr>
       </w:pPr>
     </w:p>
     <w:p>
@@ -10638,16 +11329,16 @@
       </w:pPr>
     </w:p>
     <w:p>
-      <w:bookmarkStart w:id="166" w:name="_Toc183099275"/>
-      <w:bookmarkEnd w:id="166"/>
+      <w:bookmarkStart w:id="170" w:name="_Toc183099275"/>
+      <w:bookmarkEnd w:id="170"/>
     </w:p>
     <w:p/>
     <w:p>
       <w:pPr>
         <w:pStyle w:val="Heading2"/>
       </w:pPr>
-      <w:bookmarkStart w:id="167" w:name="_Toc183099276"/>
-      <w:bookmarkStart w:id="168" w:name="_Toc185323559"/>
+      <w:bookmarkStart w:id="171" w:name="_Toc183099276"/>
+      <w:bookmarkStart w:id="172" w:name="_Toc185323559"/>
       <w:r>
         <w:t xml:space="preserve">Analysis </w:t>
       </w:r>
@@ -10660,8 +11351,8 @@
       <w:r>
         <w:t>(s)</w:t>
       </w:r>
-      <w:bookmarkEnd w:id="167"/>
-      <w:bookmarkEnd w:id="168"/>
+      <w:bookmarkEnd w:id="171"/>
+      <w:bookmarkEnd w:id="172"/>
     </w:p>
     <w:p>
       <w:pPr>
@@ -10720,33 +11411,64 @@
           <w:szCs w:val="22"/>
           <w:highlight w:val="yellow"/>
         </w:rPr>
-        <w:t xml:space="preserve"> that will be used to estimate estimands described in Section 3.1</w:t>
-      </w:r>
-    </w:p>
-    <w:p>
-      <w:pPr>
-        <w:rPr>
-          <w:i/>
-          <w:iCs/>
-          <w:sz w:val="22"/>
-          <w:szCs w:val="22"/>
-        </w:rPr>
-      </w:pPr>
-    </w:p>
-    <w:p>
-      <w:pPr>
-        <w:rPr>
-          <w:sz w:val="22"/>
-          <w:szCs w:val="22"/>
-        </w:rPr>
-      </w:pPr>
-      <w:r>
-        <w:rPr>
-          <w:sz w:val="22"/>
-          <w:szCs w:val="22"/>
-        </w:rPr>
-        <w:t>{{primary_analysis_model</w:t>
-      </w:r>
+        <w:t xml:space="preserve"> that will be used to estimate </w:t>
+      </w:r>
+      <w:proofErr w:type="spellStart"/>
+      <w:r>
+        <w:rPr>
+          <w:i/>
+          <w:iCs/>
+          <w:sz w:val="22"/>
+          <w:szCs w:val="22"/>
+          <w:highlight w:val="yellow"/>
+        </w:rPr>
+        <w:t>estimands</w:t>
+      </w:r>
+      <w:proofErr w:type="spellEnd"/>
+      <w:r>
+        <w:rPr>
+          <w:i/>
+          <w:iCs/>
+          <w:sz w:val="22"/>
+          <w:szCs w:val="22"/>
+          <w:highlight w:val="yellow"/>
+        </w:rPr>
+        <w:t xml:space="preserve"> described in Section 3.1</w:t>
+      </w:r>
+    </w:p>
+    <w:p>
+      <w:pPr>
+        <w:rPr>
+          <w:i/>
+          <w:iCs/>
+          <w:sz w:val="22"/>
+          <w:szCs w:val="22"/>
+        </w:rPr>
+      </w:pPr>
+    </w:p>
+    <w:p>
+      <w:pPr>
+        <w:rPr>
+          <w:sz w:val="22"/>
+          <w:szCs w:val="22"/>
+        </w:rPr>
+      </w:pPr>
+      <w:r>
+        <w:rPr>
+          <w:sz w:val="22"/>
+          <w:szCs w:val="22"/>
+        </w:rPr>
+        <w:t>{{</w:t>
+      </w:r>
+      <w:proofErr w:type="spellStart"/>
+      <w:r>
+        <w:rPr>
+          <w:sz w:val="22"/>
+          <w:szCs w:val="22"/>
+        </w:rPr>
+        <w:t>primary_analysis_model</w:t>
+      </w:r>
+      <w:proofErr w:type="spellEnd"/>
       <w:r>
         <w:rPr>
           <w:sz w:val="22"/>
@@ -10766,19 +11488,19 @@
       <w:pPr>
         <w:pStyle w:val="Heading2"/>
       </w:pPr>
-      <w:bookmarkStart w:id="169" w:name="_Ref105410120"/>
-      <w:bookmarkStart w:id="170" w:name="_Toc105411787"/>
-      <w:bookmarkStart w:id="171" w:name="_Toc148432493"/>
-      <w:bookmarkStart w:id="172" w:name="_Toc183099277"/>
-      <w:bookmarkStart w:id="173" w:name="_Toc185323560"/>
+      <w:bookmarkStart w:id="173" w:name="_Ref105410120"/>
+      <w:bookmarkStart w:id="174" w:name="_Toc105411787"/>
+      <w:bookmarkStart w:id="175" w:name="_Toc148432493"/>
+      <w:bookmarkStart w:id="176" w:name="_Toc183099277"/>
+      <w:bookmarkStart w:id="177" w:name="_Toc185323560"/>
       <w:r>
         <w:t>List of anticipated</w:t>
       </w:r>
       <w:r>
         <w:t xml:space="preserve"> intercurrent events</w:t>
       </w:r>
-      <w:bookmarkEnd w:id="169"/>
-      <w:bookmarkEnd w:id="170"/>
+      <w:bookmarkEnd w:id="173"/>
+      <w:bookmarkEnd w:id="174"/>
       <w:r>
         <w:t xml:space="preserve"> and </w:t>
       </w:r>
@@ -10788,12 +11510,12 @@
       <w:r>
         <w:t>supplementary analyses</w:t>
       </w:r>
-      <w:bookmarkEnd w:id="171"/>
+      <w:bookmarkEnd w:id="175"/>
       <w:r>
         <w:t xml:space="preserve"> using different strategies</w:t>
       </w:r>
-      <w:bookmarkEnd w:id="172"/>
-      <w:bookmarkEnd w:id="173"/>
+      <w:bookmarkEnd w:id="176"/>
+      <w:bookmarkEnd w:id="177"/>
     </w:p>
     <w:p>
       <w:pPr>
@@ -10856,7 +11578,29 @@
           <w:szCs w:val="22"/>
           <w:highlight w:val="yellow"/>
         </w:rPr>
-        <w:t xml:space="preserve"> looking at different strategies for handling these ICEs or different estimands should be outlined here unless stated elsewhere in SAP.</w:t>
+        <w:t xml:space="preserve"> looking at different strategies for handling these ICEs or different </w:t>
+      </w:r>
+      <w:proofErr w:type="spellStart"/>
+      <w:r>
+        <w:rPr>
+          <w:i/>
+          <w:iCs/>
+          <w:sz w:val="22"/>
+          <w:szCs w:val="22"/>
+          <w:highlight w:val="yellow"/>
+        </w:rPr>
+        <w:t>estimands</w:t>
+      </w:r>
+      <w:proofErr w:type="spellEnd"/>
+      <w:r>
+        <w:rPr>
+          <w:i/>
+          <w:iCs/>
+          <w:sz w:val="22"/>
+          <w:szCs w:val="22"/>
+          <w:highlight w:val="yellow"/>
+        </w:rPr>
+        <w:t xml:space="preserve"> should be outlined here unless stated elsewhere in SAP.</w:t>
       </w:r>
     </w:p>
     <w:p>
@@ -10897,7 +11641,21 @@
         <w:rPr>
           <w:lang w:val="en-GB"/>
         </w:rPr>
-        <w:t>{{intercurrent_events_and_analysis}}</w:t>
+        <w:t>{{</w:t>
+      </w:r>
+      <w:proofErr w:type="spellStart"/>
+      <w:r>
+        <w:rPr>
+          <w:lang w:val="en-GB"/>
+        </w:rPr>
+        <w:t>intercurrent_events_and_analysis</w:t>
+      </w:r>
+      <w:proofErr w:type="spellEnd"/>
+      <w:r>
+        <w:rPr>
+          <w:lang w:val="en-GB"/>
+        </w:rPr>
+        <w:t>}}</w:t>
       </w:r>
     </w:p>
     <w:p/>
@@ -10908,7 +11666,7 @@
       <w:r>
         <w:instrText xml:space="preserve"> TC "</w:instrText>
       </w:r>
-      <w:bookmarkStart w:id="174" w:name="_Toc183094443"/>
+      <w:bookmarkStart w:id="178" w:name="_Toc183094443"/>
       <w:r>
         <w:instrText>3.1.1</w:instrText>
       </w:r>
@@ -10916,7 +11674,7 @@
         <w:tab/>
         <w:instrText>Analysis of primary outcomes</w:instrText>
       </w:r>
-      <w:bookmarkEnd w:id="174"/>
+      <w:bookmarkEnd w:id="178"/>
       <w:r>
         <w:instrText xml:space="preserve">" \f C \l "1" </w:instrText>
       </w:r>
@@ -10928,18 +11686,18 @@
       <w:pPr>
         <w:pStyle w:val="Heading2"/>
       </w:pPr>
-      <w:bookmarkStart w:id="175" w:name="_Toc185323561"/>
-      <w:bookmarkStart w:id="176" w:name="_Toc183099278"/>
-      <w:bookmarkStart w:id="177" w:name="_Toc185323562"/>
-      <w:bookmarkEnd w:id="175"/>
+      <w:bookmarkStart w:id="179" w:name="_Toc185323561"/>
+      <w:bookmarkStart w:id="180" w:name="_Toc183099278"/>
+      <w:bookmarkStart w:id="181" w:name="_Toc185323562"/>
+      <w:bookmarkEnd w:id="179"/>
       <w:r>
         <w:t>Analysis of</w:t>
       </w:r>
       <w:r>
         <w:t xml:space="preserve"> secondary outcomes</w:t>
       </w:r>
-      <w:bookmarkEnd w:id="176"/>
-      <w:bookmarkEnd w:id="177"/>
+      <w:bookmarkEnd w:id="180"/>
+      <w:bookmarkEnd w:id="181"/>
       <w:r>
         <w:t xml:space="preserve"> </w:t>
       </w:r>
@@ -10949,7 +11707,7 @@
       <w:r>
         <w:instrText xml:space="preserve"> TC "</w:instrText>
       </w:r>
-      <w:bookmarkStart w:id="178" w:name="_Toc183094444"/>
+      <w:bookmarkStart w:id="182" w:name="_Toc183094444"/>
       <w:r>
         <w:instrText>3.1.2</w:instrText>
       </w:r>
@@ -10957,7 +11715,7 @@
         <w:tab/>
         <w:instrText>Analysis of secondary outcomes</w:instrText>
       </w:r>
-      <w:bookmarkEnd w:id="178"/>
+      <w:bookmarkEnd w:id="182"/>
       <w:r>
         <w:instrText xml:space="preserve">" \f C \l "1" </w:instrText>
       </w:r>
@@ -10974,7 +11732,29 @@
           <w:szCs w:val="22"/>
           <w:highlight w:val="yellow"/>
         </w:rPr>
-        <w:t xml:space="preserve">If estimands </w:t>
+        <w:t xml:space="preserve">If </w:t>
+      </w:r>
+      <w:proofErr w:type="spellStart"/>
+      <w:r>
+        <w:rPr>
+          <w:i/>
+          <w:iCs/>
+          <w:sz w:val="22"/>
+          <w:szCs w:val="22"/>
+          <w:highlight w:val="yellow"/>
+        </w:rPr>
+        <w:t>estimands</w:t>
+      </w:r>
+      <w:proofErr w:type="spellEnd"/>
+      <w:r>
+        <w:rPr>
+          <w:i/>
+          <w:iCs/>
+          <w:sz w:val="22"/>
+          <w:szCs w:val="22"/>
+          <w:highlight w:val="yellow"/>
+        </w:rPr>
+        <w:t xml:space="preserve"> </w:t>
       </w:r>
       <w:proofErr w:type="gramStart"/>
       <w:r>
@@ -11020,6 +11800,7 @@
         </w:rPr>
         <w:t xml:space="preserve"> to list out separately here. AI content only </w:t>
       </w:r>
+      <w:proofErr w:type="spellStart"/>
       <w:proofErr w:type="gramStart"/>
       <w:r>
         <w:rPr>
@@ -11041,6 +11822,7 @@
         </w:rPr>
         <w:t>analysis</w:t>
       </w:r>
+      <w:proofErr w:type="spellEnd"/>
       <w:proofErr w:type="gramEnd"/>
       <w:r>
         <w:rPr>
@@ -11056,7 +11838,15 @@
     <w:p/>
     <w:p>
       <w:r>
-        <w:t>{{secondary_analysis}}</w:t>
+        <w:t>{{</w:t>
+      </w:r>
+      <w:proofErr w:type="spellStart"/>
+      <w:r>
+        <w:t>secondary_analysis</w:t>
+      </w:r>
+      <w:proofErr w:type="spellEnd"/>
+      <w:r>
+        <w:t>}}</w:t>
       </w:r>
     </w:p>
     <w:p/>
@@ -11064,12 +11854,12 @@
       <w:pPr>
         <w:pStyle w:val="Heading2"/>
       </w:pPr>
-      <w:commentRangeStart w:id="179"/>
+      <w:commentRangeStart w:id="183"/>
       <w:r>
         <w:lastRenderedPageBreak/>
         <w:t>Model assumption checks</w:t>
       </w:r>
-      <w:commentRangeEnd w:id="179"/>
+      <w:commentRangeEnd w:id="183"/>
       <w:r>
         <w:rPr>
           <w:rStyle w:val="CommentReference"/>
@@ -11078,7 +11868,7 @@
           <w:u w:val="none"/>
           <w:lang w:val="en-US"/>
         </w:rPr>
-        <w:commentReference w:id="179"/>
+        <w:commentReference w:id="183"/>
       </w:r>
     </w:p>
     <w:p>
@@ -11191,7 +11981,23 @@
           <w:sz w:val="22"/>
           <w:szCs w:val="22"/>
         </w:rPr>
-        <w:t>{{model_assumption_checks}}</w:t>
+        <w:t>{{</w:t>
+      </w:r>
+      <w:proofErr w:type="spellStart"/>
+      <w:r>
+        <w:rPr>
+          <w:sz w:val="22"/>
+          <w:szCs w:val="22"/>
+        </w:rPr>
+        <w:t>model_assumption_checks</w:t>
+      </w:r>
+      <w:proofErr w:type="spellEnd"/>
+      <w:r>
+        <w:rPr>
+          <w:sz w:val="22"/>
+          <w:szCs w:val="22"/>
+        </w:rPr>
+        <w:t>}}</w:t>
       </w:r>
     </w:p>
     <w:p/>
@@ -11199,36 +12005,36 @@
       <w:pPr>
         <w:pStyle w:val="Heading2"/>
       </w:pPr>
-      <w:bookmarkStart w:id="180" w:name="_Toc183099279"/>
-      <w:bookmarkStart w:id="181" w:name="_Toc183100570"/>
-      <w:bookmarkStart w:id="182" w:name="_Toc185323563"/>
-      <w:bookmarkStart w:id="183" w:name="_Toc183099280"/>
-      <w:bookmarkStart w:id="184" w:name="_Toc183100571"/>
-      <w:bookmarkStart w:id="185" w:name="_Toc185323564"/>
-      <w:bookmarkStart w:id="186" w:name="_Toc183099283"/>
-      <w:bookmarkStart w:id="187" w:name="_Toc185323567"/>
-      <w:bookmarkEnd w:id="180"/>
-      <w:bookmarkEnd w:id="181"/>
-      <w:bookmarkEnd w:id="182"/>
-      <w:bookmarkEnd w:id="183"/>
+      <w:bookmarkStart w:id="184" w:name="_Toc183099279"/>
+      <w:bookmarkStart w:id="185" w:name="_Toc183100570"/>
+      <w:bookmarkStart w:id="186" w:name="_Toc185323563"/>
+      <w:bookmarkStart w:id="187" w:name="_Toc183099280"/>
+      <w:bookmarkStart w:id="188" w:name="_Toc183100571"/>
+      <w:bookmarkStart w:id="189" w:name="_Toc185323564"/>
+      <w:bookmarkStart w:id="190" w:name="_Toc183099283"/>
+      <w:bookmarkStart w:id="191" w:name="_Toc185323567"/>
       <w:bookmarkEnd w:id="184"/>
       <w:bookmarkEnd w:id="185"/>
-      <w:r>
-        <w:t>Missing items in scales and subscales</w:t>
-      </w:r>
       <w:bookmarkEnd w:id="186"/>
       <w:bookmarkEnd w:id="187"/>
+      <w:bookmarkEnd w:id="188"/>
+      <w:bookmarkEnd w:id="189"/>
+      <w:r>
+        <w:t>Missing items in scales and subscales</w:t>
+      </w:r>
+      <w:bookmarkEnd w:id="190"/>
+      <w:bookmarkEnd w:id="191"/>
       <w:r>
         <w:fldChar w:fldCharType="begin"/>
       </w:r>
       <w:r>
         <w:instrText xml:space="preserve"> TC "</w:instrText>
       </w:r>
-      <w:bookmarkStart w:id="188" w:name="_Toc183094448"/>
+      <w:bookmarkStart w:id="192" w:name="_Toc183094448"/>
       <w:r>
         <w:instrText>Missing items in scales and subscales</w:instrText>
       </w:r>
-      <w:bookmarkEnd w:id="188"/>
+      <w:bookmarkEnd w:id="192"/>
       <w:r>
         <w:instrText xml:space="preserve">" \f C \l "1" </w:instrText>
       </w:r>
@@ -11288,24 +12094,24 @@
       <w:pPr>
         <w:pStyle w:val="Heading2"/>
       </w:pPr>
-      <w:bookmarkStart w:id="189" w:name="_Toc183099284"/>
-      <w:bookmarkStart w:id="190" w:name="_Toc185323568"/>
+      <w:bookmarkStart w:id="193" w:name="_Toc183099284"/>
+      <w:bookmarkStart w:id="194" w:name="_Toc185323568"/>
       <w:r>
         <w:t>Missing baseline data</w:t>
       </w:r>
-      <w:bookmarkEnd w:id="189"/>
-      <w:bookmarkEnd w:id="190"/>
+      <w:bookmarkEnd w:id="193"/>
+      <w:bookmarkEnd w:id="194"/>
       <w:r>
         <w:fldChar w:fldCharType="begin"/>
       </w:r>
       <w:r>
         <w:instrText xml:space="preserve"> TC "</w:instrText>
       </w:r>
-      <w:bookmarkStart w:id="191" w:name="_Toc183094449"/>
+      <w:bookmarkStart w:id="195" w:name="_Toc183094449"/>
       <w:r>
         <w:instrText>Missing baseline data</w:instrText>
       </w:r>
-      <w:bookmarkEnd w:id="191"/>
+      <w:bookmarkEnd w:id="195"/>
       <w:r>
         <w:instrText xml:space="preserve">" \f C \l "1" </w:instrText>
       </w:r>
@@ -11392,24 +12198,24 @@
       <w:pPr>
         <w:pStyle w:val="Heading2"/>
       </w:pPr>
-      <w:bookmarkStart w:id="192" w:name="_Toc183099285"/>
-      <w:bookmarkStart w:id="193" w:name="_Toc185323569"/>
+      <w:bookmarkStart w:id="196" w:name="_Toc183099285"/>
+      <w:bookmarkStart w:id="197" w:name="_Toc185323569"/>
       <w:r>
         <w:t>Missing outcome data</w:t>
       </w:r>
-      <w:bookmarkEnd w:id="192"/>
-      <w:bookmarkEnd w:id="193"/>
+      <w:bookmarkEnd w:id="196"/>
+      <w:bookmarkEnd w:id="197"/>
       <w:r>
         <w:fldChar w:fldCharType="begin"/>
       </w:r>
       <w:r>
         <w:instrText xml:space="preserve"> TC "</w:instrText>
       </w:r>
-      <w:bookmarkStart w:id="194" w:name="_Toc183094450"/>
+      <w:bookmarkStart w:id="198" w:name="_Toc183094450"/>
       <w:r>
         <w:instrText>Missing outcome data</w:instrText>
       </w:r>
-      <w:bookmarkEnd w:id="194"/>
+      <w:bookmarkEnd w:id="198"/>
       <w:r>
         <w:instrText xml:space="preserve">" \f C \l "1" </w:instrText>
       </w:r>
@@ -11429,7 +12235,23 @@
           <w:sz w:val="22"/>
           <w:szCs w:val="22"/>
         </w:rPr>
-        <w:t xml:space="preserve">Where there are two or more outcome time points, missing post-randomisation assessments will be dealt with by fitting linear mixed models to all the available data using maximum likelihood methods. Such an approach provides valid inferences under the assumption that the missing data mechanism is ignorable (or MAR).  </w:t>
+        <w:t>Where there are two or more outcome time points, missing post-</w:t>
+      </w:r>
+      <w:proofErr w:type="spellStart"/>
+      <w:r>
+        <w:rPr>
+          <w:sz w:val="22"/>
+          <w:szCs w:val="22"/>
+        </w:rPr>
+        <w:t>randomisation</w:t>
+      </w:r>
+      <w:proofErr w:type="spellEnd"/>
+      <w:r>
+        <w:rPr>
+          <w:sz w:val="22"/>
+          <w:szCs w:val="22"/>
+        </w:rPr>
+        <w:t xml:space="preserve"> assessments will be dealt with by fitting linear mixed models to all the available data using maximum likelihood methods. Such an approach provides valid inferences under the assumption that the missing data mechanism is ignorable (or MAR).  </w:t>
       </w:r>
       <w:r>
         <w:rPr>
@@ -11444,16 +12266,16 @@
       <w:pPr>
         <w:pStyle w:val="Heading2"/>
       </w:pPr>
-      <w:bookmarkStart w:id="195" w:name="_Toc183099286"/>
-      <w:bookmarkStart w:id="196" w:name="_Toc185323570"/>
+      <w:bookmarkStart w:id="199" w:name="_Toc183099286"/>
+      <w:bookmarkStart w:id="200" w:name="_Toc185323570"/>
       <w:r>
         <w:t>Method for handling multiple comparisons</w:t>
       </w:r>
       <w:r>
         <w:t>/multiplicity</w:t>
       </w:r>
-      <w:bookmarkEnd w:id="195"/>
-      <w:bookmarkEnd w:id="196"/>
+      <w:bookmarkEnd w:id="199"/>
+      <w:bookmarkEnd w:id="200"/>
     </w:p>
     <w:p>
       <w:pPr>
@@ -11596,7 +12418,23 @@
           <w:sz w:val="22"/>
           <w:szCs w:val="22"/>
         </w:rPr>
-        <w:t>All outcomes will be analysed separately. No</w:t>
+        <w:t xml:space="preserve">All outcomes will be </w:t>
+      </w:r>
+      <w:proofErr w:type="spellStart"/>
+      <w:r>
+        <w:rPr>
+          <w:sz w:val="22"/>
+          <w:szCs w:val="22"/>
+        </w:rPr>
+        <w:t>analysed</w:t>
+      </w:r>
+      <w:proofErr w:type="spellEnd"/>
+      <w:r>
+        <w:rPr>
+          <w:sz w:val="22"/>
+          <w:szCs w:val="22"/>
+        </w:rPr>
+        <w:t xml:space="preserve"> separately. No</w:t>
       </w:r>
       <w:r>
         <w:rPr>
@@ -11658,27 +12496,34 @@
     <w:p/>
     <w:p>
       <w:r>
-        <w:lastRenderedPageBreak/>
-        <w:t>{{multiple_comparisons}}</w:t>
-      </w:r>
-    </w:p>
-    <w:p>
-      <w:bookmarkStart w:id="197" w:name="_Toc185323572"/>
-      <w:bookmarkEnd w:id="197"/>
+        <w:t>{{</w:t>
+      </w:r>
+      <w:proofErr w:type="spellStart"/>
+      <w:r>
+        <w:t>multiple_comparisons</w:t>
+      </w:r>
+      <w:proofErr w:type="spellEnd"/>
+      <w:r>
+        <w:t>}}</w:t>
+      </w:r>
+    </w:p>
+    <w:p>
+      <w:bookmarkStart w:id="201" w:name="_Toc185323572"/>
+      <w:bookmarkEnd w:id="201"/>
     </w:p>
     <w:p>
       <w:pPr>
         <w:pStyle w:val="Heading2"/>
       </w:pPr>
-      <w:bookmarkStart w:id="198" w:name="_Toc183099289"/>
-      <w:bookmarkStart w:id="199" w:name="_Toc185323574"/>
-      <w:commentRangeStart w:id="200"/>
+      <w:bookmarkStart w:id="202" w:name="_Toc183099289"/>
+      <w:bookmarkStart w:id="203" w:name="_Toc185323574"/>
+      <w:commentRangeStart w:id="204"/>
       <w:r>
         <w:t>Sensitivity analyses</w:t>
       </w:r>
-      <w:bookmarkEnd w:id="198"/>
-      <w:bookmarkEnd w:id="199"/>
-      <w:commentRangeEnd w:id="200"/>
+      <w:bookmarkEnd w:id="202"/>
+      <w:bookmarkEnd w:id="203"/>
+      <w:commentRangeEnd w:id="204"/>
       <w:r>
         <w:rPr>
           <w:rStyle w:val="CommentReference"/>
@@ -11687,7 +12532,7 @@
           <w:u w:val="none"/>
           <w:lang w:val="en-US"/>
         </w:rPr>
-        <w:commentReference w:id="200"/>
+        <w:commentReference w:id="204"/>
       </w:r>
       <w:r>
         <w:fldChar w:fldCharType="begin"/>
@@ -11695,7 +12540,7 @@
       <w:r>
         <w:instrText xml:space="preserve"> TC "</w:instrText>
       </w:r>
-      <w:bookmarkStart w:id="201" w:name="_Toc183094454"/>
+      <w:bookmarkStart w:id="205" w:name="_Toc183094454"/>
       <w:r>
         <w:instrText>3.1.4</w:instrText>
       </w:r>
@@ -11703,7 +12548,7 @@
         <w:tab/>
         <w:instrText>Sensitivity analyses</w:instrText>
       </w:r>
-      <w:bookmarkEnd w:id="201"/>
+      <w:bookmarkEnd w:id="205"/>
       <w:r>
         <w:instrText xml:space="preserve">" \f C \l "1" </w:instrText>
       </w:r>
@@ -11725,46 +12570,80 @@
           <w:iCs/>
           <w:highlight w:val="yellow"/>
         </w:rPr>
-        <w:t>Describe any plans for handling missing data (i.e. MNAR sensitivity analysis, MICE if post-randomisation variable predicts missingness of primary outcome)</w:t>
-      </w:r>
-    </w:p>
-    <w:p>
-      <w:pPr>
-        <w:rPr>
-          <w:sz w:val="22"/>
-          <w:szCs w:val="22"/>
-        </w:rPr>
-      </w:pPr>
-      <w:r>
-        <w:rPr>
-          <w:sz w:val="22"/>
-          <w:szCs w:val="22"/>
-        </w:rPr>
-        <w:t>{{missing_data_sensitivity_analysis}}</w:t>
-      </w:r>
-    </w:p>
-    <w:p>
-      <w:pPr>
+        <w:t>Describe any plans for handling missing data (i.e. MNAR sensitivity analysis, MICE if post-</w:t>
+      </w:r>
+      <w:proofErr w:type="spellStart"/>
+      <w:r>
         <w:rPr>
           <w:i/>
           <w:iCs/>
           <w:highlight w:val="yellow"/>
         </w:rPr>
-      </w:pPr>
-    </w:p>
-    <w:p>
-      <w:pPr>
-        <w:rPr>
-          <w:i/>
-          <w:iCs/>
-        </w:rPr>
-      </w:pPr>
+        <w:t>randomisation</w:t>
+      </w:r>
+      <w:proofErr w:type="spellEnd"/>
       <w:r>
         <w:rPr>
           <w:i/>
           <w:iCs/>
           <w:highlight w:val="yellow"/>
         </w:rPr>
+        <w:t xml:space="preserve"> variable predicts missingness of primary outcome)</w:t>
+      </w:r>
+    </w:p>
+    <w:p>
+      <w:pPr>
+        <w:rPr>
+          <w:sz w:val="22"/>
+          <w:szCs w:val="22"/>
+        </w:rPr>
+      </w:pPr>
+      <w:r>
+        <w:rPr>
+          <w:sz w:val="22"/>
+          <w:szCs w:val="22"/>
+        </w:rPr>
+        <w:t>{{</w:t>
+      </w:r>
+      <w:proofErr w:type="spellStart"/>
+      <w:r>
+        <w:rPr>
+          <w:sz w:val="22"/>
+          <w:szCs w:val="22"/>
+        </w:rPr>
+        <w:t>missing_data_sensitivity_analysis</w:t>
+      </w:r>
+      <w:proofErr w:type="spellEnd"/>
+      <w:r>
+        <w:rPr>
+          <w:sz w:val="22"/>
+          <w:szCs w:val="22"/>
+        </w:rPr>
+        <w:t>}}</w:t>
+      </w:r>
+    </w:p>
+    <w:p>
+      <w:pPr>
+        <w:rPr>
+          <w:i/>
+          <w:iCs/>
+          <w:highlight w:val="yellow"/>
+        </w:rPr>
+      </w:pPr>
+    </w:p>
+    <w:p>
+      <w:pPr>
+        <w:rPr>
+          <w:i/>
+          <w:iCs/>
+        </w:rPr>
+      </w:pPr>
+      <w:r>
+        <w:rPr>
+          <w:i/>
+          <w:iCs/>
+          <w:highlight w:val="yellow"/>
+        </w:rPr>
         <w:t>Describe any pre-specified plans for handling non-compliance</w:t>
       </w:r>
     </w:p>
@@ -11774,7 +12653,23 @@
           <w:sz w:val="22"/>
           <w:szCs w:val="22"/>
         </w:rPr>
-        <w:t>{{analysis_for_noncompliance}}</w:t>
+        <w:t>{{</w:t>
+      </w:r>
+      <w:proofErr w:type="spellStart"/>
+      <w:r>
+        <w:rPr>
+          <w:sz w:val="22"/>
+          <w:szCs w:val="22"/>
+        </w:rPr>
+        <w:t>analysis_for_noncompliance</w:t>
+      </w:r>
+      <w:proofErr w:type="spellEnd"/>
+      <w:r>
+        <w:rPr>
+          <w:sz w:val="22"/>
+          <w:szCs w:val="22"/>
+        </w:rPr>
+        <w:t>}}</w:t>
       </w:r>
     </w:p>
     <w:p/>
@@ -11796,7 +12691,15 @@
     </w:p>
     <w:p>
       <w:r>
-        <w:t>{{other_sensitivity_analysis}}</w:t>
+        <w:t>{{</w:t>
+      </w:r>
+      <w:proofErr w:type="spellStart"/>
+      <w:r>
+        <w:t>other_sensitivity_analysis</w:t>
+      </w:r>
+      <w:proofErr w:type="spellEnd"/>
+      <w:r>
+        <w:t>}}</w:t>
       </w:r>
     </w:p>
     <w:p/>
@@ -11804,20 +12707,20 @@
       <w:pPr>
         <w:pStyle w:val="Heading2"/>
       </w:pPr>
-      <w:bookmarkStart w:id="202" w:name="_Toc183099290"/>
-      <w:bookmarkStart w:id="203" w:name="_Toc185323575"/>
+      <w:bookmarkStart w:id="206" w:name="_Toc183099290"/>
+      <w:bookmarkStart w:id="207" w:name="_Toc185323575"/>
       <w:r>
         <w:t>Planned subgroup analyses</w:t>
       </w:r>
-      <w:bookmarkEnd w:id="202"/>
-      <w:bookmarkEnd w:id="203"/>
+      <w:bookmarkEnd w:id="206"/>
+      <w:bookmarkEnd w:id="207"/>
       <w:r>
         <w:fldChar w:fldCharType="begin"/>
       </w:r>
       <w:r>
         <w:instrText xml:space="preserve"> TC "</w:instrText>
       </w:r>
-      <w:bookmarkStart w:id="204" w:name="_Toc183094455"/>
+      <w:bookmarkStart w:id="208" w:name="_Toc183094455"/>
       <w:r>
         <w:instrText>3.1.5</w:instrText>
       </w:r>
@@ -11825,7 +12728,7 @@
         <w:tab/>
         <w:instrText>Planned subgroup analyses</w:instrText>
       </w:r>
-      <w:bookmarkEnd w:id="204"/>
+      <w:bookmarkEnd w:id="208"/>
       <w:r>
         <w:instrText xml:space="preserve">" \f C \l "1" </w:instrText>
       </w:r>
@@ -11875,7 +12778,15 @@
     </w:p>
     <w:p>
       <w:r>
-        <w:t>{{subgroup_analysis}}</w:t>
+        <w:t>{{</w:t>
+      </w:r>
+      <w:proofErr w:type="spellStart"/>
+      <w:r>
+        <w:t>subgroup_analysis</w:t>
+      </w:r>
+      <w:proofErr w:type="spellEnd"/>
+      <w:r>
+        <w:t>}}</w:t>
       </w:r>
     </w:p>
     <w:p/>
@@ -11883,23 +12794,23 @@
       <w:pPr>
         <w:pStyle w:val="Heading2"/>
       </w:pPr>
-      <w:bookmarkStart w:id="205" w:name="_Toc183099292"/>
-      <w:bookmarkStart w:id="206" w:name="_Toc185323577"/>
+      <w:bookmarkStart w:id="209" w:name="_Toc183099292"/>
+      <w:bookmarkStart w:id="210" w:name="_Toc185323577"/>
       <w:r>
         <w:t xml:space="preserve">Planned exploratory </w:t>
       </w:r>
       <w:r>
         <w:t>mediator and moderator analysis</w:t>
       </w:r>
-      <w:bookmarkEnd w:id="205"/>
-      <w:bookmarkEnd w:id="206"/>
+      <w:bookmarkEnd w:id="209"/>
+      <w:bookmarkEnd w:id="210"/>
       <w:r>
         <w:fldChar w:fldCharType="begin"/>
       </w:r>
       <w:r>
         <w:instrText xml:space="preserve"> TC "</w:instrText>
       </w:r>
-      <w:bookmarkStart w:id="207" w:name="_Toc183094457"/>
+      <w:bookmarkStart w:id="211" w:name="_Toc183094457"/>
       <w:r>
         <w:instrText>3.3</w:instrText>
       </w:r>
@@ -11907,7 +12818,7 @@
         <w:tab/>
         <w:instrText>Exploratory mediator and moderator analysis</w:instrText>
       </w:r>
-      <w:bookmarkEnd w:id="207"/>
+      <w:bookmarkEnd w:id="211"/>
       <w:r>
         <w:instrText xml:space="preserve">" \f C \l "1" </w:instrText>
       </w:r>
@@ -12004,10 +12915,18 @@
     </w:p>
     <w:p>
       <w:r>
-        <w:t>{{any_exploratory_mediator_and_m</w:t>
-      </w:r>
-      <w:r>
-        <w:t>oderator_analysis}}</w:t>
+        <w:t>{{</w:t>
+      </w:r>
+      <w:proofErr w:type="spellStart"/>
+      <w:r>
+        <w:t>any_exploratory_mediator_and_m</w:t>
+      </w:r>
+      <w:r>
+        <w:t>oderator_analysis</w:t>
+      </w:r>
+      <w:proofErr w:type="spellEnd"/>
+      <w:r>
+        <w:t>}}</w:t>
       </w:r>
     </w:p>
     <w:p/>
@@ -12015,20 +12934,20 @@
       <w:pPr>
         <w:pStyle w:val="Heading2"/>
       </w:pPr>
-      <w:bookmarkStart w:id="208" w:name="_Toc183099293"/>
-      <w:bookmarkStart w:id="209" w:name="_Toc185323578"/>
+      <w:bookmarkStart w:id="212" w:name="_Toc183099293"/>
+      <w:bookmarkStart w:id="213" w:name="_Toc185323578"/>
       <w:r>
         <w:t>Interim analysis</w:t>
       </w:r>
-      <w:bookmarkEnd w:id="208"/>
-      <w:bookmarkEnd w:id="209"/>
+      <w:bookmarkEnd w:id="212"/>
+      <w:bookmarkEnd w:id="213"/>
       <w:r>
         <w:fldChar w:fldCharType="begin"/>
       </w:r>
       <w:r>
         <w:instrText xml:space="preserve"> TC "</w:instrText>
       </w:r>
-      <w:bookmarkStart w:id="210" w:name="_Toc183094458"/>
+      <w:bookmarkStart w:id="214" w:name="_Toc183094458"/>
       <w:r>
         <w:instrText>3.4</w:instrText>
       </w:r>
@@ -12036,7 +12955,7 @@
         <w:tab/>
         <w:instrText>Interim analysis</w:instrText>
       </w:r>
-      <w:bookmarkEnd w:id="210"/>
+      <w:bookmarkEnd w:id="214"/>
       <w:r>
         <w:instrText xml:space="preserve">" \f C \l "1" </w:instrText>
       </w:r>
@@ -12077,10 +12996,18 @@
         </w:rPr>
       </w:pPr>
       <w:r>
-        <w:t>{{interim</w:t>
-      </w:r>
-      <w:r>
-        <w:t>_analysis}}</w:t>
+        <w:t>{{</w:t>
+      </w:r>
+      <w:proofErr w:type="spellStart"/>
+      <w:r>
+        <w:t>interim</w:t>
+      </w:r>
+      <w:r>
+        <w:t>_analysis</w:t>
+      </w:r>
+      <w:proofErr w:type="spellEnd"/>
+      <w:r>
+        <w:t>}}</w:t>
       </w:r>
       <w:r>
         <w:rPr>
@@ -12095,26 +13022,26 @@
       <w:pPr>
         <w:pStyle w:val="Heading1"/>
       </w:pPr>
-      <w:bookmarkStart w:id="211" w:name="_Toc183099294"/>
-      <w:bookmarkStart w:id="212" w:name="_Toc185323579"/>
+      <w:bookmarkStart w:id="215" w:name="_Toc183099294"/>
+      <w:bookmarkStart w:id="216" w:name="_Toc185323579"/>
       <w:r>
         <w:lastRenderedPageBreak/>
         <w:t>Quality Control and Quality Assurance</w:t>
       </w:r>
-      <w:bookmarkEnd w:id="211"/>
-      <w:bookmarkEnd w:id="212"/>
+      <w:bookmarkEnd w:id="215"/>
+      <w:bookmarkEnd w:id="216"/>
     </w:p>
     <w:p>
       <w:pPr>
         <w:pStyle w:val="Heading2"/>
       </w:pPr>
-      <w:bookmarkStart w:id="213" w:name="_Toc183099295"/>
-      <w:bookmarkStart w:id="214" w:name="_Toc185323580"/>
+      <w:bookmarkStart w:id="217" w:name="_Toc183099295"/>
+      <w:bookmarkStart w:id="218" w:name="_Toc185323580"/>
       <w:r>
         <w:t>Quality control</w:t>
       </w:r>
-      <w:bookmarkEnd w:id="213"/>
-      <w:bookmarkEnd w:id="214"/>
+      <w:bookmarkEnd w:id="217"/>
+      <w:bookmarkEnd w:id="218"/>
     </w:p>
     <w:p>
       <w:pPr>
@@ -12283,13 +13210,13 @@
       <w:pPr>
         <w:pStyle w:val="Heading2"/>
       </w:pPr>
-      <w:bookmarkStart w:id="215" w:name="_Toc183099296"/>
-      <w:bookmarkStart w:id="216" w:name="_Toc185323581"/>
+      <w:bookmarkStart w:id="219" w:name="_Toc183099296"/>
+      <w:bookmarkStart w:id="220" w:name="_Toc185323581"/>
       <w:r>
         <w:t>Carrying out the final analysis</w:t>
       </w:r>
-      <w:bookmarkEnd w:id="215"/>
-      <w:bookmarkEnd w:id="216"/>
+      <w:bookmarkEnd w:id="219"/>
+      <w:bookmarkEnd w:id="220"/>
     </w:p>
     <w:p>
       <w:pPr>
@@ -12378,13 +13305,13 @@
       <w:pPr>
         <w:pStyle w:val="Heading2"/>
       </w:pPr>
-      <w:bookmarkStart w:id="217" w:name="_Toc183099297"/>
-      <w:bookmarkStart w:id="218" w:name="_Toc185323582"/>
+      <w:bookmarkStart w:id="221" w:name="_Toc183099297"/>
+      <w:bookmarkStart w:id="222" w:name="_Toc185323582"/>
       <w:r>
         <w:t>Approval and version control of the SAP</w:t>
       </w:r>
-      <w:bookmarkEnd w:id="217"/>
-      <w:bookmarkEnd w:id="218"/>
+      <w:bookmarkEnd w:id="221"/>
+      <w:bookmarkEnd w:id="222"/>
     </w:p>
     <w:p>
       <w:pPr>
@@ -12504,6 +13431,7 @@
         </w:rPr>
         <w:fldChar w:fldCharType="separate"/>
       </w:r>
+      <w:proofErr w:type="spellStart"/>
       <w:r>
         <w:rPr>
           <w:sz w:val="22"/>
@@ -12512,6 +13440,7 @@
         </w:rPr>
         <w:t>i</w:t>
       </w:r>
+      <w:proofErr w:type="spellEnd"/>
       <w:r>
         <w:rPr>
           <w:sz w:val="22"/>
@@ -12569,13 +13498,13 @@
       <w:pPr>
         <w:pStyle w:val="Heading2"/>
       </w:pPr>
-      <w:bookmarkStart w:id="219" w:name="_Toc183099298"/>
-      <w:bookmarkStart w:id="220" w:name="_Toc185323583"/>
+      <w:bookmarkStart w:id="223" w:name="_Toc183099298"/>
+      <w:bookmarkStart w:id="224" w:name="_Toc185323583"/>
       <w:r>
         <w:t>Quality Assurance</w:t>
       </w:r>
-      <w:bookmarkEnd w:id="219"/>
-      <w:bookmarkEnd w:id="220"/>
+      <w:bookmarkEnd w:id="223"/>
+      <w:bookmarkEnd w:id="224"/>
     </w:p>
     <w:p>
       <w:pPr>
@@ -12610,21 +13539,21 @@
       <w:pPr>
         <w:pStyle w:val="Heading1"/>
       </w:pPr>
-      <w:bookmarkStart w:id="221" w:name="_Toc183099299"/>
-      <w:bookmarkStart w:id="222" w:name="_Toc185323584"/>
+      <w:bookmarkStart w:id="225" w:name="_Toc183099299"/>
+      <w:bookmarkStart w:id="226" w:name="_Toc185323584"/>
       <w:r>
         <w:lastRenderedPageBreak/>
         <w:t>Software</w:t>
       </w:r>
-      <w:bookmarkEnd w:id="221"/>
-      <w:bookmarkEnd w:id="222"/>
+      <w:bookmarkEnd w:id="225"/>
+      <w:bookmarkEnd w:id="226"/>
       <w:r>
         <w:fldChar w:fldCharType="begin"/>
       </w:r>
       <w:r>
         <w:instrText xml:space="preserve"> TC "</w:instrText>
       </w:r>
-      <w:bookmarkStart w:id="223" w:name="_Toc183094459"/>
+      <w:bookmarkStart w:id="227" w:name="_Toc183094459"/>
       <w:r>
         <w:instrText>4.</w:instrText>
       </w:r>
@@ -12632,7 +13561,7 @@
         <w:tab/>
         <w:instrText>Software</w:instrText>
       </w:r>
-      <w:bookmarkEnd w:id="223"/>
+      <w:bookmarkEnd w:id="227"/>
       <w:r>
         <w:instrText xml:space="preserve">" \f C \l "1" </w:instrText>
       </w:r>
@@ -12644,13 +13573,13 @@
       <w:pPr>
         <w:pStyle w:val="Heading2"/>
       </w:pPr>
-      <w:bookmarkStart w:id="224" w:name="_Toc185323585"/>
-      <w:bookmarkStart w:id="225" w:name="_Toc185323586"/>
-      <w:bookmarkEnd w:id="224"/>
+      <w:bookmarkStart w:id="228" w:name="_Toc185323585"/>
+      <w:bookmarkStart w:id="229" w:name="_Toc185323586"/>
+      <w:bookmarkEnd w:id="228"/>
       <w:r>
         <w:t>Data management</w:t>
       </w:r>
-      <w:bookmarkEnd w:id="225"/>
+      <w:bookmarkEnd w:id="229"/>
       <w:r>
         <w:t xml:space="preserve"> </w:t>
       </w:r>
@@ -12702,7 +13631,29 @@
           <w:szCs w:val="22"/>
           <w:highlight w:val="yellow"/>
         </w:rPr>
-        <w:t>(include randomisation systems, outcome data, safety data plus any ancillary datasets used such as direct patient data entry systems, laboratory systems or others where data will be exported and passed directly to the statisticians for analysis)</w:t>
+        <w:t xml:space="preserve">(include </w:t>
+      </w:r>
+      <w:proofErr w:type="spellStart"/>
+      <w:r>
+        <w:rPr>
+          <w:i/>
+          <w:iCs/>
+          <w:sz w:val="22"/>
+          <w:szCs w:val="22"/>
+          <w:highlight w:val="yellow"/>
+        </w:rPr>
+        <w:t>randomisation</w:t>
+      </w:r>
+      <w:proofErr w:type="spellEnd"/>
+      <w:r>
+        <w:rPr>
+          <w:i/>
+          <w:iCs/>
+          <w:sz w:val="22"/>
+          <w:szCs w:val="22"/>
+          <w:highlight w:val="yellow"/>
+        </w:rPr>
+        <w:t xml:space="preserve"> systems, outcome data, safety data plus any ancillary datasets used such as direct patient data entry systems, laboratory systems or others where data will be exported and passed directly to the statisticians for analysis)</w:t>
       </w:r>
     </w:p>
     <w:p>
@@ -12729,7 +13680,7 @@
           <w:szCs w:val="22"/>
         </w:rPr>
       </w:pPr>
-      <w:bookmarkStart w:id="226" w:name="_Toc185323587"/>
+      <w:bookmarkStart w:id="230" w:name="_Toc185323587"/>
       <w:r>
         <w:t>A</w:t>
       </w:r>
@@ -12739,7 +13690,7 @@
       <w:r>
         <w:t>software</w:t>
       </w:r>
-      <w:bookmarkEnd w:id="226"/>
+      <w:bookmarkEnd w:id="230"/>
       <w:r>
         <w:rPr>
           <w:sz w:val="22"/>
@@ -12844,15 +13795,19 @@
       <w:pPr>
         <w:pStyle w:val="Heading1"/>
       </w:pPr>
-      <w:bookmarkStart w:id="227" w:name="_Toc183099300"/>
-      <w:bookmarkStart w:id="228" w:name="_Toc185323588"/>
-      <w:commentRangeStart w:id="229"/>
-      <w:r>
-        <w:t>Scoring of outcome measures</w:t>
-      </w:r>
-      <w:bookmarkEnd w:id="227"/>
-      <w:bookmarkEnd w:id="228"/>
-      <w:commentRangeEnd w:id="229"/>
+      <w:bookmarkStart w:id="231" w:name="_Toc183099300"/>
+      <w:bookmarkStart w:id="232" w:name="_Toc185323588"/>
+      <w:commentRangeStart w:id="233"/>
+      <w:r>
+        <w:t xml:space="preserve">Scoring of outcome </w:t>
+      </w:r>
+      <w:commentRangeStart w:id="234"/>
+      <w:r>
+        <w:t>measures</w:t>
+      </w:r>
+      <w:bookmarkEnd w:id="231"/>
+      <w:bookmarkEnd w:id="232"/>
+      <w:commentRangeEnd w:id="233"/>
       <w:r>
         <w:rPr>
           <w:rStyle w:val="CommentReference"/>
@@ -12861,7 +13816,18 @@
           <w:kern w:val="0"/>
           <w:lang w:val="en-US"/>
         </w:rPr>
-        <w:commentReference w:id="229"/>
+        <w:commentReference w:id="233"/>
+      </w:r>
+      <w:commentRangeEnd w:id="234"/>
+      <w:r>
+        <w:rPr>
+          <w:rStyle w:val="CommentReference"/>
+          <w:b w:val="0"/>
+          <w:bCs w:val="0"/>
+          <w:kern w:val="0"/>
+          <w:lang w:val="en-US"/>
+        </w:rPr>
+        <w:commentReference w:id="234"/>
       </w:r>
     </w:p>
     <w:p>
@@ -13316,6 +14282,44 @@
           <w:lang w:val="en-GB"/>
         </w:rPr>
       </w:pPr>
+      <w:ins w:id="235" w:author="Hassan Jafari" w:date="2025-11-28T14:31:00Z" w16du:dateUtc="2025-11-28T14:31:00Z">
+        <w:r>
+          <w:rPr>
+            <w:lang w:val="en-GB"/>
+          </w:rPr>
+          <w:br/>
+        </w:r>
+      </w:ins>
+      <w:ins w:id="236" w:author="Hassan Jafari" w:date="2025-11-28T14:32:00Z" w16du:dateUtc="2025-11-28T14:32:00Z">
+        <w:r>
+          <w:rPr>
+            <w:lang w:val="en-GB"/>
+          </w:rPr>
+          <w:t>{{</w:t>
+        </w:r>
+        <w:proofErr w:type="spellStart"/>
+        <w:r>
+          <w:rPr>
+            <w:lang w:val="en-GB"/>
+          </w:rPr>
+          <w:t>table_outcomes</w:t>
+        </w:r>
+        <w:proofErr w:type="spellEnd"/>
+        <w:r>
+          <w:rPr>
+            <w:lang w:val="en-GB"/>
+          </w:rPr>
+          <w:t>}}</w:t>
+        </w:r>
+      </w:ins>
+      <w:ins w:id="237" w:author="Hassan Jafari" w:date="2025-11-28T14:31:00Z" w16du:dateUtc="2025-11-28T14:31:00Z">
+        <w:r>
+          <w:rPr>
+            <w:lang w:val="en-GB"/>
+          </w:rPr>
+          <w:br/>
+        </w:r>
+      </w:ins>
     </w:p>
     <w:p>
       <w:r>
@@ -13379,7 +14383,15 @@
     <w:p/>
     <w:p>
       <w:r>
-        <w:t>{{missing_items_in_scales}}</w:t>
+        <w:t>{{</w:t>
+      </w:r>
+      <w:proofErr w:type="spellStart"/>
+      <w:r>
+        <w:t>missing_items_in_scales</w:t>
+      </w:r>
+      <w:proofErr w:type="spellEnd"/>
+      <w:r>
+        <w:t>}}</w:t>
       </w:r>
     </w:p>
     <w:p>
@@ -13416,46 +14428,38 @@
       <w:pPr>
         <w:pStyle w:val="Heading1"/>
       </w:pPr>
-      <w:bookmarkStart w:id="230" w:name="_Toc183095060"/>
-      <w:bookmarkStart w:id="231" w:name="_Toc183095166"/>
-      <w:bookmarkStart w:id="232" w:name="_Toc183095512"/>
-      <w:bookmarkStart w:id="233" w:name="_Toc183099303"/>
-      <w:bookmarkStart w:id="234" w:name="_Toc183100594"/>
-      <w:bookmarkStart w:id="235" w:name="_Toc185323591"/>
-      <w:bookmarkStart w:id="236" w:name="_Toc183095061"/>
-      <w:bookmarkStart w:id="237" w:name="_Toc183095167"/>
-      <w:bookmarkStart w:id="238" w:name="_Toc183095513"/>
-      <w:bookmarkStart w:id="239" w:name="_Toc183099304"/>
-      <w:bookmarkStart w:id="240" w:name="_Toc183100595"/>
-      <w:bookmarkStart w:id="241" w:name="_Toc185323592"/>
-      <w:bookmarkStart w:id="242" w:name="_Toc183095062"/>
-      <w:bookmarkStart w:id="243" w:name="_Toc183095168"/>
-      <w:bookmarkStart w:id="244" w:name="_Toc183095514"/>
-      <w:bookmarkStart w:id="245" w:name="_Toc183099305"/>
-      <w:bookmarkStart w:id="246" w:name="_Toc183100596"/>
-      <w:bookmarkStart w:id="247" w:name="_Toc185323593"/>
-      <w:bookmarkStart w:id="248" w:name="_Toc183095063"/>
-      <w:bookmarkStart w:id="249" w:name="_Toc183095169"/>
-      <w:bookmarkStart w:id="250" w:name="_Toc183095515"/>
-      <w:bookmarkStart w:id="251" w:name="_Toc183099306"/>
-      <w:bookmarkStart w:id="252" w:name="_Toc183100597"/>
-      <w:bookmarkStart w:id="253" w:name="_Toc185323594"/>
-      <w:bookmarkStart w:id="254" w:name="_Toc183095064"/>
-      <w:bookmarkStart w:id="255" w:name="_Toc183095170"/>
-      <w:bookmarkStart w:id="256" w:name="_Toc183095516"/>
-      <w:bookmarkStart w:id="257" w:name="_Toc183099307"/>
-      <w:bookmarkStart w:id="258" w:name="_Toc183100598"/>
-      <w:bookmarkStart w:id="259" w:name="_Toc185323595"/>
-      <w:bookmarkStart w:id="260" w:name="_Toc183099308"/>
-      <w:bookmarkStart w:id="261" w:name="_Toc185323596"/>
-      <w:bookmarkEnd w:id="230"/>
-      <w:bookmarkEnd w:id="231"/>
-      <w:bookmarkEnd w:id="232"/>
-      <w:bookmarkEnd w:id="233"/>
-      <w:bookmarkEnd w:id="234"/>
-      <w:bookmarkEnd w:id="235"/>
-      <w:bookmarkEnd w:id="236"/>
-      <w:bookmarkEnd w:id="237"/>
+      <w:bookmarkStart w:id="238" w:name="_Toc183095060"/>
+      <w:bookmarkStart w:id="239" w:name="_Toc183095166"/>
+      <w:bookmarkStart w:id="240" w:name="_Toc183095512"/>
+      <w:bookmarkStart w:id="241" w:name="_Toc183099303"/>
+      <w:bookmarkStart w:id="242" w:name="_Toc183100594"/>
+      <w:bookmarkStart w:id="243" w:name="_Toc185323591"/>
+      <w:bookmarkStart w:id="244" w:name="_Toc183095061"/>
+      <w:bookmarkStart w:id="245" w:name="_Toc183095167"/>
+      <w:bookmarkStart w:id="246" w:name="_Toc183095513"/>
+      <w:bookmarkStart w:id="247" w:name="_Toc183099304"/>
+      <w:bookmarkStart w:id="248" w:name="_Toc183100595"/>
+      <w:bookmarkStart w:id="249" w:name="_Toc185323592"/>
+      <w:bookmarkStart w:id="250" w:name="_Toc183095062"/>
+      <w:bookmarkStart w:id="251" w:name="_Toc183095168"/>
+      <w:bookmarkStart w:id="252" w:name="_Toc183095514"/>
+      <w:bookmarkStart w:id="253" w:name="_Toc183099305"/>
+      <w:bookmarkStart w:id="254" w:name="_Toc183100596"/>
+      <w:bookmarkStart w:id="255" w:name="_Toc185323593"/>
+      <w:bookmarkStart w:id="256" w:name="_Toc183095063"/>
+      <w:bookmarkStart w:id="257" w:name="_Toc183095169"/>
+      <w:bookmarkStart w:id="258" w:name="_Toc183095515"/>
+      <w:bookmarkStart w:id="259" w:name="_Toc183099306"/>
+      <w:bookmarkStart w:id="260" w:name="_Toc183100597"/>
+      <w:bookmarkStart w:id="261" w:name="_Toc185323594"/>
+      <w:bookmarkStart w:id="262" w:name="_Toc183095064"/>
+      <w:bookmarkStart w:id="263" w:name="_Toc183095170"/>
+      <w:bookmarkStart w:id="264" w:name="_Toc183095516"/>
+      <w:bookmarkStart w:id="265" w:name="_Toc183099307"/>
+      <w:bookmarkStart w:id="266" w:name="_Toc183100598"/>
+      <w:bookmarkStart w:id="267" w:name="_Toc185323595"/>
+      <w:bookmarkStart w:id="268" w:name="_Toc183099308"/>
+      <w:bookmarkStart w:id="269" w:name="_Toc185323596"/>
       <w:bookmarkEnd w:id="238"/>
       <w:bookmarkEnd w:id="239"/>
       <w:bookmarkEnd w:id="240"/>
@@ -13478,6 +14482,14 @@
       <w:bookmarkEnd w:id="257"/>
       <w:bookmarkEnd w:id="258"/>
       <w:bookmarkEnd w:id="259"/>
+      <w:bookmarkEnd w:id="260"/>
+      <w:bookmarkEnd w:id="261"/>
+      <w:bookmarkEnd w:id="262"/>
+      <w:bookmarkEnd w:id="263"/>
+      <w:bookmarkEnd w:id="264"/>
+      <w:bookmarkEnd w:id="265"/>
+      <w:bookmarkEnd w:id="266"/>
+      <w:bookmarkEnd w:id="267"/>
       <w:r>
         <w:lastRenderedPageBreak/>
         <w:t xml:space="preserve">7. </w:t>
@@ -13485,19 +14497,19 @@
       <w:r>
         <w:t>Reference list</w:t>
       </w:r>
-      <w:bookmarkEnd w:id="260"/>
-      <w:bookmarkEnd w:id="261"/>
+      <w:bookmarkEnd w:id="268"/>
+      <w:bookmarkEnd w:id="269"/>
       <w:r>
         <w:fldChar w:fldCharType="begin"/>
       </w:r>
       <w:r>
         <w:instrText xml:space="preserve"> TC "</w:instrText>
       </w:r>
-      <w:bookmarkStart w:id="262" w:name="_Toc183094462"/>
+      <w:bookmarkStart w:id="270" w:name="_Toc183094462"/>
       <w:r>
         <w:instrText>Reference list</w:instrText>
       </w:r>
-      <w:bookmarkEnd w:id="262"/>
+      <w:bookmarkEnd w:id="270"/>
       <w:r>
         <w:instrText xml:space="preserve">" \f C \l "1" </w:instrText>
       </w:r>
@@ -13719,7 +14731,7 @@
 
 <file path=word/comments.xml><?xml version="1.0" encoding="utf-8"?>
 <w:comments xmlns:wpc="http://schemas.microsoft.com/office/word/2010/wordprocessingCanvas" xmlns:cx="http://schemas.microsoft.com/office/drawing/2014/chartex" xmlns:cx1="http://schemas.microsoft.com/office/drawing/2015/9/8/chartex" xmlns:cx2="http://schemas.microsoft.com/office/drawing/2015/10/21/chartex" xmlns:cx3="http://schemas.microsoft.com/office/drawing/2016/5/9/chartex" xmlns:cx4="http://schemas.microsoft.com/office/drawing/2016/5/10/chartex" xmlns:cx5="http://schemas.microsoft.com/office/drawing/2016/5/11/chartex" xmlns:cx6="http://schemas.microsoft.com/office/drawing/2016/5/12/chartex" xmlns:cx7="http://schemas.microsoft.com/office/drawing/2016/5/13/chartex" xmlns:cx8="http://schemas.microsoft.com/office/drawing/2016/5/14/chartex" xmlns:mc="http://schemas.openxmlformats.org/markup-compatibility/2006" xmlns:aink="http://schemas.microsoft.com/office/drawing/2016/ink" xmlns:am3d="http://schemas.microsoft.com/office/drawing/2017/model3d" xmlns:o="urn:schemas-microsoft-com:office:office" xmlns:oel="http://schemas.microsoft.com/office/2019/extlst" xmlns:r="http://schemas.openxmlformats.org/officeDocument/2006/relationships" xmlns:m="http://schemas.openxmlformats.org/officeDocument/2006/math" xmlns:v="urn:schemas-microsoft-com:vml" xmlns:wp14="http://schemas.microsoft.com/office/word/2010/wordprocessingDrawing" xmlns:wp="http://schemas.openxmlformats.org/drawingml/2006/wordprocessingDrawing" xmlns:w10="urn:schemas-microsoft-com:office:word" xmlns:w="http://schemas.openxmlformats.org/wordprocessingml/2006/main" xmlns:w14="http://schemas.microsoft.com/office/word/2010/wordml" xmlns:w15="http://schemas.microsoft.com/office/word/2012/wordml" xmlns:w16cex="http://schemas.microsoft.com/office/word/2018/wordml/cex" xmlns:w16cid="http://schemas.microsoft.com/office/word/2016/wordml/cid" xmlns:w16="http://schemas.microsoft.com/office/word/2018/wordml" xmlns:w16du="http://schemas.microsoft.com/office/word/2023/wordml/word16du" xmlns:w16sdtdh="http://schemas.microsoft.com/office/word/2020/wordml/sdtdatahash" xmlns:w16sdtfl="http://schemas.microsoft.com/office/word/2024/wordml/sdtformatlock" xmlns:w16se="http://schemas.microsoft.com/office/word/2015/wordml/symex" xmlns:wpg="http://schemas.microsoft.com/office/word/2010/wordprocessingGroup" xmlns:wpi="http://schemas.microsoft.com/office/word/2010/wordprocessingInk" xmlns:wne="http://schemas.microsoft.com/office/word/2006/wordml" xmlns:wps="http://schemas.microsoft.com/office/word/2010/wordprocessingShape" mc:Ignorable="w14 w15 w16se w16cid w16 w16cex w16sdtdh w16sdtfl w16du wp14">
-  <w:comment w:id="4" w:author="Gordon Forbes" w:date="2025-11-21T16:48:00Z" w:initials="GF">
+  <w:comment w:id="6" w:author="Gordon Forbes" w:date="2025-11-21T16:48:00Z" w:initials="GF">
     <w:p>
       <w:r>
         <w:rPr>
@@ -13756,7 +14768,7 @@
       </w:r>
     </w:p>
   </w:comment>
-  <w:comment w:id="7" w:author="Petrina Chu" w:date="2025-11-27T10:37:00Z" w:initials="PC">
+  <w:comment w:id="9" w:author="Petrina Chu" w:date="2025-11-27T10:37:00Z" w:initials="PC">
     <w:p>
       <w:pPr>
         <w:pStyle w:val="CommentText"/>
@@ -13772,7 +14784,23 @@
       </w:r>
     </w:p>
   </w:comment>
-  <w:comment w:id="39" w:author="Hassan Jafari" w:date="2025-10-22T11:21:00Z" w:initials="HJ">
+  <w:comment w:id="10" w:author="Hassan Jafari" w:date="2025-11-28T13:32:00Z" w:initials="HJ">
+    <w:p>
+      <w:pPr>
+        <w:pStyle w:val="CommentText"/>
+      </w:pPr>
+      <w:r>
+        <w:rPr>
+          <w:rStyle w:val="CommentReference"/>
+        </w:rPr>
+        <w:annotationRef/>
+      </w:r>
+      <w:r>
+        <w:t>Added</w:t>
+      </w:r>
+    </w:p>
+  </w:comment>
+  <w:comment w:id="43" w:author="Hassan Jafari" w:date="2025-10-22T11:21:00Z" w:initials="HJ">
     <w:p>
       <w:pPr>
         <w:pStyle w:val="CommentText"/>
@@ -13792,7 +14820,7 @@
       </w:r>
     </w:p>
   </w:comment>
-  <w:comment w:id="40" w:author="Gordon Forbes" w:date="2025-11-25T12:01:00Z" w:initials="GF">
+  <w:comment w:id="44" w:author="Gordon Forbes" w:date="2025-11-25T12:01:00Z" w:initials="GF">
     <w:p>
       <w:r>
         <w:rPr>
@@ -13809,7 +14837,7 @@
       </w:r>
     </w:p>
   </w:comment>
-  <w:comment w:id="51" w:author="Gordon Forbes" w:date="2025-11-25T12:03:00Z" w:initials="GF">
+  <w:comment w:id="55" w:author="Gordon Forbes" w:date="2025-11-25T12:03:00Z" w:initials="GF">
     <w:p>
       <w:r>
         <w:rPr>
@@ -13859,7 +14887,7 @@
     </w:p>
     <w:p/>
   </w:comment>
-  <w:comment w:id="107" w:author="Hassan Jafari" w:date="2025-11-16T17:56:00Z" w:initials="HJ">
+  <w:comment w:id="111" w:author="Hassan Jafari" w:date="2025-11-16T17:56:00Z" w:initials="HJ">
     <w:p>
       <w:pPr>
         <w:pStyle w:val="CommentText"/>
@@ -13875,7 +14903,7 @@
       </w:r>
     </w:p>
   </w:comment>
-  <w:comment w:id="108" w:author="Petrina Chu" w:date="2025-11-27T10:57:00Z" w:initials="PC">
+  <w:comment w:id="112" w:author="Petrina Chu" w:date="2025-11-27T10:57:00Z" w:initials="PC">
     <w:p>
       <w:pPr>
         <w:pStyle w:val="CommentText"/>
@@ -13891,7 +14919,7 @@
       </w:r>
     </w:p>
   </w:comment>
-  <w:comment w:id="116" w:author="Hassan Jafari" w:date="2025-11-16T17:56:00Z" w:initials="HJ">
+  <w:comment w:id="120" w:author="Hassan Jafari" w:date="2025-11-16T17:56:00Z" w:initials="HJ">
     <w:p>
       <w:pPr>
         <w:pStyle w:val="CommentText"/>
@@ -13907,7 +14935,7 @@
       </w:r>
     </w:p>
   </w:comment>
-  <w:comment w:id="179" w:author="Hassan Jafari" w:date="2025-10-22T14:24:00Z" w:initials="HJ">
+  <w:comment w:id="183" w:author="Hassan Jafari" w:date="2025-10-22T14:24:00Z" w:initials="HJ">
     <w:p>
       <w:pPr>
         <w:pStyle w:val="CommentText"/>
@@ -13923,7 +14951,7 @@
       </w:r>
     </w:p>
   </w:comment>
-  <w:comment w:id="200" w:author="Hassan Jafari" w:date="2025-10-22T14:25:00Z" w:initials="HJ">
+  <w:comment w:id="204" w:author="Hassan Jafari" w:date="2025-10-22T14:25:00Z" w:initials="HJ">
     <w:p>
       <w:pPr>
         <w:pStyle w:val="CommentText"/>
@@ -13939,7 +14967,7 @@
       </w:r>
     </w:p>
   </w:comment>
-  <w:comment w:id="229" w:author="Hassan Jafari" w:date="2025-10-22T14:29:00Z" w:initials="HJ">
+  <w:comment w:id="233" w:author="Hassan Jafari" w:date="2025-10-22T14:29:00Z" w:initials="HJ">
     <w:p>
       <w:pPr>
         <w:pStyle w:val="CommentText"/>
@@ -13956,6 +14984,22 @@
       <w:r>
         <w:br/>
         <w:t>what do you think?</w:t>
+      </w:r>
+    </w:p>
+  </w:comment>
+  <w:comment w:id="234" w:author="Hassan Jafari" w:date="2025-11-28T14:34:00Z" w:initials="HJ">
+    <w:p>
+      <w:pPr>
+        <w:pStyle w:val="CommentText"/>
+      </w:pPr>
+      <w:r>
+        <w:rPr>
+          <w:rStyle w:val="CommentReference"/>
+        </w:rPr>
+        <w:annotationRef/>
+      </w:r>
+      <w:r>
+        <w:t>Table of outcomes added to the code</w:t>
       </w:r>
     </w:p>
   </w:comment>
@@ -13966,6 +15010,7 @@
 <w15:commentsEx xmlns:wpc="http://schemas.microsoft.com/office/word/2010/wordprocessingCanvas" xmlns:cx="http://schemas.microsoft.com/office/drawing/2014/chartex" xmlns:cx1="http://schemas.microsoft.com/office/drawing/2015/9/8/chartex" xmlns:cx2="http://schemas.microsoft.com/office/drawing/2015/10/21/chartex" xmlns:cx3="http://schemas.microsoft.com/office/drawing/2016/5/9/chartex" xmlns:cx4="http://schemas.microsoft.com/office/drawing/2016/5/10/chartex" xmlns:cx5="http://schemas.microsoft.com/office/drawing/2016/5/11/chartex" xmlns:cx6="http://schemas.microsoft.com/office/drawing/2016/5/12/chartex" xmlns:cx7="http://schemas.microsoft.com/office/drawing/2016/5/13/chartex" xmlns:cx8="http://schemas.microsoft.com/office/drawing/2016/5/14/chartex" xmlns:mc="http://schemas.openxmlformats.org/markup-compatibility/2006" xmlns:aink="http://schemas.microsoft.com/office/drawing/2016/ink" xmlns:am3d="http://schemas.microsoft.com/office/drawing/2017/model3d" xmlns:o="urn:schemas-microsoft-com:office:office" xmlns:oel="http://schemas.microsoft.com/office/2019/extlst" xmlns:r="http://schemas.openxmlformats.org/officeDocument/2006/relationships" xmlns:m="http://schemas.openxmlformats.org/officeDocument/2006/math" xmlns:v="urn:schemas-microsoft-com:vml" xmlns:wp14="http://schemas.microsoft.com/office/word/2010/wordprocessingDrawing" xmlns:wp="http://schemas.openxmlformats.org/drawingml/2006/wordprocessingDrawing" xmlns:w10="urn:schemas-microsoft-com:office:word" xmlns:w="http://schemas.openxmlformats.org/wordprocessingml/2006/main" xmlns:w14="http://schemas.microsoft.com/office/word/2010/wordml" xmlns:w15="http://schemas.microsoft.com/office/word/2012/wordml" xmlns:w16cex="http://schemas.microsoft.com/office/word/2018/wordml/cex" xmlns:w16cid="http://schemas.microsoft.com/office/word/2016/wordml/cid" xmlns:w16="http://schemas.microsoft.com/office/word/2018/wordml" xmlns:w16du="http://schemas.microsoft.com/office/word/2023/wordml/word16du" xmlns:w16sdtdh="http://schemas.microsoft.com/office/word/2020/wordml/sdtdatahash" xmlns:w16sdtfl="http://schemas.microsoft.com/office/word/2024/wordml/sdtformatlock" xmlns:w16se="http://schemas.microsoft.com/office/word/2015/wordml/symex" xmlns:wpg="http://schemas.microsoft.com/office/word/2010/wordprocessingGroup" xmlns:wpi="http://schemas.microsoft.com/office/word/2010/wordprocessingInk" xmlns:wne="http://schemas.microsoft.com/office/word/2006/wordml" xmlns:wps="http://schemas.microsoft.com/office/word/2010/wordprocessingShape" mc:Ignorable="w14 w15 w16se w16cid w16 w16cex w16sdtdh w16sdtfl w16du wp14">
   <w15:commentEx w15:paraId="03247B25" w15:done="0"/>
   <w15:commentEx w15:paraId="44192926" w15:done="0"/>
+  <w15:commentEx w15:paraId="2CA0448C" w15:paraIdParent="44192926" w15:done="0"/>
   <w15:commentEx w15:paraId="5DFAE595" w15:done="0"/>
   <w15:commentEx w15:paraId="7A1DFB76" w15:paraIdParent="5DFAE595" w15:done="0"/>
   <w15:commentEx w15:paraId="1F25950F" w15:done="0"/>
@@ -13974,7 +15019,8 @@
   <w15:commentEx w15:paraId="3A8DF62B" w15:done="0"/>
   <w15:commentEx w15:paraId="04BF3A6C" w15:done="1"/>
   <w15:commentEx w15:paraId="61C61E43" w15:done="0"/>
-  <w15:commentEx w15:paraId="333DF309" w15:done="0"/>
+  <w15:commentEx w15:paraId="333DF309" w15:done="1"/>
+  <w15:commentEx w15:paraId="75661254" w15:done="0"/>
 </w15:commentsEx>
 </file>
 
@@ -13982,15 +15028,29 @@
 <w16cex:commentsExtensible xmlns:wpc="http://schemas.microsoft.com/office/word/2010/wordprocessingCanvas" xmlns:cx="http://schemas.microsoft.com/office/drawing/2014/chartex" xmlns:cx1="http://schemas.microsoft.com/office/drawing/2015/9/8/chartex" xmlns:cx2="http://schemas.microsoft.com/office/drawing/2015/10/21/chartex" xmlns:cx3="http://schemas.microsoft.com/office/drawing/2016/5/9/chartex" xmlns:cx4="http://schemas.microsoft.com/office/drawing/2016/5/10/chartex" xmlns:cx5="http://schemas.microsoft.com/office/drawing/2016/5/11/chartex" xmlns:cx6="http://schemas.microsoft.com/office/drawing/2016/5/12/chartex" xmlns:cx7="http://schemas.microsoft.com/office/drawing/2016/5/13/chartex" xmlns:cx8="http://schemas.microsoft.com/office/drawing/2016/5/14/chartex" xmlns:cr="http://schemas.microsoft.com/office/comments/2020/reactions" xmlns:mc="http://schemas.openxmlformats.org/markup-compatibility/2006" xmlns:aink="http://schemas.microsoft.com/office/drawing/2016/ink" xmlns:am3d="http://schemas.microsoft.com/office/drawing/2017/model3d" xmlns:o="urn:schemas-microsoft-com:office:office" xmlns:oel="http://schemas.microsoft.com/office/2019/extlst" xmlns:r="http://schemas.openxmlformats.org/officeDocument/2006/relationships" xmlns:m="http://schemas.openxmlformats.org/officeDocument/2006/math" xmlns:v="urn:schemas-microsoft-com:vml" xmlns:wp14="http://schemas.microsoft.com/office/word/2010/wordprocessingDrawing" xmlns:wp="http://schemas.openxmlformats.org/drawingml/2006/wordprocessingDrawing" xmlns:w10="urn:schemas-microsoft-com:office:word" xmlns:w="http://schemas.openxmlformats.org/wordprocessingml/2006/main" xmlns:w14="http://schemas.microsoft.com/office/word/2010/wordml" xmlns:w15="http://schemas.microsoft.com/office/word/2012/wordml" xmlns:w16cex="http://schemas.microsoft.com/office/word/2018/wordml/cex" xmlns:w16cid="http://schemas.microsoft.com/office/word/2016/wordml/cid" xmlns:w16="http://schemas.microsoft.com/office/word/2018/wordml" xmlns:w16du="http://schemas.microsoft.com/office/word/2023/wordml/word16du" xmlns:w16sdtdh="http://schemas.microsoft.com/office/word/2020/wordml/sdtdatahash" xmlns:w16sdtfl="http://schemas.microsoft.com/office/word/2024/wordml/sdtformatlock" xmlns:w16se="http://schemas.microsoft.com/office/word/2015/wordml/symex" xmlns:wpg="http://schemas.microsoft.com/office/word/2010/wordprocessingGroup" xmlns:wpi="http://schemas.microsoft.com/office/word/2010/wordprocessingInk" xmlns:wne="http://schemas.microsoft.com/office/word/2006/wordml" xmlns:wps="http://schemas.microsoft.com/office/word/2010/wordprocessingShape" mc:Ignorable="w14 w15 w16se w16cid w16 w16cex w16sdtdh w16sdtfl cr w16du wp14">
   <w16cex:commentExtensible w16cex:durableId="3416BAD3" w16cex:dateUtc="2025-11-21T16:48:00Z"/>
   <w16cex:commentExtensible w16cex:durableId="17B0279C" w16cex:dateUtc="2025-11-27T10:37:00Z"/>
+  <w16cex:commentExtensible w16cex:durableId="6D590AF5" w16cex:dateUtc="2025-11-28T13:32:00Z"/>
   <w16cex:commentExtensible w16cex:durableId="21058514" w16cex:dateUtc="2025-10-22T10:21:00Z"/>
   <w16cex:commentExtensible w16cex:durableId="53FA8417" w16cex:dateUtc="2025-11-25T12:01:00Z"/>
   <w16cex:commentExtensible w16cex:durableId="486E5017" w16cex:dateUtc="2025-11-25T12:03:00Z"/>
   <w16cex:commentExtensible w16cex:durableId="71262F9B" w16cex:dateUtc="2025-11-16T17:56:00Z"/>
-  <w16cex:commentExtensible w16cex:durableId="40548632" w16cex:dateUtc="2025-11-27T10:57:00Z"/>
+  <w16cex:commentExtensible w16cex:durableId="40548632" w16cex:dateUtc="2025-11-27T10:57:00Z">
+    <w16cex:extLst>
+      <w16:ext w16:uri="{CE6994B0-6A32-4C9F-8C6B-6E91EDA988CE}">
+        <cr:reactions xmlns:cr="http://schemas.microsoft.com/office/comments/2020/reactions">
+          <cr:reaction reactionType="1">
+            <cr:reactionInfo dateUtc="2025-11-28T13:37:47Z">
+              <cr:user userId="S::k1806653@kcl.ac.uk::34669cc9-e636-4f1b-91bf-eb2587bca82d" userProvider="AD" userName="Hassan Jafari"/>
+            </cr:reactionInfo>
+          </cr:reaction>
+        </cr:reactions>
+      </w16:ext>
+    </w16cex:extLst>
+  </w16cex:commentExtensible>
   <w16cex:commentExtensible w16cex:durableId="674A78E1" w16cex:dateUtc="2025-11-16T17:56:00Z"/>
   <w16cex:commentExtensible w16cex:durableId="4E2BF792" w16cex:dateUtc="2025-10-22T13:24:00Z"/>
   <w16cex:commentExtensible w16cex:durableId="3EA0E8F2" w16cex:dateUtc="2025-10-22T13:25:00Z"/>
   <w16cex:commentExtensible w16cex:durableId="10457FF6" w16cex:dateUtc="2025-10-22T13:29:00Z"/>
+  <w16cex:commentExtensible w16cex:durableId="21B208CF" w16cex:dateUtc="2025-11-28T14:34:00Z"/>
 </w16cex:commentsExtensible>
 </file>
 
@@ -13998,6 +15058,7 @@
 <w16cid:commentsIds xmlns:wpc="http://schemas.microsoft.com/office/word/2010/wordprocessingCanvas" xmlns:cx="http://schemas.microsoft.com/office/drawing/2014/chartex" xmlns:cx1="http://schemas.microsoft.com/office/drawing/2015/9/8/chartex" xmlns:cx2="http://schemas.microsoft.com/office/drawing/2015/10/21/chartex" xmlns:cx3="http://schemas.microsoft.com/office/drawing/2016/5/9/chartex" xmlns:cx4="http://schemas.microsoft.com/office/drawing/2016/5/10/chartex" xmlns:cx5="http://schemas.microsoft.com/office/drawing/2016/5/11/chartex" xmlns:cx6="http://schemas.microsoft.com/office/drawing/2016/5/12/chartex" xmlns:cx7="http://schemas.microsoft.com/office/drawing/2016/5/13/chartex" xmlns:cx8="http://schemas.microsoft.com/office/drawing/2016/5/14/chartex" xmlns:mc="http://schemas.openxmlformats.org/markup-compatibility/2006" xmlns:aink="http://schemas.microsoft.com/office/drawing/2016/ink" xmlns:am3d="http://schemas.microsoft.com/office/drawing/2017/model3d" xmlns:o="urn:schemas-microsoft-com:office:office" xmlns:oel="http://schemas.microsoft.com/office/2019/extlst" xmlns:r="http://schemas.openxmlformats.org/officeDocument/2006/relationships" xmlns:m="http://schemas.openxmlformats.org/officeDocument/2006/math" xmlns:v="urn:schemas-microsoft-com:vml" xmlns:wp14="http://schemas.microsoft.com/office/word/2010/wordprocessingDrawing" xmlns:wp="http://schemas.openxmlformats.org/drawingml/2006/wordprocessingDrawing" xmlns:w10="urn:schemas-microsoft-com:office:word" xmlns:w="http://schemas.openxmlformats.org/wordprocessingml/2006/main" xmlns:w14="http://schemas.microsoft.com/office/word/2010/wordml" xmlns:w15="http://schemas.microsoft.com/office/word/2012/wordml" xmlns:w16cex="http://schemas.microsoft.com/office/word/2018/wordml/cex" xmlns:w16cid="http://schemas.microsoft.com/office/word/2016/wordml/cid" xmlns:w16="http://schemas.microsoft.com/office/word/2018/wordml" xmlns:w16du="http://schemas.microsoft.com/office/word/2023/wordml/word16du" xmlns:w16sdtdh="http://schemas.microsoft.com/office/word/2020/wordml/sdtdatahash" xmlns:w16sdtfl="http://schemas.microsoft.com/office/word/2024/wordml/sdtformatlock" xmlns:w16se="http://schemas.microsoft.com/office/word/2015/wordml/symex" xmlns:wpg="http://schemas.microsoft.com/office/word/2010/wordprocessingGroup" xmlns:wpi="http://schemas.microsoft.com/office/word/2010/wordprocessingInk" xmlns:wne="http://schemas.microsoft.com/office/word/2006/wordml" xmlns:wps="http://schemas.microsoft.com/office/word/2010/wordprocessingShape" mc:Ignorable="w14 w15 w16se w16cid w16 w16cex w16sdtdh w16sdtfl w16du wp14">
   <w16cid:commentId w16cid:paraId="03247B25" w16cid:durableId="3416BAD3"/>
   <w16cid:commentId w16cid:paraId="44192926" w16cid:durableId="17B0279C"/>
+  <w16cid:commentId w16cid:paraId="2CA0448C" w16cid:durableId="6D590AF5"/>
   <w16cid:commentId w16cid:paraId="5DFAE595" w16cid:durableId="21058514"/>
   <w16cid:commentId w16cid:paraId="7A1DFB76" w16cid:durableId="53FA8417"/>
   <w16cid:commentId w16cid:paraId="1F25950F" w16cid:durableId="486E5017"/>
@@ -14007,6 +15068,7 @@
   <w16cid:commentId w16cid:paraId="04BF3A6C" w16cid:durableId="4E2BF792"/>
   <w16cid:commentId w16cid:paraId="61C61E43" w16cid:durableId="3EA0E8F2"/>
   <w16cid:commentId w16cid:paraId="333DF309" w16cid:durableId="10457FF6"/>
+  <w16cid:commentId w16cid:paraId="75661254" w16cid:durableId="21B208CF"/>
 </w16cid:commentsIds>
 </file>
 
@@ -14145,7 +15207,23 @@
         <w:sz w:val="20"/>
         <w:szCs w:val="20"/>
       </w:rPr>
-      <w:t>{{todays_date}}</w:t>
+      <w:t>{{</w:t>
+    </w:r>
+    <w:proofErr w:type="spellStart"/>
+    <w:r>
+      <w:rPr>
+        <w:sz w:val="20"/>
+        <w:szCs w:val="20"/>
+      </w:rPr>
+      <w:t>todays_date</w:t>
+    </w:r>
+    <w:proofErr w:type="spellEnd"/>
+    <w:r>
+      <w:rPr>
+        <w:sz w:val="20"/>
+        <w:szCs w:val="20"/>
+      </w:rPr>
+      <w:t>}}</w:t>
     </w:r>
     <w:r>
       <w:rPr>
@@ -14581,6 +15659,7 @@
       </w:rPr>
       <w:t>{</w:t>
     </w:r>
+    <w:proofErr w:type="spellStart"/>
     <w:r>
       <w:rPr>
         <w:i/>
@@ -14588,6 +15667,7 @@
       </w:rPr>
       <w:t>trial_acronym</w:t>
     </w:r>
+    <w:proofErr w:type="spellEnd"/>
     <w:r>
       <w:rPr>
         <w:i/>
@@ -19085,14 +20165,14 @@
 
 <file path=word/people.xml><?xml version="1.0" encoding="utf-8"?>
 <w15:people xmlns:wpc="http://schemas.microsoft.com/office/word/2010/wordprocessingCanvas" xmlns:cx="http://schemas.microsoft.com/office/drawing/2014/chartex" xmlns:cx1="http://schemas.microsoft.com/office/drawing/2015/9/8/chartex" xmlns:cx2="http://schemas.microsoft.com/office/drawing/2015/10/21/chartex" xmlns:cx3="http://schemas.microsoft.com/office/drawing/2016/5/9/chartex" xmlns:cx4="http://schemas.microsoft.com/office/drawing/2016/5/10/chartex" xmlns:cx5="http://schemas.microsoft.com/office/drawing/2016/5/11/chartex" xmlns:cx6="http://schemas.microsoft.com/office/drawing/2016/5/12/chartex" xmlns:cx7="http://schemas.microsoft.com/office/drawing/2016/5/13/chartex" xmlns:cx8="http://schemas.microsoft.com/office/drawing/2016/5/14/chartex" xmlns:mc="http://schemas.openxmlformats.org/markup-compatibility/2006" xmlns:aink="http://schemas.microsoft.com/office/drawing/2016/ink" xmlns:am3d="http://schemas.microsoft.com/office/drawing/2017/model3d" xmlns:o="urn:schemas-microsoft-com:office:office" xmlns:oel="http://schemas.microsoft.com/office/2019/extlst" xmlns:r="http://schemas.openxmlformats.org/officeDocument/2006/relationships" xmlns:m="http://schemas.openxmlformats.org/officeDocument/2006/math" xmlns:v="urn:schemas-microsoft-com:vml" xmlns:wp14="http://schemas.microsoft.com/office/word/2010/wordprocessingDrawing" xmlns:wp="http://schemas.openxmlformats.org/drawingml/2006/wordprocessingDrawing" xmlns:w10="urn:schemas-microsoft-com:office:word" xmlns:w="http://schemas.openxmlformats.org/wordprocessingml/2006/main" xmlns:w14="http://schemas.microsoft.com/office/word/2010/wordml" xmlns:w15="http://schemas.microsoft.com/office/word/2012/wordml" xmlns:w16cex="http://schemas.microsoft.com/office/word/2018/wordml/cex" xmlns:w16cid="http://schemas.microsoft.com/office/word/2016/wordml/cid" xmlns:w16="http://schemas.microsoft.com/office/word/2018/wordml" xmlns:w16du="http://schemas.microsoft.com/office/word/2023/wordml/word16du" xmlns:w16sdtdh="http://schemas.microsoft.com/office/word/2020/wordml/sdtdatahash" xmlns:w16sdtfl="http://schemas.microsoft.com/office/word/2024/wordml/sdtformatlock" xmlns:w16se="http://schemas.microsoft.com/office/word/2015/wordml/symex" xmlns:wpg="http://schemas.microsoft.com/office/word/2010/wordprocessingGroup" xmlns:wpi="http://schemas.microsoft.com/office/word/2010/wordprocessingInk" xmlns:wne="http://schemas.microsoft.com/office/word/2006/wordml" xmlns:wps="http://schemas.microsoft.com/office/word/2010/wordprocessingShape" mc:Ignorable="w14 w15 w16se w16cid w16 w16cex w16sdtdh w16sdtfl w16du wp14">
+  <w15:person w15:author="Hassan Jafari">
+    <w15:presenceInfo w15:providerId="AD" w15:userId="S::k1806653@kcl.ac.uk::34669cc9-e636-4f1b-91bf-eb2587bca82d"/>
+  </w15:person>
   <w15:person w15:author="Gordon Forbes">
     <w15:presenceInfo w15:providerId="AD" w15:userId="S::k1811974@kcl.ac.uk::7227b401-6869-4e99-b13c-21ab252975b9"/>
   </w15:person>
   <w15:person w15:author="Petrina Chu">
     <w15:presenceInfo w15:providerId="AD" w15:userId="S::k2150120@kcl.ac.uk::c55787be-bb8b-42f5-9540-e24134e59e82"/>
-  </w15:person>
-  <w15:person w15:author="Hassan Jafari">
-    <w15:presenceInfo w15:providerId="AD" w15:userId="S::k1806653@kcl.ac.uk::34669cc9-e636-4f1b-91bf-eb2587bca82d"/>
   </w15:person>
 </w15:people>
 </file>
@@ -20249,10 +21329,6 @@
 </file>
 
 <file path=customXml/item1.xml><?xml version="1.0" encoding="utf-8"?>
-<b:Sources xmlns:b="http://schemas.openxmlformats.org/officeDocument/2006/bibliography" xmlns="http://schemas.openxmlformats.org/officeDocument/2006/bibliography" SelectedStyle="\APA.XSL" StyleName="APA"/>
-</file>
-
-<file path=customXml/item2.xml><?xml version="1.0" encoding="utf-8"?>
 <ct:contentTypeSchema xmlns:ct="http://schemas.microsoft.com/office/2006/metadata/contentType" xmlns:ma="http://schemas.microsoft.com/office/2006/metadata/properties/metaAttributes" ct:_="" ma:_="" ma:contentTypeName="Document" ma:contentTypeID="0x01010020642C0861846E47970818B563C5E1EE" ma:contentTypeVersion="10" ma:contentTypeDescription="Create a new document." ma:contentTypeScope="" ma:versionID="7c7fb4b96b6f5cf75833768625bcce54">
   <xsd:schema xmlns:xsd="http://www.w3.org/2001/XMLSchema" xmlns:xs="http://www.w3.org/2001/XMLSchema" xmlns:p="http://schemas.microsoft.com/office/2006/metadata/properties" xmlns:ns2="1a689db4-6e06-476e-9be9-3b9f8e8c6fb8" targetNamespace="http://schemas.microsoft.com/office/2006/metadata/properties" ma:root="true" ma:fieldsID="06c1012f595b181f4681a78ffaba9bf8" ns2:_="">
     <xsd:import namespace="1a689db4-6e06-476e-9be9-3b9f8e8c6fb8"/>
@@ -20430,16 +21506,11 @@
 </ct:contentTypeSchema>
 </file>
 
-<file path=customXml/item3.xml><?xml version="1.0" encoding="utf-8"?>
-<?mso-contentType ?>
-<FormTemplates xmlns="http://schemas.microsoft.com/sharepoint/v3/contenttype/forms">
-  <Display>DocumentLibraryForm</Display>
-  <Edit>DocumentLibraryForm</Edit>
-  <New>DocumentLibraryForm</New>
-</FormTemplates>
+<file path=customXml/item2.xml><?xml version="1.0" encoding="utf-8"?>
+<b:Sources xmlns:b="http://schemas.openxmlformats.org/officeDocument/2006/bibliography" xmlns="http://schemas.openxmlformats.org/officeDocument/2006/bibliography" SelectedStyle="\APA.XSL" StyleName="APA"/>
 </file>
 
-<file path=customXml/item4.xml><?xml version="1.0" encoding="utf-8"?>
+<file path=customXml/item3.xml><?xml version="1.0" encoding="utf-8"?>
 <p:properties xmlns:p="http://schemas.microsoft.com/office/2006/metadata/properties" xmlns:xsi="http://www.w3.org/2001/XMLSchema-instance" xmlns:pc="http://schemas.microsoft.com/office/infopath/2007/PartnerControls">
   <documentManagement>
     <lcf76f155ced4ddcb4097134ff3c332f xmlns="1a689db4-6e06-476e-9be9-3b9f8e8c6fb8">
@@ -20449,15 +21520,16 @@
 </p:properties>
 </file>
 
-<file path=customXml/itemProps1.xml><?xml version="1.0" encoding="utf-8"?>
-<ds:datastoreItem xmlns:ds="http://schemas.openxmlformats.org/officeDocument/2006/customXml" ds:itemID="{AE3D3812-69AC-4D6A-A7F1-6E3602D960E0}">
-  <ds:schemaRefs>
-    <ds:schemaRef ds:uri="http://schemas.openxmlformats.org/officeDocument/2006/bibliography"/>
-  </ds:schemaRefs>
-</ds:datastoreItem>
+<file path=customXml/item4.xml><?xml version="1.0" encoding="utf-8"?>
+<?mso-contentType ?>
+<FormTemplates xmlns="http://schemas.microsoft.com/sharepoint/v3/contenttype/forms">
+  <Display>DocumentLibraryForm</Display>
+  <Edit>DocumentLibraryForm</Edit>
+  <New>DocumentLibraryForm</New>
+</FormTemplates>
 </file>
 
-<file path=customXml/itemProps2.xml><?xml version="1.0" encoding="utf-8"?>
+<file path=customXml/itemProps1.xml><?xml version="1.0" encoding="utf-8"?>
 <ds:datastoreItem xmlns:ds="http://schemas.openxmlformats.org/officeDocument/2006/customXml" ds:itemID="{A5A9003B-ECF1-4BEC-82C0-8E90D1065FD6}">
   <ds:schemaRefs>
     <ds:schemaRef ds:uri="http://schemas.microsoft.com/office/2006/metadata/contentType"/>
@@ -20475,15 +21547,15 @@
 </ds:datastoreItem>
 </file>
 
-<file path=customXml/itemProps3.xml><?xml version="1.0" encoding="utf-8"?>
-<ds:datastoreItem xmlns:ds="http://schemas.openxmlformats.org/officeDocument/2006/customXml" ds:itemID="{BAA3AF65-3B33-49AB-8B14-14BA3FFBE156}">
+<file path=customXml/itemProps2.xml><?xml version="1.0" encoding="utf-8"?>
+<ds:datastoreItem xmlns:ds="http://schemas.openxmlformats.org/officeDocument/2006/customXml" ds:itemID="{AE3D3812-69AC-4D6A-A7F1-6E3602D960E0}">
   <ds:schemaRefs>
-    <ds:schemaRef ds:uri="http://schemas.microsoft.com/sharepoint/v3/contenttype/forms"/>
+    <ds:schemaRef ds:uri="http://schemas.openxmlformats.org/officeDocument/2006/bibliography"/>
   </ds:schemaRefs>
 </ds:datastoreItem>
 </file>
 
-<file path=customXml/itemProps4.xml><?xml version="1.0" encoding="utf-8"?>
+<file path=customXml/itemProps3.xml><?xml version="1.0" encoding="utf-8"?>
 <ds:datastoreItem xmlns:ds="http://schemas.openxmlformats.org/officeDocument/2006/customXml" ds:itemID="{C7B3A6E1-C8A0-48E3-8293-913D2604C6B5}">
   <ds:schemaRefs>
     <ds:schemaRef ds:uri="http://schemas.microsoft.com/office/2006/metadata/properties"/>
@@ -20491,4 +21563,12 @@
     <ds:schemaRef ds:uri="1a689db4-6e06-476e-9be9-3b9f8e8c6fb8"/>
   </ds:schemaRefs>
 </ds:datastoreItem>
+</file>
+
+<file path=customXml/itemProps4.xml><?xml version="1.0" encoding="utf-8"?>
+<ds:datastoreItem xmlns:ds="http://schemas.openxmlformats.org/officeDocument/2006/customXml" ds:itemID="{BAA3AF65-3B33-49AB-8B14-14BA3FFBE156}">
+  <ds:schemaRefs>
+    <ds:schemaRef ds:uri="http://schemas.microsoft.com/sharepoint/v3/contenttype/forms"/>
+  </ds:schemaRefs>
+</ds:datastoreItem>
 </file>
</xml_diff>

<commit_message>
updating outcome prompts to remove details included in the outcomes table
</commit_message>
<xml_diff>
--- a/Templates/sapai_kcl_template_v0.2_clean.docx
+++ b/Templates/sapai_kcl_template_v0.2_clean.docx
@@ -12460,6 +12460,17 @@
           <w:lang w:val="en-GB"/>
         </w:rPr>
         <w:br/>
+      </w:r>
+      <w:r>
+        <w:rPr>
+          <w:lang w:val="en-GB"/>
+        </w:rPr>
+        <w:t>{{</w:t>
+      </w:r>
+      <w:r>
+        <w:rPr>
+          <w:lang w:val="en-GB"/>
+        </w:rPr>
         <w:t>table_outcomes</w:t>
       </w:r>
       <w:commentRangeEnd w:id="223"/>
@@ -12468,6 +12479,12 @@
           <w:rStyle w:val="CommentReference"/>
         </w:rPr>
         <w:commentReference w:id="223"/>
+      </w:r>
+      <w:r>
+        <w:rPr>
+          <w:lang w:val="en-GB"/>
+        </w:rPr>
+        <w:t>}}</w:t>
       </w:r>
     </w:p>
     <w:p>
@@ -13265,7 +13282,7 @@
       <w:rPr>
         <w:noProof/>
       </w:rPr>
-      <w:pict w14:anchorId="7467C0AB">
+      <w:pict w14:anchorId="14C9C7AA">
         <v:shapetype id="_x0000_t136" coordsize="21600,21600" o:spt="136" adj="10800" path="m@7,l@8,m@5,21600l@6,21600e">
           <v:formulas>
             <v:f eqn="sum #0 0 10800"/>
@@ -13314,7 +13331,7 @@
       <w:rPr>
         <w:noProof/>
       </w:rPr>
-      <w:pict w14:anchorId="02DAC7D7">
+      <w:pict w14:anchorId="21A81B59">
         <v:shapetype id="_x0000_t136" coordsize="21600,21600" o:spt="136" adj="10800" path="m@7,l@8,m@5,21600l@6,21600e">
           <v:formulas>
             <v:f eqn="sum #0 0 10800"/>
@@ -13443,7 +13460,7 @@
             </wp:anchor>
           </w:drawing>
         </mc:Choice>
-        <mc:Fallback xmlns="">
+        <mc:Fallback>
           <w:pict>
             <v:group w14:anchorId="3C34171C" id="Group 7" o:spid="_x0000_s1026" style="position:absolute;margin-left:361.5pt;margin-top:-23.3pt;width:126.3pt;height:42.05pt;z-index:251658240" coordsize="16040,5340" o:gfxdata="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">
               <v:shapetype id="_x0000_t75" coordsize="21600,21600" o:spt="75" o:preferrelative="t" path="m@4@5l@4@11@9@11@9@5xe" filled="f" stroked="f">
@@ -13537,7 +13554,7 @@
       <w:rPr>
         <w:noProof/>
       </w:rPr>
-      <w:pict w14:anchorId="49B7F287">
+      <w:pict w14:anchorId="5BA71537">
         <v:shapetype id="_x0000_t136" coordsize="21600,21600" o:spt="136" adj="10800" path="m@7,l@8,m@5,21600l@6,21600e">
           <v:formulas>
             <v:f eqn="sum #0 0 10800"/>
@@ -19170,12 +19187,7 @@
 </file>
 
 <file path=customXml/item1.xml><?xml version="1.0" encoding="utf-8"?>
-<?mso-contentType ?>
-<FormTemplates xmlns="http://schemas.microsoft.com/sharepoint/v3/contenttype/forms">
-  <Display>DocumentLibraryForm</Display>
-  <Edit>DocumentLibraryForm</Edit>
-  <New>DocumentLibraryForm</New>
-</FormTemplates>
+<b:Sources xmlns:b="http://schemas.openxmlformats.org/officeDocument/2006/bibliography" xmlns="http://schemas.openxmlformats.org/officeDocument/2006/bibliography" SelectedStyle="\APA.XSL" StyleName="APA"/>
 </file>
 
 <file path=customXml/item2.xml><?xml version="1.0" encoding="utf-8"?>
@@ -19357,7 +19369,12 @@
 </file>
 
 <file path=customXml/item3.xml><?xml version="1.0" encoding="utf-8"?>
-<b:Sources xmlns:b="http://schemas.openxmlformats.org/officeDocument/2006/bibliography" xmlns="http://schemas.openxmlformats.org/officeDocument/2006/bibliography" SelectedStyle="\APA.XSL" StyleName="APA"/>
+<?mso-contentType ?>
+<FormTemplates xmlns="http://schemas.microsoft.com/sharepoint/v3/contenttype/forms">
+  <Display>DocumentLibraryForm</Display>
+  <Edit>DocumentLibraryForm</Edit>
+  <New>DocumentLibraryForm</New>
+</FormTemplates>
 </file>
 
 <file path=customXml/item4.xml><?xml version="1.0" encoding="utf-8"?>
@@ -19371,9 +19388,9 @@
 </file>
 
 <file path=customXml/itemProps1.xml><?xml version="1.0" encoding="utf-8"?>
-<ds:datastoreItem xmlns:ds="http://schemas.openxmlformats.org/officeDocument/2006/customXml" ds:itemID="{BAA3AF65-3B33-49AB-8B14-14BA3FFBE156}">
+<ds:datastoreItem xmlns:ds="http://schemas.openxmlformats.org/officeDocument/2006/customXml" ds:itemID="{AE3D3812-69AC-4D6A-A7F1-6E3602D960E0}">
   <ds:schemaRefs>
-    <ds:schemaRef ds:uri="http://schemas.microsoft.com/sharepoint/v3/contenttype/forms"/>
+    <ds:schemaRef ds:uri="http://schemas.openxmlformats.org/officeDocument/2006/bibliography"/>
   </ds:schemaRefs>
 </ds:datastoreItem>
 </file>
@@ -19397,9 +19414,9 @@
 </file>
 
 <file path=customXml/itemProps3.xml><?xml version="1.0" encoding="utf-8"?>
-<ds:datastoreItem xmlns:ds="http://schemas.openxmlformats.org/officeDocument/2006/customXml" ds:itemID="{AE3D3812-69AC-4D6A-A7F1-6E3602D960E0}">
+<ds:datastoreItem xmlns:ds="http://schemas.openxmlformats.org/officeDocument/2006/customXml" ds:itemID="{BAA3AF65-3B33-49AB-8B14-14BA3FFBE156}">
   <ds:schemaRefs>
-    <ds:schemaRef ds:uri="http://schemas.openxmlformats.org/officeDocument/2006/bibliography"/>
+    <ds:schemaRef ds:uri="http://schemas.microsoft.com/sharepoint/v3/contenttype/forms"/>
   </ds:schemaRefs>
 </ds:datastoreItem>
 </file>

</xml_diff>

<commit_message>
adding versioning to the SAPAI output
</commit_message>
<xml_diff>
--- a/Templates/sapai_kcl_template_v0.2_clean.docx
+++ b/Templates/sapai_kcl_template_v0.2_clean.docx
@@ -811,6 +811,14 @@
                 <w:szCs w:val="22"/>
               </w:rPr>
             </w:pPr>
+            <w:r>
+              <w:rPr>
+                <w:rFonts w:asciiTheme="minorHAnsi" w:hAnsiTheme="minorHAnsi" w:cstheme="minorHAnsi"/>
+                <w:sz w:val="22"/>
+                <w:szCs w:val="22"/>
+              </w:rPr>
+              <w:t>v0.1</w:t>
+            </w:r>
           </w:p>
         </w:tc>
         <w:tc>
@@ -826,6 +834,14 @@
                 <w:szCs w:val="22"/>
               </w:rPr>
             </w:pPr>
+            <w:r>
+              <w:rPr>
+                <w:rFonts w:asciiTheme="minorHAnsi" w:hAnsiTheme="minorHAnsi" w:cstheme="minorHAnsi"/>
+                <w:sz w:val="22"/>
+                <w:szCs w:val="22"/>
+              </w:rPr>
+              <w:t>{{todays_date}}</w:t>
+            </w:r>
           </w:p>
         </w:tc>
         <w:tc>
@@ -841,6 +857,14 @@
                 <w:szCs w:val="22"/>
               </w:rPr>
             </w:pPr>
+            <w:r>
+              <w:rPr>
+                <w:rFonts w:asciiTheme="minorHAnsi" w:hAnsiTheme="minorHAnsi" w:cstheme="minorHAnsi"/>
+                <w:sz w:val="22"/>
+                <w:szCs w:val="22"/>
+              </w:rPr>
+              <w:t>{{protocol_version_date}}</w:t>
+            </w:r>
           </w:p>
         </w:tc>
         <w:tc>
@@ -856,6 +880,14 @@
                 <w:szCs w:val="22"/>
               </w:rPr>
             </w:pPr>
+            <w:r>
+              <w:rPr>
+                <w:rFonts w:asciiTheme="minorHAnsi" w:hAnsiTheme="minorHAnsi" w:cstheme="minorHAnsi"/>
+                <w:sz w:val="22"/>
+                <w:szCs w:val="22"/>
+              </w:rPr>
+              <w:t>First draft</w:t>
+            </w:r>
           </w:p>
         </w:tc>
         <w:tc>
@@ -871,6 +903,30 @@
                 <w:szCs w:val="22"/>
               </w:rPr>
             </w:pPr>
+            <w:r>
+              <w:rPr>
+                <w:rFonts w:asciiTheme="minorHAnsi" w:hAnsiTheme="minorHAnsi" w:cstheme="minorHAnsi"/>
+                <w:sz w:val="22"/>
+                <w:szCs w:val="22"/>
+              </w:rPr>
+              <w:t>Draft produced by SAPAI using {{</w:t>
+            </w:r>
+            <w:r>
+              <w:rPr>
+                <w:rFonts w:asciiTheme="minorHAnsi" w:hAnsiTheme="minorHAnsi" w:cstheme="minorHAnsi"/>
+                <w:sz w:val="22"/>
+                <w:szCs w:val="22"/>
+              </w:rPr>
+              <w:t>template_prompt_version</w:t>
+            </w:r>
+            <w:r>
+              <w:rPr>
+                <w:rFonts w:asciiTheme="minorHAnsi" w:hAnsiTheme="minorHAnsi" w:cstheme="minorHAnsi"/>
+                <w:sz w:val="22"/>
+                <w:szCs w:val="22"/>
+              </w:rPr>
+              <w:t>}}</w:t>
+            </w:r>
           </w:p>
         </w:tc>
       </w:tr>
@@ -8962,16 +9018,7 @@
     </w:p>
     <w:p>
       <w:r>
-        <w:t xml:space="preserve">Continuous outcomes will be summarised using means and standard deviations (or medians and interquartile ranges if skewed). </w:t>
-      </w:r>
-      <w:r>
-        <w:t>Binary or c</w:t>
-      </w:r>
-      <w:r>
-        <w:t>ategorical outcomes will be summarised using frequencies and proportions.</w:t>
-      </w:r>
-      <w:r>
-        <w:t xml:space="preserve"> </w:t>
+        <w:t xml:space="preserve">Continuous outcomes will be summarised using means and standard deviations (or medians and interquartile ranges if skewed). Binary or categorical outcomes will be summarised using frequencies and proportions. </w:t>
       </w:r>
       <w:r>
         <w:rPr>
@@ -8999,13 +9046,7 @@
         <w:t xml:space="preserve"> and</w:t>
       </w:r>
       <w:r>
-        <w:t xml:space="preserve"> Kaplan-Meier</w:t>
-      </w:r>
-      <w:r>
-        <w:t xml:space="preserve"> </w:t>
-      </w:r>
-      <w:r>
-        <w:t>survival plots will be produced</w:t>
+        <w:t xml:space="preserve"> Kaplan-Meier survival plots will be produced</w:t>
       </w:r>
       <w:r>
         <w:t>.</w:t>
@@ -13377,7 +13418,7 @@
       <w:rPr>
         <w:noProof/>
       </w:rPr>
-      <w:pict w14:anchorId="162046AE">
+      <w:pict w14:anchorId="72CF266A">
         <v:shapetype id="_x0000_t136" coordsize="21600,21600" o:spt="136" adj="10800" path="m@7,l@8,m@5,21600l@6,21600e">
           <v:formulas>
             <v:f eqn="sum #0 0 10800"/>
@@ -13426,7 +13467,7 @@
       <w:rPr>
         <w:noProof/>
       </w:rPr>
-      <w:pict w14:anchorId="1A1A6C3C">
+      <w:pict w14:anchorId="041517E8">
         <v:shapetype id="_x0000_t136" coordsize="21600,21600" o:spt="136" adj="10800" path="m@7,l@8,m@5,21600l@6,21600e">
           <v:formulas>
             <v:f eqn="sum #0 0 10800"/>
@@ -13649,7 +13690,7 @@
       <w:rPr>
         <w:noProof/>
       </w:rPr>
-      <w:pict w14:anchorId="6057D8AA">
+      <w:pict w14:anchorId="1F57DF3A">
         <v:shapetype id="_x0000_t136" coordsize="21600,21600" o:spt="136" adj="10800" path="m@7,l@8,m@5,21600l@6,21600e">
           <v:formulas>
             <v:f eqn="sum #0 0 10800"/>
@@ -19282,6 +19323,10 @@
 </file>
 
 <file path=customXml/item1.xml><?xml version="1.0" encoding="utf-8"?>
+<b:Sources xmlns:b="http://schemas.openxmlformats.org/officeDocument/2006/bibliography" xmlns="http://schemas.openxmlformats.org/officeDocument/2006/bibliography" SelectedStyle="\APA.XSL" StyleName="APA"/>
+</file>
+
+<file path=customXml/item2.xml><?xml version="1.0" encoding="utf-8"?>
 <ct:contentTypeSchema xmlns:ct="http://schemas.microsoft.com/office/2006/metadata/contentType" xmlns:ma="http://schemas.microsoft.com/office/2006/metadata/properties/metaAttributes" ct:_="" ma:_="" ma:contentTypeName="Document" ma:contentTypeID="0x01010020642C0861846E47970818B563C5E1EE" ma:contentTypeVersion="10" ma:contentTypeDescription="Create a new document." ma:contentTypeScope="" ma:versionID="7c7fb4b96b6f5cf75833768625bcce54">
   <xsd:schema xmlns:xsd="http://www.w3.org/2001/XMLSchema" xmlns:xs="http://www.w3.org/2001/XMLSchema" xmlns:p="http://schemas.microsoft.com/office/2006/metadata/properties" xmlns:ns2="1a689db4-6e06-476e-9be9-3b9f8e8c6fb8" targetNamespace="http://schemas.microsoft.com/office/2006/metadata/properties" ma:root="true" ma:fieldsID="06c1012f595b181f4681a78ffaba9bf8" ns2:_="">
     <xsd:import namespace="1a689db4-6e06-476e-9be9-3b9f8e8c6fb8"/>
@@ -19459,11 +19504,16 @@
 </ct:contentTypeSchema>
 </file>
 
-<file path=customXml/item2.xml><?xml version="1.0" encoding="utf-8"?>
-<b:Sources xmlns:b="http://schemas.openxmlformats.org/officeDocument/2006/bibliography" xmlns="http://schemas.openxmlformats.org/officeDocument/2006/bibliography" SelectedStyle="\APA.XSL" StyleName="APA"/>
+<file path=customXml/item3.xml><?xml version="1.0" encoding="utf-8"?>
+<?mso-contentType ?>
+<FormTemplates xmlns="http://schemas.microsoft.com/sharepoint/v3/contenttype/forms">
+  <Display>DocumentLibraryForm</Display>
+  <Edit>DocumentLibraryForm</Edit>
+  <New>DocumentLibraryForm</New>
+</FormTemplates>
 </file>
 
-<file path=customXml/item3.xml><?xml version="1.0" encoding="utf-8"?>
+<file path=customXml/item4.xml><?xml version="1.0" encoding="utf-8"?>
 <p:properties xmlns:p="http://schemas.microsoft.com/office/2006/metadata/properties" xmlns:xsi="http://www.w3.org/2001/XMLSchema-instance" xmlns:pc="http://schemas.microsoft.com/office/infopath/2007/PartnerControls">
   <documentManagement>
     <lcf76f155ced4ddcb4097134ff3c332f xmlns="1a689db4-6e06-476e-9be9-3b9f8e8c6fb8">
@@ -19473,16 +19523,15 @@
 </p:properties>
 </file>
 
-<file path=customXml/item4.xml><?xml version="1.0" encoding="utf-8"?>
-<?mso-contentType ?>
-<FormTemplates xmlns="http://schemas.microsoft.com/sharepoint/v3/contenttype/forms">
-  <Display>DocumentLibraryForm</Display>
-  <Edit>DocumentLibraryForm</Edit>
-  <New>DocumentLibraryForm</New>
-</FormTemplates>
+<file path=customXml/itemProps1.xml><?xml version="1.0" encoding="utf-8"?>
+<ds:datastoreItem xmlns:ds="http://schemas.openxmlformats.org/officeDocument/2006/customXml" ds:itemID="{AE3D3812-69AC-4D6A-A7F1-6E3602D960E0}">
+  <ds:schemaRefs>
+    <ds:schemaRef ds:uri="http://schemas.openxmlformats.org/officeDocument/2006/bibliography"/>
+  </ds:schemaRefs>
+</ds:datastoreItem>
 </file>
 
-<file path=customXml/itemProps1.xml><?xml version="1.0" encoding="utf-8"?>
+<file path=customXml/itemProps2.xml><?xml version="1.0" encoding="utf-8"?>
 <ds:datastoreItem xmlns:ds="http://schemas.openxmlformats.org/officeDocument/2006/customXml" ds:itemID="{A5A9003B-ECF1-4BEC-82C0-8E90D1065FD6}">
   <ds:schemaRefs>
     <ds:schemaRef ds:uri="http://schemas.microsoft.com/office/2006/metadata/contentType"/>
@@ -19500,15 +19549,15 @@
 </ds:datastoreItem>
 </file>
 
-<file path=customXml/itemProps2.xml><?xml version="1.0" encoding="utf-8"?>
-<ds:datastoreItem xmlns:ds="http://schemas.openxmlformats.org/officeDocument/2006/customXml" ds:itemID="{AE3D3812-69AC-4D6A-A7F1-6E3602D960E0}">
+<file path=customXml/itemProps3.xml><?xml version="1.0" encoding="utf-8"?>
+<ds:datastoreItem xmlns:ds="http://schemas.openxmlformats.org/officeDocument/2006/customXml" ds:itemID="{BAA3AF65-3B33-49AB-8B14-14BA3FFBE156}">
   <ds:schemaRefs>
-    <ds:schemaRef ds:uri="http://schemas.openxmlformats.org/officeDocument/2006/bibliography"/>
+    <ds:schemaRef ds:uri="http://schemas.microsoft.com/sharepoint/v3/contenttype/forms"/>
   </ds:schemaRefs>
 </ds:datastoreItem>
 </file>
 
-<file path=customXml/itemProps3.xml><?xml version="1.0" encoding="utf-8"?>
+<file path=customXml/itemProps4.xml><?xml version="1.0" encoding="utf-8"?>
 <ds:datastoreItem xmlns:ds="http://schemas.openxmlformats.org/officeDocument/2006/customXml" ds:itemID="{C7B3A6E1-C8A0-48E3-8293-913D2604C6B5}">
   <ds:schemaRefs>
     <ds:schemaRef ds:uri="http://schemas.microsoft.com/office/2006/metadata/properties"/>
@@ -19516,12 +19565,4 @@
     <ds:schemaRef ds:uri="1a689db4-6e06-476e-9be9-3b9f8e8c6fb8"/>
   </ds:schemaRefs>
 </ds:datastoreItem>
-</file>
-
-<file path=customXml/itemProps4.xml><?xml version="1.0" encoding="utf-8"?>
-<ds:datastoreItem xmlns:ds="http://schemas.openxmlformats.org/officeDocument/2006/customXml" ds:itemID="{BAA3AF65-3B33-49AB-8B14-14BA3FFBE156}">
-  <ds:schemaRefs>
-    <ds:schemaRef ds:uri="http://schemas.microsoft.com/sharepoint/v3/contenttype/forms"/>
-  </ds:schemaRefs>
-</ds:datastoreItem>
 </file>
</xml_diff>